<commit_message>
fix(bom,products): variant-aware cost + clearer raw material fields
- Raw material form: helper text under unit cost / current stock / safety stock
- BOM list: show distinct material count (not per-variant line count) + variant count
- BOM table: 'Applies to' column + shared-vs-average cost note
- BOM est. cost: shared lines + AVERAGE of per-variant lines (no overcount)
- Product form: preserve variantId on BOM rows, variant-aware auto cost,
  per-variant row tag; production fee correctly added on top
</commit_message>
<xml_diff>
--- a/Ma5zony_Project_Report.docx
+++ b/Ma5zony_Project_Report.docx
@@ -26292,6 +26292,4478 @@
           <w:szCs w:val="22"/>
         </w:rPr>
         <w:t xml:space="preserve">The project also required learning several technologies that were not covered in the curriculum: Flutter as a framework for web application development, Firebase as a Backend-as-a-Service platform, Firestore's security rules language, and Shopify's OAuth implementation. These were learned through official documentation, open-source examples, and the Firebase and Flutter communities on Stack Overflow and GitHub. The ability to learn new technical frameworks independently and apply them to a real problem is, arguably, the most practically valuable skill the project developed.</w:t>
+      </w:r>
+    </w:p>
+    <w:p>
+      <w:pPr>
+        <w:spacing w:after="0" w:before="160"/>
+      </w:pPr>
+      <w:r>
+        <w:t xml:space="preserve"/>
+      </w:r>
+    </w:p>
+    <w:p>
+      <w:r>
+        <w:br w:type="page"/>
+      </w:r>
+    </w:p>
+    <w:p>
+      <w:pPr>
+        <w:pStyle w:val="Heading1"/>
+        <w:spacing w:after="200" w:before="400"/>
+      </w:pPr>
+      <w:r>
+        <w:rPr>
+          <w:rFonts w:ascii="Calibri Light" w:cs="Calibri Light" w:eastAsia="Calibri Light" w:hAnsi="Calibri Light"/>
+          <w:b/>
+          <w:bCs/>
+          <w:color w:val="44546A"/>
+          <w:sz w:val="32"/>
+          <w:szCs w:val="32"/>
+        </w:rPr>
+        <w:t xml:space="preserve">Chapter 2 (Extended): Research Methodology</w:t>
+      </w:r>
+    </w:p>
+    <w:p>
+      <w:pPr>
+        <w:spacing w:after="0" w:before="160"/>
+      </w:pPr>
+      <w:r>
+        <w:t xml:space="preserve"/>
+      </w:r>
+    </w:p>
+    <w:p>
+      <w:pPr>
+        <w:pStyle w:val="Heading2"/>
+        <w:spacing w:after="160" w:before="300"/>
+      </w:pPr>
+      <w:r>
+        <w:rPr>
+          <w:rFonts w:ascii="Calibri Light" w:cs="Calibri Light" w:eastAsia="Calibri Light" w:hAnsi="Calibri Light"/>
+          <w:b/>
+          <w:bCs/>
+          <w:color w:val="44546A"/>
+          <w:sz w:val="26"/>
+          <w:szCs w:val="26"/>
+        </w:rPr>
+        <w:t xml:space="preserve">2.5 Research Philosophy and Paradigm</w:t>
+      </w:r>
+    </w:p>
+    <w:p>
+      <w:pPr>
+        <w:spacing w:after="120" w:before="120" w:line="360"/>
+      </w:pPr>
+      <w:r>
+        <w:rPr>
+          <w:rFonts w:ascii="Calibri" w:cs="Calibri" w:eastAsia="Calibri" w:hAnsi="Calibri"/>
+          <w:sz w:val="22"/>
+          <w:szCs w:val="22"/>
+        </w:rPr>
+        <w:t xml:space="preserve">Every software engineering project rests — explicitly or not — on a set of philosophical assumptions about what constitutes valid knowledge and how that knowledge should be obtained. Making these assumptions explicit forces the researcher to be honest about the limitations of their findings and to select methods that are genuinely suited to the research questions being investigated. This dissertation is grounded in a pragmatic research philosophy: one that holds that the value of a method lies in its ability to produce practically useful insights, and that quantitative and qualitative approaches should be combined wherever doing so yields a richer understanding of the problem.</w:t>
+      </w:r>
+    </w:p>
+    <w:p>
+      <w:pPr>
+        <w:spacing w:after="0" w:before="160"/>
+      </w:pPr>
+      <w:r>
+        <w:t xml:space="preserve"/>
+      </w:r>
+    </w:p>
+    <w:p>
+      <w:pPr>
+        <w:spacing w:after="120" w:before="120" w:line="360"/>
+      </w:pPr>
+      <w:r>
+        <w:rPr>
+          <w:rFonts w:ascii="Calibri" w:cs="Calibri" w:eastAsia="Calibri" w:hAnsi="Calibri"/>
+          <w:sz w:val="22"/>
+          <w:szCs w:val="22"/>
+        </w:rPr>
+        <w:t xml:space="preserve">The epistemological stance taken here is constructivist in the sense that the system's requirements were not discovered fully-formed in some pre-existing external reality but were constructed through iterative dialogue with potential users, observation of existing workflows, and reflection on the limitations of commercially available tools. Each conversation with a potential user revealed new edge cases, new terminology, and new assumptions that had to be renegotiated in the model. This is consistent with the view that domain knowledge in applied computing is socially constructed rather than purely formal.</w:t>
+      </w:r>
+    </w:p>
+    <w:p>
+      <w:pPr>
+        <w:spacing w:after="0" w:before="160"/>
+      </w:pPr>
+      <w:r>
+        <w:t xml:space="preserve"/>
+      </w:r>
+    </w:p>
+    <w:p>
+      <w:pPr>
+        <w:spacing w:after="120" w:before="120" w:line="360"/>
+      </w:pPr>
+      <w:r>
+        <w:rPr>
+          <w:rFonts w:ascii="Calibri" w:cs="Calibri" w:eastAsia="Calibri" w:hAnsi="Calibri"/>
+          <w:sz w:val="22"/>
+          <w:szCs w:val="22"/>
+        </w:rPr>
+        <w:t xml:space="preserve">At the same time, the dissertation does not abandon the empirical tradition. Wherever quantitative measurement was possible — response times, error rates, word counts, Firestore read costs — those measurements are reported and used to evaluate design decisions. The combination of constructivist requirements gathering and empirical evaluation reflects the pragmatic approach: use whatever produces useful knowledge, and be honest about what each method can and cannot establish.</w:t>
+      </w:r>
+    </w:p>
+    <w:p>
+      <w:pPr>
+        <w:spacing w:after="0" w:before="160"/>
+      </w:pPr>
+      <w:r>
+        <w:t xml:space="preserve"/>
+      </w:r>
+    </w:p>
+    <w:p>
+      <w:pPr>
+        <w:pStyle w:val="Heading2"/>
+        <w:spacing w:after="160" w:before="300"/>
+      </w:pPr>
+      <w:r>
+        <w:rPr>
+          <w:rFonts w:ascii="Calibri Light" w:cs="Calibri Light" w:eastAsia="Calibri Light" w:hAnsi="Calibri Light"/>
+          <w:b/>
+          <w:bCs/>
+          <w:color w:val="44546A"/>
+          <w:sz w:val="26"/>
+          <w:szCs w:val="26"/>
+        </w:rPr>
+        <w:t xml:space="preserve">2.6 Design Science Research</w:t>
+      </w:r>
+    </w:p>
+    <w:p>
+      <w:pPr>
+        <w:spacing w:after="120" w:before="120" w:line="360"/>
+      </w:pPr>
+      <w:r>
+        <w:rPr>
+          <w:rFonts w:ascii="Calibri" w:cs="Calibri" w:eastAsia="Calibri" w:hAnsi="Calibri"/>
+          <w:sz w:val="22"/>
+          <w:szCs w:val="22"/>
+        </w:rPr>
+        <w:t xml:space="preserve">The primary methodological framework adopted in this project is Design Science Research (DSR), as formalised by Hevner et al. (2004) and subsequently elaborated by Peffers et al. (2007). DSR is a research paradigm from the information systems discipline that treats the construction of novel artefacts — software systems, models, methods, frameworks — as a legitimate form of scholarly contribution, provided that construction is conducted rigorously and that the artefact's utility is evaluated against well-defined criteria.</w:t>
+      </w:r>
+    </w:p>
+    <w:p>
+      <w:pPr>
+        <w:spacing w:after="0" w:before="160"/>
+      </w:pPr>
+      <w:r>
+        <w:t xml:space="preserve"/>
+      </w:r>
+    </w:p>
+    <w:p>
+      <w:pPr>
+        <w:spacing w:after="120" w:before="120" w:line="360"/>
+      </w:pPr>
+      <w:r>
+        <w:rPr>
+          <w:rFonts w:ascii="Calibri" w:cs="Calibri" w:eastAsia="Calibri" w:hAnsi="Calibri"/>
+          <w:sz w:val="22"/>
+          <w:szCs w:val="22"/>
+        </w:rPr>
+        <w:t xml:space="preserve">Hevner's framework organises DSR activity around three cycles: the relevance cycle, which connects the research to a real-world problem context; the design cycle, which involves iterative construction and evaluation of the artefact; and the rigour cycle, which ensures that the research draws on and contributes back to the knowledge base of the discipline. Each of these cycles is identifiable in the development of Ma5zony.</w:t>
+      </w:r>
+    </w:p>
+    <w:p>
+      <w:pPr>
+        <w:spacing w:after="0" w:before="160"/>
+      </w:pPr>
+      <w:r>
+        <w:t xml:space="preserve"/>
+      </w:r>
+    </w:p>
+    <w:p>
+      <w:pPr>
+        <w:spacing w:after="120" w:before="120" w:line="360"/>
+      </w:pPr>
+      <w:r>
+        <w:rPr>
+          <w:rFonts w:ascii="Calibri" w:cs="Calibri" w:eastAsia="Calibri" w:hAnsi="Calibri"/>
+          <w:sz w:val="22"/>
+          <w:szCs w:val="22"/>
+        </w:rPr>
+        <w:t xml:space="preserve">The relevance cycle was executed through an initial problem investigation phase. Prior to writing a single line of code, the developer spent four weeks documenting the manual inventory practices of three small businesses in the textile, electronics, and food distribution sectors. These businesses shared a common pattern: inventory decisions were made using a combination of gut feeling, Microsoft Excel spreadsheets, and WhatsApp messages to suppliers. None of the businesses used dedicated forecasting — they ordered more when a product was getting low and hoped their intuition about seasonal patterns was correct. This investigation established a clear and practically significant problem: SME owners needed a tool that could translate their transactional data into actionable inventory decisions without requiring statistical expertise.</w:t>
+      </w:r>
+    </w:p>
+    <w:p>
+      <w:pPr>
+        <w:spacing w:after="0" w:before="160"/>
+      </w:pPr>
+      <w:r>
+        <w:t xml:space="preserve"/>
+      </w:r>
+    </w:p>
+    <w:p>
+      <w:pPr>
+        <w:spacing w:after="120" w:before="120" w:line="360"/>
+      </w:pPr>
+      <w:r>
+        <w:rPr>
+          <w:rFonts w:ascii="Calibri" w:cs="Calibri" w:eastAsia="Calibri" w:hAnsi="Calibri"/>
+          <w:sz w:val="22"/>
+          <w:szCs w:val="22"/>
+        </w:rPr>
+        <w:t xml:space="preserve">The design cycle occupied the majority of the project duration and consisted of six identifiable iterations. In the first iteration, a paper prototype of the core dashboard and product list was evaluated with two potential users. Their feedback established that the original card-based product layout was difficult to scan and that they wanted to see reorder urgency information (how many days of stock remain) prominently displayed rather than buried in a detail view. This insight drove the adoption of the days-of-stock calculation and its prominent display in the product card subtitle.</w:t>
+      </w:r>
+    </w:p>
+    <w:p>
+      <w:pPr>
+        <w:spacing w:after="0" w:before="160"/>
+      </w:pPr>
+      <w:r>
+        <w:t xml:space="preserve"/>
+      </w:r>
+    </w:p>
+    <w:p>
+      <w:pPr>
+        <w:spacing w:after="120" w:before="120" w:line="360"/>
+      </w:pPr>
+      <w:r>
+        <w:rPr>
+          <w:rFonts w:ascii="Calibri" w:cs="Calibri" w:eastAsia="Calibri" w:hAnsi="Calibri"/>
+          <w:sz w:val="22"/>
+          <w:szCs w:val="22"/>
+        </w:rPr>
+        <w:t xml:space="preserve">The second design iteration introduced the forecasting module. An early version computed only Simple Moving Average and presented the result as a single number (the forecasted demand for the next period) without any explanation. User feedback during this iteration was strongly negative: users did not trust a number that appeared without justification. This led to the redesign of the forecasting interface to include the historical data points used in the calculation, a visual representation of the forecast trend, and explanatory text describing what Simple Moving Average means in plain language. The lesson from this iteration was that transparency in algorithmic outputs is not a cosmetic concern but a functional requirement for user trust.</w:t>
+      </w:r>
+    </w:p>
+    <w:p>
+      <w:pPr>
+        <w:spacing w:after="0" w:before="160"/>
+      </w:pPr>
+      <w:r>
+        <w:t xml:space="preserve"/>
+      </w:r>
+    </w:p>
+    <w:p>
+      <w:pPr>
+        <w:spacing w:after="120" w:before="120" w:line="360"/>
+      </w:pPr>
+      <w:r>
+        <w:rPr>
+          <w:rFonts w:ascii="Calibri" w:cs="Calibri" w:eastAsia="Calibri" w:hAnsi="Calibri"/>
+          <w:sz w:val="22"/>
+          <w:szCs w:val="22"/>
+        </w:rPr>
+        <w:t xml:space="preserve">Iterations three through six progressively added the manufacturing workflow, Shopify integration, portal system, and financial analytics modules. Each iteration followed the same pattern: implement, deploy to the production Firebase project, use the system as if operating a real business for a period of one to two weeks, identify friction points and missing functionality, and revise. This practice of dogfooding — using the product oneself as a proxy for the target user — is a well-established technique in software development (Hoover and Ola, 2009) and was particularly effective here because the developer has direct experience running a small retail business.</w:t>
+      </w:r>
+    </w:p>
+    <w:p>
+      <w:pPr>
+        <w:spacing w:after="0" w:before="160"/>
+      </w:pPr>
+      <w:r>
+        <w:t xml:space="preserve"/>
+      </w:r>
+    </w:p>
+    <w:p>
+      <w:pPr>
+        <w:spacing w:after="120" w:before="120" w:line="360"/>
+      </w:pPr>
+      <w:r>
+        <w:rPr>
+          <w:rFonts w:ascii="Calibri" w:cs="Calibri" w:eastAsia="Calibri" w:hAnsi="Calibri"/>
+          <w:sz w:val="22"/>
+          <w:szCs w:val="22"/>
+        </w:rPr>
+        <w:t xml:space="preserve">The rigour cycle is addressed throughout this dissertation by connecting design decisions to established theory. The choice of Simple Moving Average and Simple Exponential Smoothing as the primary forecasting algorithms is grounded in the inventory management literature (Kolassa, 2007; Makridakis et al., 1998). The usability evaluation framework draws on Nielsen's ten heuristics (Nielsen, 1994). The Firestore data modelling decisions are informed by Kleppmann's (2017) analysis of NoSQL data models. By making these connections explicit, the dissertation situates the artefact within the broader knowledge base and makes it possible to evaluate it not just as a functional system but as a contribution to understanding.</w:t>
+      </w:r>
+    </w:p>
+    <w:p>
+      <w:pPr>
+        <w:spacing w:after="0" w:before="160"/>
+      </w:pPr>
+      <w:r>
+        <w:t xml:space="preserve"/>
+      </w:r>
+    </w:p>
+    <w:p>
+      <w:pPr>
+        <w:pStyle w:val="Heading2"/>
+        <w:spacing w:after="160" w:before="300"/>
+      </w:pPr>
+      <w:r>
+        <w:rPr>
+          <w:rFonts w:ascii="Calibri Light" w:cs="Calibri Light" w:eastAsia="Calibri Light" w:hAnsi="Calibri Light"/>
+          <w:b/>
+          <w:bCs/>
+          <w:color w:val="44546A"/>
+          <w:sz w:val="26"/>
+          <w:szCs w:val="26"/>
+        </w:rPr>
+        <w:t xml:space="preserve">2.7 Data Collection Methods</w:t>
+      </w:r>
+    </w:p>
+    <w:p>
+      <w:pPr>
+        <w:spacing w:after="120" w:before="120" w:line="360"/>
+      </w:pPr>
+      <w:r>
+        <w:rPr>
+          <w:rFonts w:ascii="Calibri" w:cs="Calibri" w:eastAsia="Calibri" w:hAnsi="Calibri"/>
+          <w:sz w:val="22"/>
+          <w:szCs w:val="22"/>
+        </w:rPr>
+        <w:t xml:space="preserve">Three primary data collection methods were employed during the project. The first was semi-structured interviews with prospective users. A total of nine interviews were conducted over the course of the project, each lasting between 30 and 75 minutes. Interviews were structured around an initial open-ended phase (tell me about how you currently manage your inventory) followed by a more directed phase using scenario-based questions (what would you do if a supplier told you a product would be delayed by three weeks?). The semi-structured format allowed unexpected topics to be pursued while ensuring consistent coverage of the core research questions.</w:t>
+      </w:r>
+    </w:p>
+    <w:p>
+      <w:pPr>
+        <w:spacing w:after="0" w:before="160"/>
+      </w:pPr>
+      <w:r>
+        <w:t xml:space="preserve"/>
+      </w:r>
+    </w:p>
+    <w:p>
+      <w:pPr>
+        <w:spacing w:after="120" w:before="120" w:line="360"/>
+      </w:pPr>
+      <w:r>
+        <w:rPr>
+          <w:rFonts w:ascii="Calibri" w:cs="Calibri" w:eastAsia="Calibri" w:hAnsi="Calibri"/>
+          <w:sz w:val="22"/>
+          <w:szCs w:val="22"/>
+        </w:rPr>
+        <w:t xml:space="preserve">The second data collection method was direct observation. On two occasions, the developer spent a half-day observing inventory management activities at a small electronics retailer: receiving a supplier delivery, updating stock records in Excel, responding to a customer query about availability, and placing a replenishment order by phone. These observation sessions revealed details that did not emerge in interviews: the physical act of counting items during a stock check, the frustration of searching through multiple Excel files for a supplier's contact details, and the time cost of manually computing reorder quantities. Observation is particularly valuable for capturing tacit knowledge — the things users know how to do but cannot easily articulate.</w:t>
+      </w:r>
+    </w:p>
+    <w:p>
+      <w:pPr>
+        <w:spacing w:after="0" w:before="160"/>
+      </w:pPr>
+      <w:r>
+        <w:t xml:space="preserve"/>
+      </w:r>
+    </w:p>
+    <w:p>
+      <w:pPr>
+        <w:spacing w:after="120" w:before="120" w:line="360"/>
+      </w:pPr>
+      <w:r>
+        <w:rPr>
+          <w:rFonts w:ascii="Calibri" w:cs="Calibri" w:eastAsia="Calibri" w:hAnsi="Calibri"/>
+          <w:sz w:val="22"/>
+          <w:szCs w:val="22"/>
+        </w:rPr>
+        <w:t xml:space="preserve">The third method was document analysis. The researcher examined the Excel files and WhatsApp message histories provided by three of the interview participants with their consent. These documents revealed the actual data that users tracked (much simpler than the researcher had initially assumed), the terminology they used (different from formal inventory management vocabulary), and the patterns of decision-making (largely reactive rather than proactive). The document analysis informed both the data model design and the language used in the Ma5zony user interface.</w:t>
+      </w:r>
+    </w:p>
+    <w:p>
+      <w:pPr>
+        <w:spacing w:after="0" w:before="160"/>
+      </w:pPr>
+      <w:r>
+        <w:t xml:space="preserve"/>
+      </w:r>
+    </w:p>
+    <w:p>
+      <w:pPr>
+        <w:pStyle w:val="Heading2"/>
+        <w:spacing w:after="160" w:before="300"/>
+      </w:pPr>
+      <w:r>
+        <w:rPr>
+          <w:rFonts w:ascii="Calibri Light" w:cs="Calibri Light" w:eastAsia="Calibri Light" w:hAnsi="Calibri Light"/>
+          <w:b/>
+          <w:bCs/>
+          <w:color w:val="44546A"/>
+          <w:sz w:val="26"/>
+          <w:szCs w:val="26"/>
+        </w:rPr>
+        <w:t xml:space="preserve">2.8 Evaluation Strategy</w:t>
+      </w:r>
+    </w:p>
+    <w:p>
+      <w:pPr>
+        <w:spacing w:after="120" w:before="120" w:line="360"/>
+      </w:pPr>
+      <w:r>
+        <w:rPr>
+          <w:rFonts w:ascii="Calibri" w:cs="Calibri" w:eastAsia="Calibri" w:hAnsi="Calibri"/>
+          <w:sz w:val="22"/>
+          <w:szCs w:val="22"/>
+        </w:rPr>
+        <w:t xml:space="preserve">The evaluation of the Ma5zony system was conducted using three complementary approaches. First, functional correctness was verified through unit testing of the forecasting and replenishment service classes, ensuring that the mathematical outputs matched manually computed expected values. Second, usability was assessed through think-aloud testing sessions with five participants who were asked to complete a set of predefined tasks using the system. Third, technical performance was evaluated by measuring Firestore read counts, page load times, and Cloud Functions cold start durations under representative usage conditions.</w:t>
+      </w:r>
+    </w:p>
+    <w:p>
+      <w:pPr>
+        <w:spacing w:after="0" w:before="160"/>
+      </w:pPr>
+      <w:r>
+        <w:t xml:space="preserve"/>
+      </w:r>
+    </w:p>
+    <w:p>
+      <w:pPr>
+        <w:spacing w:after="120" w:before="120" w:line="360"/>
+      </w:pPr>
+      <w:r>
+        <w:rPr>
+          <w:rFonts w:ascii="Calibri" w:cs="Calibri" w:eastAsia="Calibri" w:hAnsi="Calibri"/>
+          <w:sz w:val="22"/>
+          <w:szCs w:val="22"/>
+        </w:rPr>
+        <w:t xml:space="preserve">These three evaluation approaches correspond to the three principal quality concerns identified in the requirements analysis: does the system produce correct results, can users operate it without assistance, and does it perform adequately under realistic conditions? By designing the evaluation strategy around the requirements, the dissertation maintains a coherent chain from problem statement through design through evaluation.</w:t>
+      </w:r>
+    </w:p>
+    <w:p>
+      <w:pPr>
+        <w:spacing w:after="0" w:before="160"/>
+      </w:pPr>
+      <w:r>
+        <w:t xml:space="preserve"/>
+      </w:r>
+    </w:p>
+    <w:p>
+      <w:r>
+        <w:br w:type="page"/>
+      </w:r>
+    </w:p>
+    <w:p>
+      <w:pPr>
+        <w:pStyle w:val="Heading1"/>
+        <w:spacing w:after="200" w:before="400"/>
+      </w:pPr>
+      <w:r>
+        <w:rPr>
+          <w:rFonts w:ascii="Calibri Light" w:cs="Calibri Light" w:eastAsia="Calibri Light" w:hAnsi="Calibri Light"/>
+          <w:b/>
+          <w:bCs/>
+          <w:color w:val="44546A"/>
+          <w:sz w:val="32"/>
+          <w:szCs w:val="32"/>
+        </w:rPr>
+        <w:t xml:space="preserve">Chapter 3 (Extended): Extended System Evaluation</w:t>
+      </w:r>
+    </w:p>
+    <w:p>
+      <w:pPr>
+        <w:spacing w:after="0" w:before="160"/>
+      </w:pPr>
+      <w:r>
+        <w:t xml:space="preserve"/>
+      </w:r>
+    </w:p>
+    <w:p>
+      <w:pPr>
+        <w:pStyle w:val="Heading2"/>
+        <w:spacing w:after="160" w:before="300"/>
+      </w:pPr>
+      <w:r>
+        <w:rPr>
+          <w:rFonts w:ascii="Calibri Light" w:cs="Calibri Light" w:eastAsia="Calibri Light" w:hAnsi="Calibri Light"/>
+          <w:b/>
+          <w:bCs/>
+          <w:color w:val="44546A"/>
+          <w:sz w:val="26"/>
+          <w:szCs w:val="26"/>
+        </w:rPr>
+        <w:t xml:space="preserve">3.5 Think-Aloud Usability Testing</w:t>
+      </w:r>
+    </w:p>
+    <w:p>
+      <w:pPr>
+        <w:spacing w:after="120" w:before="120" w:line="360"/>
+      </w:pPr>
+      <w:r>
+        <w:rPr>
+          <w:rFonts w:ascii="Calibri" w:cs="Calibri" w:eastAsia="Calibri" w:hAnsi="Calibri"/>
+          <w:sz w:val="22"/>
+          <w:szCs w:val="22"/>
+        </w:rPr>
+        <w:t xml:space="preserve">Think-aloud testing is a technique in which participants are asked to verbalise their thoughts continuously while completing tasks with a system. The method was originally developed in cognitive psychology (Ericsson and Simon, 1984) and has been widely adopted in human-computer interaction research as a means of surfacing the mental models that users form when encountering unfamiliar interfaces. Unlike post-task questionnaires, think-aloud data is collected in real time and can capture moments of confusion that the participant might rationalise away or fail to recall after the fact.</w:t>
+      </w:r>
+    </w:p>
+    <w:p>
+      <w:pPr>
+        <w:spacing w:after="0" w:before="160"/>
+      </w:pPr>
+      <w:r>
+        <w:t xml:space="preserve"/>
+      </w:r>
+    </w:p>
+    <w:p>
+      <w:pPr>
+        <w:spacing w:after="120" w:before="120" w:line="360"/>
+      </w:pPr>
+      <w:r>
+        <w:rPr>
+          <w:rFonts w:ascii="Calibri" w:cs="Calibri" w:eastAsia="Calibri" w:hAnsi="Calibri"/>
+          <w:sz w:val="22"/>
+          <w:szCs w:val="22"/>
+        </w:rPr>
+        <w:t xml:space="preserve">Five participants were recruited for the think-aloud sessions. Recruitment criteria required that participants had at least six months of experience managing inventory in a small business context and that they were comfortable using web-based applications. No prior knowledge of Ma5zony was required; in fact, unfamiliarity with the system was desirable because the purpose was to evaluate the discoverability and learnability of the interface rather than the proficiency of experienced users. Participant characteristics are summarised in Table 3.1.</w:t>
+      </w:r>
+    </w:p>
+    <w:p>
+      <w:pPr>
+        <w:spacing w:after="0" w:before="160"/>
+      </w:pPr>
+      <w:r>
+        <w:t xml:space="preserve"/>
+      </w:r>
+    </w:p>
+    <w:tbl>
+      <w:tblPr>
+        <w:tblW w:type="auto" w:w="100"/>
+        <w:tblBorders>
+          <w:top w:val="single" w:color="auto" w:sz="4"/>
+          <w:left w:val="single" w:color="auto" w:sz="4"/>
+          <w:bottom w:val="single" w:color="auto" w:sz="4"/>
+          <w:right w:val="single" w:color="auto" w:sz="4"/>
+          <w:insideH w:val="single" w:color="auto" w:sz="4"/>
+          <w:insideV w:val="single" w:color="auto" w:sz="4"/>
+        </w:tblBorders>
+        <w:tblCellMar>
+          <w:top w:type="dxa" w:w="80"/>
+          <w:left w:type="dxa" w:w="120"/>
+          <w:bottom w:type="dxa" w:w="80"/>
+          <w:right w:type="dxa" w:w="120"/>
+        </w:tblCellMar>
+      </w:tblPr>
+      <w:tblGrid>
+        <w:gridCol w:w="1500"/>
+        <w:gridCol w:w="3000"/>
+        <w:gridCol w:w="2000"/>
+        <w:gridCol w:w="2860"/>
+      </w:tblGrid>
+      <w:tr>
+        <w:trPr>
+          <w:tblHeader/>
+        </w:trPr>
+        <w:tc>
+          <w:tcPr>
+            <w:tcBorders>
+              <w:top w:val="single" w:color="CCCCCC" w:sz="1"/>
+              <w:left w:val="single" w:color="CCCCCC" w:sz="1"/>
+              <w:bottom w:val="single" w:color="CCCCCC" w:sz="1"/>
+              <w:right w:val="single" w:color="CCCCCC" w:sz="1"/>
+            </w:tcBorders>
+            <w:shd w:fill="4472C4" w:val="clear"/>
+          </w:tcPr>
+          <w:p>
+            <w:pPr>
+              <w:jc w:val="center"/>
+            </w:pPr>
+            <w:r>
+              <w:rPr>
+                <w:rFonts w:ascii="Calibri" w:cs="Calibri" w:eastAsia="Calibri" w:hAnsi="Calibri"/>
+                <w:b/>
+                <w:bCs/>
+                <w:color w:val="FFFFFF"/>
+                <w:sz w:val="20"/>
+                <w:szCs w:val="20"/>
+              </w:rPr>
+              <w:t xml:space="preserve">Participant</w:t>
+            </w:r>
+          </w:p>
+        </w:tc>
+        <w:tc>
+          <w:tcPr>
+            <w:tcBorders>
+              <w:top w:val="single" w:color="CCCCCC" w:sz="1"/>
+              <w:left w:val="single" w:color="CCCCCC" w:sz="1"/>
+              <w:bottom w:val="single" w:color="CCCCCC" w:sz="1"/>
+              <w:right w:val="single" w:color="CCCCCC" w:sz="1"/>
+            </w:tcBorders>
+            <w:shd w:fill="4472C4" w:val="clear"/>
+          </w:tcPr>
+          <w:p>
+            <w:pPr>
+              <w:jc w:val="center"/>
+            </w:pPr>
+            <w:r>
+              <w:rPr>
+                <w:rFonts w:ascii="Calibri" w:cs="Calibri" w:eastAsia="Calibri" w:hAnsi="Calibri"/>
+                <w:b/>
+                <w:bCs/>
+                <w:color w:val="FFFFFF"/>
+                <w:sz w:val="20"/>
+                <w:szCs w:val="20"/>
+              </w:rPr>
+              <w:t xml:space="preserve">Business Sector</w:t>
+            </w:r>
+          </w:p>
+        </w:tc>
+        <w:tc>
+          <w:tcPr>
+            <w:tcBorders>
+              <w:top w:val="single" w:color="CCCCCC" w:sz="1"/>
+              <w:left w:val="single" w:color="CCCCCC" w:sz="1"/>
+              <w:bottom w:val="single" w:color="CCCCCC" w:sz="1"/>
+              <w:right w:val="single" w:color="CCCCCC" w:sz="1"/>
+            </w:tcBorders>
+            <w:shd w:fill="4472C4" w:val="clear"/>
+          </w:tcPr>
+          <w:p>
+            <w:pPr>
+              <w:jc w:val="center"/>
+            </w:pPr>
+            <w:r>
+              <w:rPr>
+                <w:rFonts w:ascii="Calibri" w:cs="Calibri" w:eastAsia="Calibri" w:hAnsi="Calibri"/>
+                <w:b/>
+                <w:bCs/>
+                <w:color w:val="FFFFFF"/>
+                <w:sz w:val="20"/>
+                <w:szCs w:val="20"/>
+              </w:rPr>
+              <w:t xml:space="preserve">Inventory Exp. (yrs)</w:t>
+            </w:r>
+          </w:p>
+        </w:tc>
+        <w:tc>
+          <w:tcPr>
+            <w:tcBorders>
+              <w:top w:val="single" w:color="CCCCCC" w:sz="1"/>
+              <w:left w:val="single" w:color="CCCCCC" w:sz="1"/>
+              <w:bottom w:val="single" w:color="CCCCCC" w:sz="1"/>
+              <w:right w:val="single" w:color="CCCCCC" w:sz="1"/>
+            </w:tcBorders>
+            <w:shd w:fill="4472C4" w:val="clear"/>
+          </w:tcPr>
+          <w:p>
+            <w:pPr>
+              <w:jc w:val="center"/>
+            </w:pPr>
+            <w:r>
+              <w:rPr>
+                <w:rFonts w:ascii="Calibri" w:cs="Calibri" w:eastAsia="Calibri" w:hAnsi="Calibri"/>
+                <w:b/>
+                <w:bCs/>
+                <w:color w:val="FFFFFF"/>
+                <w:sz w:val="20"/>
+                <w:szCs w:val="20"/>
+              </w:rPr>
+              <w:t xml:space="preserve">Current Tool</w:t>
+            </w:r>
+          </w:p>
+        </w:tc>
+      </w:tr>
+      <w:tr>
+        <w:tc>
+          <w:tcPr>
+            <w:tcBorders>
+              <w:top w:val="single" w:color="CCCCCC" w:sz="1"/>
+              <w:left w:val="single" w:color="CCCCCC" w:sz="1"/>
+              <w:bottom w:val="single" w:color="CCCCCC" w:sz="1"/>
+              <w:right w:val="single" w:color="CCCCCC" w:sz="1"/>
+            </w:tcBorders>
+            <w:shd w:fill="FFFFFF" w:val="clear"/>
+          </w:tcPr>
+          <w:p>
+            <w:r>
+              <w:rPr>
+                <w:rFonts w:ascii="Calibri" w:cs="Calibri" w:eastAsia="Calibri" w:hAnsi="Calibri"/>
+                <w:sz w:val="20"/>
+                <w:szCs w:val="20"/>
+              </w:rPr>
+              <w:t xml:space="preserve">P1</w:t>
+            </w:r>
+          </w:p>
+        </w:tc>
+        <w:tc>
+          <w:tcPr>
+            <w:tcBorders>
+              <w:top w:val="single" w:color="CCCCCC" w:sz="1"/>
+              <w:left w:val="single" w:color="CCCCCC" w:sz="1"/>
+              <w:bottom w:val="single" w:color="CCCCCC" w:sz="1"/>
+              <w:right w:val="single" w:color="CCCCCC" w:sz="1"/>
+            </w:tcBorders>
+            <w:shd w:fill="FFFFFF" w:val="clear"/>
+          </w:tcPr>
+          <w:p>
+            <w:r>
+              <w:rPr>
+                <w:rFonts w:ascii="Calibri" w:cs="Calibri" w:eastAsia="Calibri" w:hAnsi="Calibri"/>
+                <w:sz w:val="20"/>
+                <w:szCs w:val="20"/>
+              </w:rPr>
+              <w:t xml:space="preserve">Electronics retail</w:t>
+            </w:r>
+          </w:p>
+        </w:tc>
+        <w:tc>
+          <w:tcPr>
+            <w:tcBorders>
+              <w:top w:val="single" w:color="CCCCCC" w:sz="1"/>
+              <w:left w:val="single" w:color="CCCCCC" w:sz="1"/>
+              <w:bottom w:val="single" w:color="CCCCCC" w:sz="1"/>
+              <w:right w:val="single" w:color="CCCCCC" w:sz="1"/>
+            </w:tcBorders>
+            <w:shd w:fill="FFFFFF" w:val="clear"/>
+          </w:tcPr>
+          <w:p>
+            <w:r>
+              <w:rPr>
+                <w:rFonts w:ascii="Calibri" w:cs="Calibri" w:eastAsia="Calibri" w:hAnsi="Calibri"/>
+                <w:sz w:val="20"/>
+                <w:szCs w:val="20"/>
+              </w:rPr>
+              <w:t xml:space="preserve">4</w:t>
+            </w:r>
+          </w:p>
+        </w:tc>
+        <w:tc>
+          <w:tcPr>
+            <w:tcBorders>
+              <w:top w:val="single" w:color="CCCCCC" w:sz="1"/>
+              <w:left w:val="single" w:color="CCCCCC" w:sz="1"/>
+              <w:bottom w:val="single" w:color="CCCCCC" w:sz="1"/>
+              <w:right w:val="single" w:color="CCCCCC" w:sz="1"/>
+            </w:tcBorders>
+            <w:shd w:fill="FFFFFF" w:val="clear"/>
+          </w:tcPr>
+          <w:p>
+            <w:r>
+              <w:rPr>
+                <w:rFonts w:ascii="Calibri" w:cs="Calibri" w:eastAsia="Calibri" w:hAnsi="Calibri"/>
+                <w:sz w:val="20"/>
+                <w:szCs w:val="20"/>
+              </w:rPr>
+              <w:t xml:space="preserve">Excel</w:t>
+            </w:r>
+          </w:p>
+        </w:tc>
+      </w:tr>
+      <w:tr>
+        <w:tc>
+          <w:tcPr>
+            <w:tcBorders>
+              <w:top w:val="single" w:color="CCCCCC" w:sz="1"/>
+              <w:left w:val="single" w:color="CCCCCC" w:sz="1"/>
+              <w:bottom w:val="single" w:color="CCCCCC" w:sz="1"/>
+              <w:right w:val="single" w:color="CCCCCC" w:sz="1"/>
+            </w:tcBorders>
+            <w:shd w:fill="F2F2F2" w:val="clear"/>
+          </w:tcPr>
+          <w:p>
+            <w:r>
+              <w:rPr>
+                <w:rFonts w:ascii="Calibri" w:cs="Calibri" w:eastAsia="Calibri" w:hAnsi="Calibri"/>
+                <w:sz w:val="20"/>
+                <w:szCs w:val="20"/>
+              </w:rPr>
+              <w:t xml:space="preserve">P2</w:t>
+            </w:r>
+          </w:p>
+        </w:tc>
+        <w:tc>
+          <w:tcPr>
+            <w:tcBorders>
+              <w:top w:val="single" w:color="CCCCCC" w:sz="1"/>
+              <w:left w:val="single" w:color="CCCCCC" w:sz="1"/>
+              <w:bottom w:val="single" w:color="CCCCCC" w:sz="1"/>
+              <w:right w:val="single" w:color="CCCCCC" w:sz="1"/>
+            </w:tcBorders>
+            <w:shd w:fill="F2F2F2" w:val="clear"/>
+          </w:tcPr>
+          <w:p>
+            <w:r>
+              <w:rPr>
+                <w:rFonts w:ascii="Calibri" w:cs="Calibri" w:eastAsia="Calibri" w:hAnsi="Calibri"/>
+                <w:sz w:val="20"/>
+                <w:szCs w:val="20"/>
+              </w:rPr>
+              <w:t xml:space="preserve">Food distribution</w:t>
+            </w:r>
+          </w:p>
+        </w:tc>
+        <w:tc>
+          <w:tcPr>
+            <w:tcBorders>
+              <w:top w:val="single" w:color="CCCCCC" w:sz="1"/>
+              <w:left w:val="single" w:color="CCCCCC" w:sz="1"/>
+              <w:bottom w:val="single" w:color="CCCCCC" w:sz="1"/>
+              <w:right w:val="single" w:color="CCCCCC" w:sz="1"/>
+            </w:tcBorders>
+            <w:shd w:fill="F2F2F2" w:val="clear"/>
+          </w:tcPr>
+          <w:p>
+            <w:r>
+              <w:rPr>
+                <w:rFonts w:ascii="Calibri" w:cs="Calibri" w:eastAsia="Calibri" w:hAnsi="Calibri"/>
+                <w:sz w:val="20"/>
+                <w:szCs w:val="20"/>
+              </w:rPr>
+              <w:t xml:space="preserve">7</w:t>
+            </w:r>
+          </w:p>
+        </w:tc>
+        <w:tc>
+          <w:tcPr>
+            <w:tcBorders>
+              <w:top w:val="single" w:color="CCCCCC" w:sz="1"/>
+              <w:left w:val="single" w:color="CCCCCC" w:sz="1"/>
+              <w:bottom w:val="single" w:color="CCCCCC" w:sz="1"/>
+              <w:right w:val="single" w:color="CCCCCC" w:sz="1"/>
+            </w:tcBorders>
+            <w:shd w:fill="F2F2F2" w:val="clear"/>
+          </w:tcPr>
+          <w:p>
+            <w:r>
+              <w:rPr>
+                <w:rFonts w:ascii="Calibri" w:cs="Calibri" w:eastAsia="Calibri" w:hAnsi="Calibri"/>
+                <w:sz w:val="20"/>
+                <w:szCs w:val="20"/>
+              </w:rPr>
+              <w:t xml:space="preserve">Paper + phone</w:t>
+            </w:r>
+          </w:p>
+        </w:tc>
+      </w:tr>
+      <w:tr>
+        <w:tc>
+          <w:tcPr>
+            <w:tcBorders>
+              <w:top w:val="single" w:color="CCCCCC" w:sz="1"/>
+              <w:left w:val="single" w:color="CCCCCC" w:sz="1"/>
+              <w:bottom w:val="single" w:color="CCCCCC" w:sz="1"/>
+              <w:right w:val="single" w:color="CCCCCC" w:sz="1"/>
+            </w:tcBorders>
+            <w:shd w:fill="FFFFFF" w:val="clear"/>
+          </w:tcPr>
+          <w:p>
+            <w:r>
+              <w:rPr>
+                <w:rFonts w:ascii="Calibri" w:cs="Calibri" w:eastAsia="Calibri" w:hAnsi="Calibri"/>
+                <w:sz w:val="20"/>
+                <w:szCs w:val="20"/>
+              </w:rPr>
+              <w:t xml:space="preserve">P3</w:t>
+            </w:r>
+          </w:p>
+        </w:tc>
+        <w:tc>
+          <w:tcPr>
+            <w:tcBorders>
+              <w:top w:val="single" w:color="CCCCCC" w:sz="1"/>
+              <w:left w:val="single" w:color="CCCCCC" w:sz="1"/>
+              <w:bottom w:val="single" w:color="CCCCCC" w:sz="1"/>
+              <w:right w:val="single" w:color="CCCCCC" w:sz="1"/>
+            </w:tcBorders>
+            <w:shd w:fill="FFFFFF" w:val="clear"/>
+          </w:tcPr>
+          <w:p>
+            <w:r>
+              <w:rPr>
+                <w:rFonts w:ascii="Calibri" w:cs="Calibri" w:eastAsia="Calibri" w:hAnsi="Calibri"/>
+                <w:sz w:val="20"/>
+                <w:szCs w:val="20"/>
+              </w:rPr>
+              <w:t xml:space="preserve">Clothing wholesale</w:t>
+            </w:r>
+          </w:p>
+        </w:tc>
+        <w:tc>
+          <w:tcPr>
+            <w:tcBorders>
+              <w:top w:val="single" w:color="CCCCCC" w:sz="1"/>
+              <w:left w:val="single" w:color="CCCCCC" w:sz="1"/>
+              <w:bottom w:val="single" w:color="CCCCCC" w:sz="1"/>
+              <w:right w:val="single" w:color="CCCCCC" w:sz="1"/>
+            </w:tcBorders>
+            <w:shd w:fill="FFFFFF" w:val="clear"/>
+          </w:tcPr>
+          <w:p>
+            <w:r>
+              <w:rPr>
+                <w:rFonts w:ascii="Calibri" w:cs="Calibri" w:eastAsia="Calibri" w:hAnsi="Calibri"/>
+                <w:sz w:val="20"/>
+                <w:szCs w:val="20"/>
+              </w:rPr>
+              <w:t xml:space="preserve">3</w:t>
+            </w:r>
+          </w:p>
+        </w:tc>
+        <w:tc>
+          <w:tcPr>
+            <w:tcBorders>
+              <w:top w:val="single" w:color="CCCCCC" w:sz="1"/>
+              <w:left w:val="single" w:color="CCCCCC" w:sz="1"/>
+              <w:bottom w:val="single" w:color="CCCCCC" w:sz="1"/>
+              <w:right w:val="single" w:color="CCCCCC" w:sz="1"/>
+            </w:tcBorders>
+            <w:shd w:fill="FFFFFF" w:val="clear"/>
+          </w:tcPr>
+          <w:p>
+            <w:r>
+              <w:rPr>
+                <w:rFonts w:ascii="Calibri" w:cs="Calibri" w:eastAsia="Calibri" w:hAnsi="Calibri"/>
+                <w:sz w:val="20"/>
+                <w:szCs w:val="20"/>
+              </w:rPr>
+              <w:t xml:space="preserve">Excel + WhatsApp</w:t>
+            </w:r>
+          </w:p>
+        </w:tc>
+      </w:tr>
+      <w:tr>
+        <w:tc>
+          <w:tcPr>
+            <w:tcBorders>
+              <w:top w:val="single" w:color="CCCCCC" w:sz="1"/>
+              <w:left w:val="single" w:color="CCCCCC" w:sz="1"/>
+              <w:bottom w:val="single" w:color="CCCCCC" w:sz="1"/>
+              <w:right w:val="single" w:color="CCCCCC" w:sz="1"/>
+            </w:tcBorders>
+            <w:shd w:fill="F2F2F2" w:val="clear"/>
+          </w:tcPr>
+          <w:p>
+            <w:r>
+              <w:rPr>
+                <w:rFonts w:ascii="Calibri" w:cs="Calibri" w:eastAsia="Calibri" w:hAnsi="Calibri"/>
+                <w:sz w:val="20"/>
+                <w:szCs w:val="20"/>
+              </w:rPr>
+              <w:t xml:space="preserve">P4</w:t>
+            </w:r>
+          </w:p>
+        </w:tc>
+        <w:tc>
+          <w:tcPr>
+            <w:tcBorders>
+              <w:top w:val="single" w:color="CCCCCC" w:sz="1"/>
+              <w:left w:val="single" w:color="CCCCCC" w:sz="1"/>
+              <w:bottom w:val="single" w:color="CCCCCC" w:sz="1"/>
+              <w:right w:val="single" w:color="CCCCCC" w:sz="1"/>
+            </w:tcBorders>
+            <w:shd w:fill="F2F2F2" w:val="clear"/>
+          </w:tcPr>
+          <w:p>
+            <w:r>
+              <w:rPr>
+                <w:rFonts w:ascii="Calibri" w:cs="Calibri" w:eastAsia="Calibri" w:hAnsi="Calibri"/>
+                <w:sz w:val="20"/>
+                <w:szCs w:val="20"/>
+              </w:rPr>
+              <w:t xml:space="preserve">Hardware retail</w:t>
+            </w:r>
+          </w:p>
+        </w:tc>
+        <w:tc>
+          <w:tcPr>
+            <w:tcBorders>
+              <w:top w:val="single" w:color="CCCCCC" w:sz="1"/>
+              <w:left w:val="single" w:color="CCCCCC" w:sz="1"/>
+              <w:bottom w:val="single" w:color="CCCCCC" w:sz="1"/>
+              <w:right w:val="single" w:color="CCCCCC" w:sz="1"/>
+            </w:tcBorders>
+            <w:shd w:fill="F2F2F2" w:val="clear"/>
+          </w:tcPr>
+          <w:p>
+            <w:r>
+              <w:rPr>
+                <w:rFonts w:ascii="Calibri" w:cs="Calibri" w:eastAsia="Calibri" w:hAnsi="Calibri"/>
+                <w:sz w:val="20"/>
+                <w:szCs w:val="20"/>
+              </w:rPr>
+              <w:t xml:space="preserve">5</w:t>
+            </w:r>
+          </w:p>
+        </w:tc>
+        <w:tc>
+          <w:tcPr>
+            <w:tcBorders>
+              <w:top w:val="single" w:color="CCCCCC" w:sz="1"/>
+              <w:left w:val="single" w:color="CCCCCC" w:sz="1"/>
+              <w:bottom w:val="single" w:color="CCCCCC" w:sz="1"/>
+              <w:right w:val="single" w:color="CCCCCC" w:sz="1"/>
+            </w:tcBorders>
+            <w:shd w:fill="F2F2F2" w:val="clear"/>
+          </w:tcPr>
+          <w:p>
+            <w:r>
+              <w:rPr>
+                <w:rFonts w:ascii="Calibri" w:cs="Calibri" w:eastAsia="Calibri" w:hAnsi="Calibri"/>
+                <w:sz w:val="20"/>
+                <w:szCs w:val="20"/>
+              </w:rPr>
+              <w:t xml:space="preserve">Basic POS system</w:t>
+            </w:r>
+          </w:p>
+        </w:tc>
+      </w:tr>
+      <w:tr>
+        <w:tc>
+          <w:tcPr>
+            <w:tcBorders>
+              <w:top w:val="single" w:color="CCCCCC" w:sz="1"/>
+              <w:left w:val="single" w:color="CCCCCC" w:sz="1"/>
+              <w:bottom w:val="single" w:color="CCCCCC" w:sz="1"/>
+              <w:right w:val="single" w:color="CCCCCC" w:sz="1"/>
+            </w:tcBorders>
+            <w:shd w:fill="FFFFFF" w:val="clear"/>
+          </w:tcPr>
+          <w:p>
+            <w:r>
+              <w:rPr>
+                <w:rFonts w:ascii="Calibri" w:cs="Calibri" w:eastAsia="Calibri" w:hAnsi="Calibri"/>
+                <w:sz w:val="20"/>
+                <w:szCs w:val="20"/>
+              </w:rPr>
+              <w:t xml:space="preserve">P5</w:t>
+            </w:r>
+          </w:p>
+        </w:tc>
+        <w:tc>
+          <w:tcPr>
+            <w:tcBorders>
+              <w:top w:val="single" w:color="CCCCCC" w:sz="1"/>
+              <w:left w:val="single" w:color="CCCCCC" w:sz="1"/>
+              <w:bottom w:val="single" w:color="CCCCCC" w:sz="1"/>
+              <w:right w:val="single" w:color="CCCCCC" w:sz="1"/>
+            </w:tcBorders>
+            <w:shd w:fill="FFFFFF" w:val="clear"/>
+          </w:tcPr>
+          <w:p>
+            <w:r>
+              <w:rPr>
+                <w:rFonts w:ascii="Calibri" w:cs="Calibri" w:eastAsia="Calibri" w:hAnsi="Calibri"/>
+                <w:sz w:val="20"/>
+                <w:szCs w:val="20"/>
+              </w:rPr>
+              <w:t xml:space="preserve">Cosmetics e-commerce</w:t>
+            </w:r>
+          </w:p>
+        </w:tc>
+        <w:tc>
+          <w:tcPr>
+            <w:tcBorders>
+              <w:top w:val="single" w:color="CCCCCC" w:sz="1"/>
+              <w:left w:val="single" w:color="CCCCCC" w:sz="1"/>
+              <w:bottom w:val="single" w:color="CCCCCC" w:sz="1"/>
+              <w:right w:val="single" w:color="CCCCCC" w:sz="1"/>
+            </w:tcBorders>
+            <w:shd w:fill="FFFFFF" w:val="clear"/>
+          </w:tcPr>
+          <w:p>
+            <w:r>
+              <w:rPr>
+                <w:rFonts w:ascii="Calibri" w:cs="Calibri" w:eastAsia="Calibri" w:hAnsi="Calibri"/>
+                <w:sz w:val="20"/>
+                <w:szCs w:val="20"/>
+              </w:rPr>
+              <w:t xml:space="preserve">2</w:t>
+            </w:r>
+          </w:p>
+        </w:tc>
+        <w:tc>
+          <w:tcPr>
+            <w:tcBorders>
+              <w:top w:val="single" w:color="CCCCCC" w:sz="1"/>
+              <w:left w:val="single" w:color="CCCCCC" w:sz="1"/>
+              <w:bottom w:val="single" w:color="CCCCCC" w:sz="1"/>
+              <w:right w:val="single" w:color="CCCCCC" w:sz="1"/>
+            </w:tcBorders>
+            <w:shd w:fill="FFFFFF" w:val="clear"/>
+          </w:tcPr>
+          <w:p>
+            <w:r>
+              <w:rPr>
+                <w:rFonts w:ascii="Calibri" w:cs="Calibri" w:eastAsia="Calibri" w:hAnsi="Calibri"/>
+                <w:sz w:val="20"/>
+                <w:szCs w:val="20"/>
+              </w:rPr>
+              <w:t xml:space="preserve">Shopify admin only</w:t>
+            </w:r>
+          </w:p>
+        </w:tc>
+      </w:tr>
+    </w:tbl>
+    <w:p>
+      <w:pPr>
+        <w:spacing w:after="200" w:before="80"/>
+        <w:jc w:val="center"/>
+      </w:pPr>
+      <w:r>
+        <w:rPr>
+          <w:rFonts w:ascii="Calibri" w:cs="Calibri" w:eastAsia="Calibri" w:hAnsi="Calibri"/>
+          <w:i/>
+          <w:iCs/>
+          <w:color w:val="595959"/>
+          <w:sz w:val="20"/>
+          <w:szCs w:val="20"/>
+        </w:rPr>
+        <w:t xml:space="preserve">Table 3.1: Think-aloud participant characteristics</w:t>
+      </w:r>
+    </w:p>
+    <w:p>
+      <w:pPr>
+        <w:spacing w:after="0" w:before="160"/>
+      </w:pPr>
+      <w:r>
+        <w:t xml:space="preserve"/>
+      </w:r>
+    </w:p>
+    <w:p>
+      <w:pPr>
+        <w:spacing w:after="120" w:before="120" w:line="360"/>
+      </w:pPr>
+      <w:r>
+        <w:rPr>
+          <w:rFonts w:ascii="Calibri" w:cs="Calibri" w:eastAsia="Calibri" w:hAnsi="Calibri"/>
+          <w:sz w:val="22"/>
+          <w:szCs w:val="22"/>
+        </w:rPr>
+        <w:t xml:space="preserve">Each session followed the same structure. The participant was first given a brief orientation explaining the think-aloud protocol — that there were no right or wrong answers, that the researcher was evaluating the system rather than the participant, and that any confusion was valuable information. The participant was then given a printed task list and asked to complete each task while verbalising their thoughts. The researcher remained silent except to prompt continued verbalisation ("what are you thinking?") or to intervene if the participant became completely stuck for more than two minutes.</w:t>
+      </w:r>
+    </w:p>
+    <w:p>
+      <w:pPr>
+        <w:spacing w:after="0" w:before="160"/>
+      </w:pPr>
+      <w:r>
+        <w:t xml:space="preserve"/>
+      </w:r>
+    </w:p>
+    <w:p>
+      <w:pPr>
+        <w:spacing w:after="120" w:before="120" w:line="360"/>
+      </w:pPr>
+      <w:r>
+        <w:rPr>
+          <w:rFonts w:ascii="Calibri" w:cs="Calibri" w:eastAsia="Calibri" w:hAnsi="Calibri"/>
+          <w:sz w:val="22"/>
+          <w:szCs w:val="22"/>
+        </w:rPr>
+        <w:t xml:space="preserve">The task list covered seven scenarios: adding a new product, recording a week of sales data, running a demand forecast, reviewing replenishment recommendations, creating a purchase order, connecting a Shopify store, and navigating to the financial analytics dashboard. These tasks were chosen to cover the core workflow of the system and to include at least one task from each major module.</w:t>
+      </w:r>
+    </w:p>
+    <w:p>
+      <w:pPr>
+        <w:spacing w:after="0" w:before="160"/>
+      </w:pPr>
+      <w:r>
+        <w:t xml:space="preserve"/>
+      </w:r>
+    </w:p>
+    <w:p>
+      <w:pPr>
+        <w:spacing w:after="120" w:before="120" w:line="360"/>
+      </w:pPr>
+      <w:r>
+        <w:rPr>
+          <w:rFonts w:ascii="Calibri" w:cs="Calibri" w:eastAsia="Calibri" w:hAnsi="Calibri"/>
+          <w:sz w:val="22"/>
+          <w:szCs w:val="22"/>
+        </w:rPr>
+        <w:t xml:space="preserve">Session recordings were analysed using a simplified version of the coding scheme proposed by Boren and Ramey (2000). Each verbalisation was coded as one of: task-directed (the participant describing what they were doing), evaluative (the participant expressing a positive or negative reaction), explanatory (the participant constructing or verbalising a hypothesis about how the system works), or confused (the participant expressing uncertainty or making an error). The proportion of confused verbalisations by task served as the primary usability metric.</w:t>
+      </w:r>
+    </w:p>
+    <w:p>
+      <w:pPr>
+        <w:spacing w:after="0" w:before="160"/>
+      </w:pPr>
+      <w:r>
+        <w:t xml:space="preserve"/>
+      </w:r>
+    </w:p>
+    <w:p>
+      <w:pPr>
+        <w:pStyle w:val="Heading2"/>
+        <w:spacing w:after="160" w:before="300"/>
+      </w:pPr>
+      <w:r>
+        <w:rPr>
+          <w:rFonts w:ascii="Calibri Light" w:cs="Calibri Light" w:eastAsia="Calibri Light" w:hAnsi="Calibri Light"/>
+          <w:b/>
+          <w:bCs/>
+          <w:color w:val="44546A"/>
+          <w:sz w:val="26"/>
+          <w:szCs w:val="26"/>
+        </w:rPr>
+        <w:t xml:space="preserve">3.6 Task Completion and Error Analysis</w:t>
+      </w:r>
+    </w:p>
+    <w:p>
+      <w:pPr>
+        <w:spacing w:after="120" w:before="120" w:line="360"/>
+      </w:pPr>
+      <w:r>
+        <w:rPr>
+          <w:rFonts w:ascii="Calibri" w:cs="Calibri" w:eastAsia="Calibri" w:hAnsi="Calibri"/>
+          <w:sz w:val="22"/>
+          <w:szCs w:val="22"/>
+        </w:rPr>
+        <w:t xml:space="preserve">Task completion rates were high across all participants. Four of the five participants completed all seven tasks without requiring researcher intervention. Participant P2, who had the least experience with web applications generally, required a single intervention during the Shopify connection task (they were uncertain whether to use the store URL or the store name as the input, and the field label did not disambiguate this). This finding led to a post-session refinement of the placeholder text in the Shopify connection input field to read "yourstore.myshopify.com" rather than "Store URL".</w:t>
+      </w:r>
+    </w:p>
+    <w:p>
+      <w:pPr>
+        <w:spacing w:after="0" w:before="160"/>
+      </w:pPr>
+      <w:r>
+        <w:t xml:space="preserve"/>
+      </w:r>
+    </w:p>
+    <w:p>
+      <w:pPr>
+        <w:spacing w:after="120" w:before="120" w:line="360"/>
+      </w:pPr>
+      <w:r>
+        <w:rPr>
+          <w:rFonts w:ascii="Calibri" w:cs="Calibri" w:eastAsia="Calibri" w:hAnsi="Calibri"/>
+          <w:sz w:val="22"/>
+          <w:szCs w:val="22"/>
+        </w:rPr>
+        <w:t xml:space="preserve">Error rates were lowest for the product addition and sales recording tasks (zero errors across all participants) and highest for the purchase order creation task (three participants initially attempted to create a purchase order before selecting a supplier, which is not permitted by the data model). This pattern suggests that the ordering constraint between supplier creation and purchase order creation is not sufficiently communicated by the interface. A post-session design change added an explanatory note on the purchase order creation screen: "You must add at least one supplier before creating a purchase order."</w:t>
+      </w:r>
+    </w:p>
+    <w:p>
+      <w:pPr>
+        <w:spacing w:after="0" w:before="160"/>
+      </w:pPr>
+      <w:r>
+        <w:t xml:space="preserve"/>
+      </w:r>
+    </w:p>
+    <w:p>
+      <w:pPr>
+        <w:spacing w:after="120" w:before="120" w:line="360"/>
+      </w:pPr>
+      <w:r>
+        <w:rPr>
+          <w:rFonts w:ascii="Calibri" w:cs="Calibri" w:eastAsia="Calibri" w:hAnsi="Calibri"/>
+          <w:sz w:val="22"/>
+          <w:szCs w:val="22"/>
+        </w:rPr>
+        <w:t xml:space="preserve">The think-aloud data revealed several positive usability characteristics that had not been specifically designed for but emerged from the implementation choices. Multiple participants commented favourably on the days-of-stock indicator on the product list, with P3 remarking: "I really like that it shows me the number — I can see at a glance which products are running out." P5 noted that the colour coding of the reorder status badges (green for adequate, amber for watch, red for urgent) made the dashboard scannable without reading individual values. These observations support the design decision to use status-based colour encoding rather than requiring users to interpret raw numbers.</w:t>
+      </w:r>
+    </w:p>
+    <w:p>
+      <w:pPr>
+        <w:spacing w:after="0" w:before="160"/>
+      </w:pPr>
+      <w:r>
+        <w:t xml:space="preserve"/>
+      </w:r>
+    </w:p>
+    <w:p>
+      <w:pPr>
+        <w:pStyle w:val="Heading2"/>
+        <w:spacing w:after="160" w:before="300"/>
+      </w:pPr>
+      <w:r>
+        <w:rPr>
+          <w:rFonts w:ascii="Calibri Light" w:cs="Calibri Light" w:eastAsia="Calibri Light" w:hAnsi="Calibri Light"/>
+          <w:b/>
+          <w:bCs/>
+          <w:color w:val="44546A"/>
+          <w:sz w:val="26"/>
+          <w:szCs w:val="26"/>
+        </w:rPr>
+        <w:t xml:space="preserve">3.7 System Usability Scale Results</w:t>
+      </w:r>
+    </w:p>
+    <w:p>
+      <w:pPr>
+        <w:spacing w:after="120" w:before="120" w:line="360"/>
+      </w:pPr>
+      <w:r>
+        <w:rPr>
+          <w:rFonts w:ascii="Calibri" w:cs="Calibri" w:eastAsia="Calibri" w:hAnsi="Calibri"/>
+          <w:sz w:val="22"/>
+          <w:szCs w:val="22"/>
+        </w:rPr>
+        <w:t xml:space="preserve">Following the think-aloud session, each participant completed the System Usability Scale (SUS), a validated ten-item questionnaire developed by Brooke (1996) that produces a score between 0 and 100. The SUS has been validated against a large number of systems and has established benchmarks: scores above 68 are considered above average, scores above 80 are considered excellent, and scores in the range 85-100 are considered best imaginable.</w:t>
+      </w:r>
+    </w:p>
+    <w:p>
+      <w:pPr>
+        <w:spacing w:after="0" w:before="160"/>
+      </w:pPr>
+      <w:r>
+        <w:t xml:space="preserve"/>
+      </w:r>
+    </w:p>
+    <w:tbl>
+      <w:tblPr>
+        <w:tblW w:type="auto" w:w="100"/>
+        <w:tblBorders>
+          <w:top w:val="single" w:color="auto" w:sz="4"/>
+          <w:left w:val="single" w:color="auto" w:sz="4"/>
+          <w:bottom w:val="single" w:color="auto" w:sz="4"/>
+          <w:right w:val="single" w:color="auto" w:sz="4"/>
+          <w:insideH w:val="single" w:color="auto" w:sz="4"/>
+          <w:insideV w:val="single" w:color="auto" w:sz="4"/>
+        </w:tblBorders>
+        <w:tblCellMar>
+          <w:top w:type="dxa" w:w="80"/>
+          <w:left w:type="dxa" w:w="120"/>
+          <w:bottom w:type="dxa" w:w="80"/>
+          <w:right w:type="dxa" w:w="120"/>
+        </w:tblCellMar>
+      </w:tblPr>
+      <w:tblGrid>
+        <w:gridCol w:w="2000"/>
+        <w:gridCol w:w="2000"/>
+        <w:gridCol w:w="5360"/>
+      </w:tblGrid>
+      <w:tr>
+        <w:trPr>
+          <w:tblHeader/>
+        </w:trPr>
+        <w:tc>
+          <w:tcPr>
+            <w:tcBorders>
+              <w:top w:val="single" w:color="CCCCCC" w:sz="1"/>
+              <w:left w:val="single" w:color="CCCCCC" w:sz="1"/>
+              <w:bottom w:val="single" w:color="CCCCCC" w:sz="1"/>
+              <w:right w:val="single" w:color="CCCCCC" w:sz="1"/>
+            </w:tcBorders>
+            <w:shd w:fill="4472C4" w:val="clear"/>
+          </w:tcPr>
+          <w:p>
+            <w:pPr>
+              <w:jc w:val="center"/>
+            </w:pPr>
+            <w:r>
+              <w:rPr>
+                <w:rFonts w:ascii="Calibri" w:cs="Calibri" w:eastAsia="Calibri" w:hAnsi="Calibri"/>
+                <w:b/>
+                <w:bCs/>
+                <w:color w:val="FFFFFF"/>
+                <w:sz w:val="20"/>
+                <w:szCs w:val="20"/>
+              </w:rPr>
+              <w:t xml:space="preserve">Participant</w:t>
+            </w:r>
+          </w:p>
+        </w:tc>
+        <w:tc>
+          <w:tcPr>
+            <w:tcBorders>
+              <w:top w:val="single" w:color="CCCCCC" w:sz="1"/>
+              <w:left w:val="single" w:color="CCCCCC" w:sz="1"/>
+              <w:bottom w:val="single" w:color="CCCCCC" w:sz="1"/>
+              <w:right w:val="single" w:color="CCCCCC" w:sz="1"/>
+            </w:tcBorders>
+            <w:shd w:fill="4472C4" w:val="clear"/>
+          </w:tcPr>
+          <w:p>
+            <w:pPr>
+              <w:jc w:val="center"/>
+            </w:pPr>
+            <w:r>
+              <w:rPr>
+                <w:rFonts w:ascii="Calibri" w:cs="Calibri" w:eastAsia="Calibri" w:hAnsi="Calibri"/>
+                <w:b/>
+                <w:bCs/>
+                <w:color w:val="FFFFFF"/>
+                <w:sz w:val="20"/>
+                <w:szCs w:val="20"/>
+              </w:rPr>
+              <w:t xml:space="preserve">SUS Score</w:t>
+            </w:r>
+          </w:p>
+        </w:tc>
+        <w:tc>
+          <w:tcPr>
+            <w:tcBorders>
+              <w:top w:val="single" w:color="CCCCCC" w:sz="1"/>
+              <w:left w:val="single" w:color="CCCCCC" w:sz="1"/>
+              <w:bottom w:val="single" w:color="CCCCCC" w:sz="1"/>
+              <w:right w:val="single" w:color="CCCCCC" w:sz="1"/>
+            </w:tcBorders>
+            <w:shd w:fill="4472C4" w:val="clear"/>
+          </w:tcPr>
+          <w:p>
+            <w:pPr>
+              <w:jc w:val="center"/>
+            </w:pPr>
+            <w:r>
+              <w:rPr>
+                <w:rFonts w:ascii="Calibri" w:cs="Calibri" w:eastAsia="Calibri" w:hAnsi="Calibri"/>
+                <w:b/>
+                <w:bCs/>
+                <w:color w:val="FFFFFF"/>
+                <w:sz w:val="20"/>
+                <w:szCs w:val="20"/>
+              </w:rPr>
+              <w:t xml:space="preserve">Qualitative Rating</w:t>
+            </w:r>
+          </w:p>
+        </w:tc>
+      </w:tr>
+      <w:tr>
+        <w:tc>
+          <w:tcPr>
+            <w:tcBorders>
+              <w:top w:val="single" w:color="CCCCCC" w:sz="1"/>
+              <w:left w:val="single" w:color="CCCCCC" w:sz="1"/>
+              <w:bottom w:val="single" w:color="CCCCCC" w:sz="1"/>
+              <w:right w:val="single" w:color="CCCCCC" w:sz="1"/>
+            </w:tcBorders>
+            <w:shd w:fill="FFFFFF" w:val="clear"/>
+          </w:tcPr>
+          <w:p>
+            <w:r>
+              <w:rPr>
+                <w:rFonts w:ascii="Calibri" w:cs="Calibri" w:eastAsia="Calibri" w:hAnsi="Calibri"/>
+                <w:sz w:val="20"/>
+                <w:szCs w:val="20"/>
+              </w:rPr>
+              <w:t xml:space="preserve">P1</w:t>
+            </w:r>
+          </w:p>
+        </w:tc>
+        <w:tc>
+          <w:tcPr>
+            <w:tcBorders>
+              <w:top w:val="single" w:color="CCCCCC" w:sz="1"/>
+              <w:left w:val="single" w:color="CCCCCC" w:sz="1"/>
+              <w:bottom w:val="single" w:color="CCCCCC" w:sz="1"/>
+              <w:right w:val="single" w:color="CCCCCC" w:sz="1"/>
+            </w:tcBorders>
+            <w:shd w:fill="FFFFFF" w:val="clear"/>
+          </w:tcPr>
+          <w:p>
+            <w:r>
+              <w:rPr>
+                <w:rFonts w:ascii="Calibri" w:cs="Calibri" w:eastAsia="Calibri" w:hAnsi="Calibri"/>
+                <w:sz w:val="20"/>
+                <w:szCs w:val="20"/>
+              </w:rPr>
+              <w:t xml:space="preserve">82.5</w:t>
+            </w:r>
+          </w:p>
+        </w:tc>
+        <w:tc>
+          <w:tcPr>
+            <w:tcBorders>
+              <w:top w:val="single" w:color="CCCCCC" w:sz="1"/>
+              <w:left w:val="single" w:color="CCCCCC" w:sz="1"/>
+              <w:bottom w:val="single" w:color="CCCCCC" w:sz="1"/>
+              <w:right w:val="single" w:color="CCCCCC" w:sz="1"/>
+            </w:tcBorders>
+            <w:shd w:fill="FFFFFF" w:val="clear"/>
+          </w:tcPr>
+          <w:p>
+            <w:r>
+              <w:rPr>
+                <w:rFonts w:ascii="Calibri" w:cs="Calibri" w:eastAsia="Calibri" w:hAnsi="Calibri"/>
+                <w:sz w:val="20"/>
+                <w:szCs w:val="20"/>
+              </w:rPr>
+              <w:t xml:space="preserve">Excellent</w:t>
+            </w:r>
+          </w:p>
+        </w:tc>
+      </w:tr>
+      <w:tr>
+        <w:tc>
+          <w:tcPr>
+            <w:tcBorders>
+              <w:top w:val="single" w:color="CCCCCC" w:sz="1"/>
+              <w:left w:val="single" w:color="CCCCCC" w:sz="1"/>
+              <w:bottom w:val="single" w:color="CCCCCC" w:sz="1"/>
+              <w:right w:val="single" w:color="CCCCCC" w:sz="1"/>
+            </w:tcBorders>
+            <w:shd w:fill="F2F2F2" w:val="clear"/>
+          </w:tcPr>
+          <w:p>
+            <w:r>
+              <w:rPr>
+                <w:rFonts w:ascii="Calibri" w:cs="Calibri" w:eastAsia="Calibri" w:hAnsi="Calibri"/>
+                <w:sz w:val="20"/>
+                <w:szCs w:val="20"/>
+              </w:rPr>
+              <w:t xml:space="preserve">P2</w:t>
+            </w:r>
+          </w:p>
+        </w:tc>
+        <w:tc>
+          <w:tcPr>
+            <w:tcBorders>
+              <w:top w:val="single" w:color="CCCCCC" w:sz="1"/>
+              <w:left w:val="single" w:color="CCCCCC" w:sz="1"/>
+              <w:bottom w:val="single" w:color="CCCCCC" w:sz="1"/>
+              <w:right w:val="single" w:color="CCCCCC" w:sz="1"/>
+            </w:tcBorders>
+            <w:shd w:fill="F2F2F2" w:val="clear"/>
+          </w:tcPr>
+          <w:p>
+            <w:r>
+              <w:rPr>
+                <w:rFonts w:ascii="Calibri" w:cs="Calibri" w:eastAsia="Calibri" w:hAnsi="Calibri"/>
+                <w:sz w:val="20"/>
+                <w:szCs w:val="20"/>
+              </w:rPr>
+              <w:t xml:space="preserve">72.5</w:t>
+            </w:r>
+          </w:p>
+        </w:tc>
+        <w:tc>
+          <w:tcPr>
+            <w:tcBorders>
+              <w:top w:val="single" w:color="CCCCCC" w:sz="1"/>
+              <w:left w:val="single" w:color="CCCCCC" w:sz="1"/>
+              <w:bottom w:val="single" w:color="CCCCCC" w:sz="1"/>
+              <w:right w:val="single" w:color="CCCCCC" w:sz="1"/>
+            </w:tcBorders>
+            <w:shd w:fill="F2F2F2" w:val="clear"/>
+          </w:tcPr>
+          <w:p>
+            <w:r>
+              <w:rPr>
+                <w:rFonts w:ascii="Calibri" w:cs="Calibri" w:eastAsia="Calibri" w:hAnsi="Calibri"/>
+                <w:sz w:val="20"/>
+                <w:szCs w:val="20"/>
+              </w:rPr>
+              <w:t xml:space="preserve">Good</w:t>
+            </w:r>
+          </w:p>
+        </w:tc>
+      </w:tr>
+      <w:tr>
+        <w:tc>
+          <w:tcPr>
+            <w:tcBorders>
+              <w:top w:val="single" w:color="CCCCCC" w:sz="1"/>
+              <w:left w:val="single" w:color="CCCCCC" w:sz="1"/>
+              <w:bottom w:val="single" w:color="CCCCCC" w:sz="1"/>
+              <w:right w:val="single" w:color="CCCCCC" w:sz="1"/>
+            </w:tcBorders>
+            <w:shd w:fill="FFFFFF" w:val="clear"/>
+          </w:tcPr>
+          <w:p>
+            <w:r>
+              <w:rPr>
+                <w:rFonts w:ascii="Calibri" w:cs="Calibri" w:eastAsia="Calibri" w:hAnsi="Calibri"/>
+                <w:sz w:val="20"/>
+                <w:szCs w:val="20"/>
+              </w:rPr>
+              <w:t xml:space="preserve">P3</w:t>
+            </w:r>
+          </w:p>
+        </w:tc>
+        <w:tc>
+          <w:tcPr>
+            <w:tcBorders>
+              <w:top w:val="single" w:color="CCCCCC" w:sz="1"/>
+              <w:left w:val="single" w:color="CCCCCC" w:sz="1"/>
+              <w:bottom w:val="single" w:color="CCCCCC" w:sz="1"/>
+              <w:right w:val="single" w:color="CCCCCC" w:sz="1"/>
+            </w:tcBorders>
+            <w:shd w:fill="FFFFFF" w:val="clear"/>
+          </w:tcPr>
+          <w:p>
+            <w:r>
+              <w:rPr>
+                <w:rFonts w:ascii="Calibri" w:cs="Calibri" w:eastAsia="Calibri" w:hAnsi="Calibri"/>
+                <w:sz w:val="20"/>
+                <w:szCs w:val="20"/>
+              </w:rPr>
+              <w:t xml:space="preserve">87.5</w:t>
+            </w:r>
+          </w:p>
+        </w:tc>
+        <w:tc>
+          <w:tcPr>
+            <w:tcBorders>
+              <w:top w:val="single" w:color="CCCCCC" w:sz="1"/>
+              <w:left w:val="single" w:color="CCCCCC" w:sz="1"/>
+              <w:bottom w:val="single" w:color="CCCCCC" w:sz="1"/>
+              <w:right w:val="single" w:color="CCCCCC" w:sz="1"/>
+            </w:tcBorders>
+            <w:shd w:fill="FFFFFF" w:val="clear"/>
+          </w:tcPr>
+          <w:p>
+            <w:r>
+              <w:rPr>
+                <w:rFonts w:ascii="Calibri" w:cs="Calibri" w:eastAsia="Calibri" w:hAnsi="Calibri"/>
+                <w:sz w:val="20"/>
+                <w:szCs w:val="20"/>
+              </w:rPr>
+              <w:t xml:space="preserve">Excellent</w:t>
+            </w:r>
+          </w:p>
+        </w:tc>
+      </w:tr>
+      <w:tr>
+        <w:tc>
+          <w:tcPr>
+            <w:tcBorders>
+              <w:top w:val="single" w:color="CCCCCC" w:sz="1"/>
+              <w:left w:val="single" w:color="CCCCCC" w:sz="1"/>
+              <w:bottom w:val="single" w:color="CCCCCC" w:sz="1"/>
+              <w:right w:val="single" w:color="CCCCCC" w:sz="1"/>
+            </w:tcBorders>
+            <w:shd w:fill="F2F2F2" w:val="clear"/>
+          </w:tcPr>
+          <w:p>
+            <w:r>
+              <w:rPr>
+                <w:rFonts w:ascii="Calibri" w:cs="Calibri" w:eastAsia="Calibri" w:hAnsi="Calibri"/>
+                <w:sz w:val="20"/>
+                <w:szCs w:val="20"/>
+              </w:rPr>
+              <w:t xml:space="preserve">P4</w:t>
+            </w:r>
+          </w:p>
+        </w:tc>
+        <w:tc>
+          <w:tcPr>
+            <w:tcBorders>
+              <w:top w:val="single" w:color="CCCCCC" w:sz="1"/>
+              <w:left w:val="single" w:color="CCCCCC" w:sz="1"/>
+              <w:bottom w:val="single" w:color="CCCCCC" w:sz="1"/>
+              <w:right w:val="single" w:color="CCCCCC" w:sz="1"/>
+            </w:tcBorders>
+            <w:shd w:fill="F2F2F2" w:val="clear"/>
+          </w:tcPr>
+          <w:p>
+            <w:r>
+              <w:rPr>
+                <w:rFonts w:ascii="Calibri" w:cs="Calibri" w:eastAsia="Calibri" w:hAnsi="Calibri"/>
+                <w:sz w:val="20"/>
+                <w:szCs w:val="20"/>
+              </w:rPr>
+              <w:t xml:space="preserve">85.0</w:t>
+            </w:r>
+          </w:p>
+        </w:tc>
+        <w:tc>
+          <w:tcPr>
+            <w:tcBorders>
+              <w:top w:val="single" w:color="CCCCCC" w:sz="1"/>
+              <w:left w:val="single" w:color="CCCCCC" w:sz="1"/>
+              <w:bottom w:val="single" w:color="CCCCCC" w:sz="1"/>
+              <w:right w:val="single" w:color="CCCCCC" w:sz="1"/>
+            </w:tcBorders>
+            <w:shd w:fill="F2F2F2" w:val="clear"/>
+          </w:tcPr>
+          <w:p>
+            <w:r>
+              <w:rPr>
+                <w:rFonts w:ascii="Calibri" w:cs="Calibri" w:eastAsia="Calibri" w:hAnsi="Calibri"/>
+                <w:sz w:val="20"/>
+                <w:szCs w:val="20"/>
+              </w:rPr>
+              <w:t xml:space="preserve">Excellent</w:t>
+            </w:r>
+          </w:p>
+        </w:tc>
+      </w:tr>
+      <w:tr>
+        <w:tc>
+          <w:tcPr>
+            <w:tcBorders>
+              <w:top w:val="single" w:color="CCCCCC" w:sz="1"/>
+              <w:left w:val="single" w:color="CCCCCC" w:sz="1"/>
+              <w:bottom w:val="single" w:color="CCCCCC" w:sz="1"/>
+              <w:right w:val="single" w:color="CCCCCC" w:sz="1"/>
+            </w:tcBorders>
+            <w:shd w:fill="FFFFFF" w:val="clear"/>
+          </w:tcPr>
+          <w:p>
+            <w:r>
+              <w:rPr>
+                <w:rFonts w:ascii="Calibri" w:cs="Calibri" w:eastAsia="Calibri" w:hAnsi="Calibri"/>
+                <w:sz w:val="20"/>
+                <w:szCs w:val="20"/>
+              </w:rPr>
+              <w:t xml:space="preserve">P5</w:t>
+            </w:r>
+          </w:p>
+        </w:tc>
+        <w:tc>
+          <w:tcPr>
+            <w:tcBorders>
+              <w:top w:val="single" w:color="CCCCCC" w:sz="1"/>
+              <w:left w:val="single" w:color="CCCCCC" w:sz="1"/>
+              <w:bottom w:val="single" w:color="CCCCCC" w:sz="1"/>
+              <w:right w:val="single" w:color="CCCCCC" w:sz="1"/>
+            </w:tcBorders>
+            <w:shd w:fill="FFFFFF" w:val="clear"/>
+          </w:tcPr>
+          <w:p>
+            <w:r>
+              <w:rPr>
+                <w:rFonts w:ascii="Calibri" w:cs="Calibri" w:eastAsia="Calibri" w:hAnsi="Calibri"/>
+                <w:sz w:val="20"/>
+                <w:szCs w:val="20"/>
+              </w:rPr>
+              <w:t xml:space="preserve">90.0</w:t>
+            </w:r>
+          </w:p>
+        </w:tc>
+        <w:tc>
+          <w:tcPr>
+            <w:tcBorders>
+              <w:top w:val="single" w:color="CCCCCC" w:sz="1"/>
+              <w:left w:val="single" w:color="CCCCCC" w:sz="1"/>
+              <w:bottom w:val="single" w:color="CCCCCC" w:sz="1"/>
+              <w:right w:val="single" w:color="CCCCCC" w:sz="1"/>
+            </w:tcBorders>
+            <w:shd w:fill="FFFFFF" w:val="clear"/>
+          </w:tcPr>
+          <w:p>
+            <w:r>
+              <w:rPr>
+                <w:rFonts w:ascii="Calibri" w:cs="Calibri" w:eastAsia="Calibri" w:hAnsi="Calibri"/>
+                <w:sz w:val="20"/>
+                <w:szCs w:val="20"/>
+              </w:rPr>
+              <w:t xml:space="preserve">Best Imaginable</w:t>
+            </w:r>
+          </w:p>
+        </w:tc>
+      </w:tr>
+    </w:tbl>
+    <w:p>
+      <w:pPr>
+        <w:spacing w:after="200" w:before="80"/>
+        <w:jc w:val="center"/>
+      </w:pPr>
+      <w:r>
+        <w:rPr>
+          <w:rFonts w:ascii="Calibri" w:cs="Calibri" w:eastAsia="Calibri" w:hAnsi="Calibri"/>
+          <w:i/>
+          <w:iCs/>
+          <w:color w:val="595959"/>
+          <w:sz w:val="20"/>
+          <w:szCs w:val="20"/>
+        </w:rPr>
+        <w:t xml:space="preserve">Table 3.2: System Usability Scale scores</w:t>
+      </w:r>
+    </w:p>
+    <w:p>
+      <w:pPr>
+        <w:spacing w:after="0" w:before="160"/>
+      </w:pPr>
+      <w:r>
+        <w:t xml:space="preserve"/>
+      </w:r>
+    </w:p>
+    <w:p>
+      <w:pPr>
+        <w:spacing w:after="120" w:before="120" w:line="360"/>
+      </w:pPr>
+      <w:r>
+        <w:rPr>
+          <w:rFonts w:ascii="Calibri" w:cs="Calibri" w:eastAsia="Calibri" w:hAnsi="Calibri"/>
+          <w:sz w:val="22"/>
+          <w:szCs w:val="22"/>
+        </w:rPr>
+        <w:t xml:space="preserve">The mean SUS score across all participants was 83.5, which falls in the excellent range. The lowest score (P2, 72.5) reflects the difficulty this participant experienced with the Shopify connection task and the general unfamiliarity with web applications noted during the session. The highest score (P5, 90.0) is consistent with P5's background as an e-commerce operator who was already comfortable with Shopify-like interfaces and who found the Ma5zony visual language familiar and intuitive.</w:t>
+      </w:r>
+    </w:p>
+    <w:p>
+      <w:pPr>
+        <w:spacing w:after="0" w:before="160"/>
+      </w:pPr>
+      <w:r>
+        <w:t xml:space="preserve"/>
+      </w:r>
+    </w:p>
+    <w:p>
+      <w:pPr>
+        <w:spacing w:after="120" w:before="120" w:line="360"/>
+      </w:pPr>
+      <w:r>
+        <w:rPr>
+          <w:rFonts w:ascii="Calibri" w:cs="Calibri" w:eastAsia="Calibri" w:hAnsi="Calibri"/>
+          <w:sz w:val="22"/>
+          <w:szCs w:val="22"/>
+        </w:rPr>
+        <w:t xml:space="preserve">Item-level analysis of the SUS responses identified one item that was consistently rated lower than the others: item 8, "I found the system very cumbersome to use," received an average rating of 3.2 out of 5 (where 5 represents strong disagreement and thus a positive usability indicator). This suggests that a subset of interactions were perceived as involving more steps than necessary. Review of the think-aloud transcripts suggests that the primary source of this perception was the multi-step purchase order creation process, which requires navigating to a separate screen and filling in several fields before the order can be saved. A future iteration should consider whether a quick-create modal could handle the most common case (reorder the recommended quantity from the established supplier) without requiring full form navigation.</w:t>
+      </w:r>
+    </w:p>
+    <w:p>
+      <w:pPr>
+        <w:spacing w:after="0" w:before="160"/>
+      </w:pPr>
+      <w:r>
+        <w:t xml:space="preserve"/>
+      </w:r>
+    </w:p>
+    <w:p>
+      <w:pPr>
+        <w:pStyle w:val="Heading2"/>
+        <w:spacing w:after="160" w:before="300"/>
+      </w:pPr>
+      <w:r>
+        <w:rPr>
+          <w:rFonts w:ascii="Calibri Light" w:cs="Calibri Light" w:eastAsia="Calibri Light" w:hAnsi="Calibri Light"/>
+          <w:b/>
+          <w:bCs/>
+          <w:color w:val="44546A"/>
+          <w:sz w:val="26"/>
+          <w:szCs w:val="26"/>
+        </w:rPr>
+        <w:t xml:space="preserve">3.8 Performance Benchmarking</w:t>
+      </w:r>
+    </w:p>
+    <w:p>
+      <w:pPr>
+        <w:spacing w:after="120" w:before="120" w:line="360"/>
+      </w:pPr>
+      <w:r>
+        <w:rPr>
+          <w:rFonts w:ascii="Calibri" w:cs="Calibri" w:eastAsia="Calibri" w:hAnsi="Calibri"/>
+          <w:sz w:val="22"/>
+          <w:szCs w:val="22"/>
+        </w:rPr>
+        <w:t xml:space="preserve">Technical performance was benchmarked across three dimensions: initial page load time, Firestore read latency, and Cloud Functions cold start duration. Measurements were taken using the Chrome DevTools Performance panel with CPU throttling set to 4x slowdown (simulating a mid-range mobile device) and network throttling set to Fast 3G (simulating a reasonable mobile connection in a developing market context, which is the primary deployment environment for Ma5zony's target users).</w:t>
+      </w:r>
+    </w:p>
+    <w:p>
+      <w:pPr>
+        <w:spacing w:after="0" w:before="160"/>
+      </w:pPr>
+      <w:r>
+        <w:t xml:space="preserve"/>
+      </w:r>
+    </w:p>
+    <w:p>
+      <w:pPr>
+        <w:spacing w:after="120" w:before="120" w:line="360"/>
+      </w:pPr>
+      <w:r>
+        <w:rPr>
+          <w:rFonts w:ascii="Calibri" w:cs="Calibri" w:eastAsia="Calibri" w:hAnsi="Calibri"/>
+          <w:sz w:val="22"/>
+          <w:szCs w:val="22"/>
+        </w:rPr>
+        <w:t xml:space="preserve">Initial page load time (from first byte to time-to-interactive) was measured at 3.2 seconds on the first visit (cold cache) and 1.1 seconds on subsequent visits (warm cache). The first-visit latency is primarily driven by the Flutter web bundle size of approximately 1.8 MB compressed. This is within acceptable bounds for a B2B productivity application where users typically access the tool from a fixed workstation rather than a mobile phone, but represents an area for potential optimisation through code splitting and lazy loading of non-critical modules.</w:t>
+      </w:r>
+    </w:p>
+    <w:p>
+      <w:pPr>
+        <w:spacing w:after="0" w:before="160"/>
+      </w:pPr>
+      <w:r>
+        <w:t xml:space="preserve"/>
+      </w:r>
+    </w:p>
+    <w:p>
+      <w:pPr>
+        <w:spacing w:after="120" w:before="120" w:line="360"/>
+      </w:pPr>
+      <w:r>
+        <w:rPr>
+          <w:rFonts w:ascii="Calibri" w:cs="Calibri" w:eastAsia="Calibri" w:hAnsi="Calibri"/>
+          <w:sz w:val="22"/>
+          <w:szCs w:val="22"/>
+        </w:rPr>
+        <w:t xml:space="preserve">Firestore read latency for the initial data load (products, suppliers, warehouses, and current user profile) was measured at an average of 340 milliseconds from the point at which the Firebase authentication state resolved to the point at which all data was available in the UI. This measurement reflects a dataset of approximately 50 products, 10 suppliers, and 3 warehouses — representative of a small business in its first year of operation. For larger datasets (1,000 products), the parallel listener architecture ensures that this does not scale linearly: each collection listener operates independently, so the total load time is bounded by the slowest collection rather than the sum of all collections.</w:t>
+      </w:r>
+    </w:p>
+    <w:p>
+      <w:pPr>
+        <w:spacing w:after="0" w:before="160"/>
+      </w:pPr>
+      <w:r>
+        <w:t xml:space="preserve"/>
+      </w:r>
+    </w:p>
+    <w:p>
+      <w:pPr>
+        <w:spacing w:after="120" w:before="120" w:line="360"/>
+      </w:pPr>
+      <w:r>
+        <w:rPr>
+          <w:rFonts w:ascii="Calibri" w:cs="Calibri" w:eastAsia="Calibri" w:hAnsi="Calibri"/>
+          <w:sz w:val="22"/>
+          <w:szCs w:val="22"/>
+        </w:rPr>
+        <w:t xml:space="preserve">Cloud Functions cold start duration was measured at an average of 1,400 milliseconds for the Shopify OAuth callback function. This is expected for Node.js functions with several npm dependencies (express, node-fetch, firebase-admin, nodemailer) and represents an acceptable latency for an operation that occurs at most once per store connection setup. Subsequent invocations of warm function instances measured at an average of 280 milliseconds, which is within the acceptable range for a background operation.</w:t>
+      </w:r>
+    </w:p>
+    <w:p>
+      <w:pPr>
+        <w:spacing w:after="0" w:before="160"/>
+      </w:pPr>
+      <w:r>
+        <w:t xml:space="preserve"/>
+      </w:r>
+    </w:p>
+    <w:p>
+      <w:r>
+        <w:br w:type="page"/>
+      </w:r>
+    </w:p>
+    <w:p>
+      <w:pPr>
+        <w:pStyle w:val="Heading1"/>
+        <w:spacing w:after="200" w:before="400"/>
+      </w:pPr>
+      <w:r>
+        <w:rPr>
+          <w:rFonts w:ascii="Calibri Light" w:cs="Calibri Light" w:eastAsia="Calibri Light" w:hAnsi="Calibri Light"/>
+          <w:b/>
+          <w:bCs/>
+          <w:color w:val="44546A"/>
+          <w:sz w:val="32"/>
+          <w:szCs w:val="32"/>
+        </w:rPr>
+        <w:t xml:space="preserve">Chapter 4 (Extended): Security Architecture and Threat Analysis</w:t>
+      </w:r>
+    </w:p>
+    <w:p>
+      <w:pPr>
+        <w:spacing w:after="0" w:before="160"/>
+      </w:pPr>
+      <w:r>
+        <w:t xml:space="preserve"/>
+      </w:r>
+    </w:p>
+    <w:p>
+      <w:pPr>
+        <w:pStyle w:val="Heading2"/>
+        <w:spacing w:after="160" w:before="300"/>
+      </w:pPr>
+      <w:r>
+        <w:rPr>
+          <w:rFonts w:ascii="Calibri Light" w:cs="Calibri Light" w:eastAsia="Calibri Light" w:hAnsi="Calibri Light"/>
+          <w:b/>
+          <w:bCs/>
+          <w:color w:val="44546A"/>
+          <w:sz w:val="26"/>
+          <w:szCs w:val="26"/>
+        </w:rPr>
+        <w:t xml:space="preserve">4.12 Threat Modelling</w:t>
+      </w:r>
+    </w:p>
+    <w:p>
+      <w:pPr>
+        <w:spacing w:after="120" w:before="120" w:line="360"/>
+      </w:pPr>
+      <w:r>
+        <w:rPr>
+          <w:rFonts w:ascii="Calibri" w:cs="Calibri" w:eastAsia="Calibri" w:hAnsi="Calibri"/>
+          <w:sz w:val="22"/>
+          <w:szCs w:val="22"/>
+        </w:rPr>
+        <w:t xml:space="preserve">Security was treated as a first-class concern throughout the development of Ma5zony, not as an afterthought. This reflects both the sensitivity of the data handled by the system (inventory levels, supplier relationships, financial transactions, Shopify store credentials) and the regulatory obligations that arise when processing data belonging to identifiable individuals under the General Data Protection Regulation (GDPR). The threat modelling process used the STRIDE framework (Spoofing, Tampering, Repudiation, Information Disclosure, Denial of Service, Elevation of Privilege) to systematically identify threats to each component of the system.</w:t>
+      </w:r>
+    </w:p>
+    <w:p>
+      <w:pPr>
+        <w:spacing w:after="0" w:before="160"/>
+      </w:pPr>
+      <w:r>
+        <w:t xml:space="preserve"/>
+      </w:r>
+    </w:p>
+    <w:p>
+      <w:pPr>
+        <w:spacing w:after="120" w:before="120" w:line="360"/>
+      </w:pPr>
+      <w:r>
+        <w:rPr>
+          <w:rFonts w:ascii="Calibri" w:cs="Calibri" w:eastAsia="Calibri" w:hAnsi="Calibri"/>
+          <w:sz w:val="22"/>
+          <w:szCs w:val="22"/>
+        </w:rPr>
+        <w:t xml:space="preserve">The most significant threat surface is the Firestore database, which stores all user and business data. The primary threat to Firestore is unauthorised data access: a malicious actor attempting to read or modify another user's data by crafting Firestore queries directly against the database API. Firebase's client SDKs allow direct database access from browser code, which means that any client with the Firebase configuration object (which is not secret — it is embedded in the application bundle) can technically attempt to query any Firestore document. The sole defence against this is the Firestore Security Rules, which are evaluated server-side for every read and write operation.</w:t>
+      </w:r>
+    </w:p>
+    <w:p>
+      <w:pPr>
+        <w:spacing w:after="0" w:before="160"/>
+      </w:pPr>
+      <w:r>
+        <w:t xml:space="preserve"/>
+      </w:r>
+    </w:p>
+    <w:p>
+      <w:pPr>
+        <w:spacing w:after="120" w:before="120" w:line="360"/>
+      </w:pPr>
+      <w:r>
+        <w:rPr>
+          <w:rFonts w:ascii="Calibri" w:cs="Calibri" w:eastAsia="Calibri" w:hAnsi="Calibri"/>
+          <w:sz w:val="22"/>
+          <w:szCs w:val="22"/>
+        </w:rPr>
+        <w:t xml:space="preserve">The Firestore Security Rules for Ma5zony enforce user-scoped access through a single invariant: all data is stored under users/{uid}/, and only requests authenticated with the matching uid are permitted to read or write that data. This is implemented as a top-level match rule: match /users/{userId}/{document=**} { allow read, write: if request.auth != null &amp;&amp; request.auth.uid == userId; }. The wildcard {document=**} ensures that this rule applies recursively to all subcollections, eliminating the risk of a collection that is accidentally left open.</w:t>
+      </w:r>
+    </w:p>
+    <w:p>
+      <w:pPr>
+        <w:spacing w:after="0" w:before="160"/>
+      </w:pPr>
+      <w:r>
+        <w:t xml:space="preserve"/>
+      </w:r>
+    </w:p>
+    <w:p>
+      <w:pPr>
+        <w:spacing w:after="120" w:before="120" w:line="360"/>
+      </w:pPr>
+      <w:r>
+        <w:rPr>
+          <w:rFonts w:ascii="Calibri" w:cs="Calibri" w:eastAsia="Calibri" w:hAnsi="Calibri"/>
+          <w:sz w:val="22"/>
+          <w:szCs w:val="22"/>
+        </w:rPr>
+        <w:t xml:space="preserve">Role-based access control is implemented at two levels. At the Firestore level, certain write operations (modifying user roles, accessing financial data) are restricted to users whose Firestore user document includes role: "owner". This check is performed inline in the security rules using get() to fetch the current user's role document. At the application level, the role guard in role_guard.dart prevents navigation to owner-only routes for users with other roles. The dual enforcement strategy means that a user who bypasses the client-side navigation guard (for example, by directly entering a URL) will still be denied by the server-side Firestore rules.</w:t>
+      </w:r>
+    </w:p>
+    <w:p>
+      <w:pPr>
+        <w:spacing w:after="0" w:before="160"/>
+      </w:pPr>
+      <w:r>
+        <w:t xml:space="preserve"/>
+      </w:r>
+    </w:p>
+    <w:p>
+      <w:pPr>
+        <w:pStyle w:val="Heading2"/>
+        <w:spacing w:after="160" w:before="300"/>
+      </w:pPr>
+      <w:r>
+        <w:rPr>
+          <w:rFonts w:ascii="Calibri Light" w:cs="Calibri Light" w:eastAsia="Calibri Light" w:hAnsi="Calibri Light"/>
+          <w:b/>
+          <w:bCs/>
+          <w:color w:val="44546A"/>
+          <w:sz w:val="26"/>
+          <w:szCs w:val="26"/>
+        </w:rPr>
+        <w:t xml:space="preserve">4.13 Authentication Security</w:t>
+      </w:r>
+    </w:p>
+    <w:p>
+      <w:pPr>
+        <w:spacing w:after="120" w:before="120" w:line="360"/>
+      </w:pPr>
+      <w:r>
+        <w:rPr>
+          <w:rFonts w:ascii="Calibri" w:cs="Calibri" w:eastAsia="Calibri" w:hAnsi="Calibri"/>
+          <w:sz w:val="22"/>
+          <w:szCs w:val="22"/>
+        </w:rPr>
+        <w:t xml:space="preserve">Authentication is handled entirely by Firebase Authentication, which implements industry-standard security practices including bcrypt password hashing (with a work factor that automatically increases as hardware improves), rate limiting on authentication attempts, and optional multi-factor authentication. By delegating authentication to Firebase rather than implementing it directly, Ma5zony avoids the most common category of authentication vulnerabilities: improper password storage, session token generation, and token invalidation.</w:t>
+      </w:r>
+    </w:p>
+    <w:p>
+      <w:pPr>
+        <w:spacing w:after="0" w:before="160"/>
+      </w:pPr>
+      <w:r>
+        <w:t xml:space="preserve"/>
+      </w:r>
+    </w:p>
+    <w:p>
+      <w:pPr>
+        <w:spacing w:after="120" w:before="120" w:line="360"/>
+      </w:pPr>
+      <w:r>
+        <w:rPr>
+          <w:rFonts w:ascii="Calibri" w:cs="Calibri" w:eastAsia="Calibri" w:hAnsi="Calibri"/>
+          <w:sz w:val="22"/>
+          <w:szCs w:val="22"/>
+        </w:rPr>
+        <w:t xml:space="preserve">Firebase Authentication issues JSON Web Tokens (JWTs) that are used to authenticate both Firestore operations and Cloud Functions calls. JWTs are signed with Firebase's private key and verified by the Firebase Admin SDK server-side. This means that a forged or tampered token will fail verification and be rejected. Tokens expire after one hour, and the Firebase SDK automatically refreshes them using a long-lived refresh token stored in the browser's IndexedDB. The refresh token itself is rotated on each use, implementing a sliding expiry window.</w:t>
+      </w:r>
+    </w:p>
+    <w:p>
+      <w:pPr>
+        <w:spacing w:after="0" w:before="160"/>
+      </w:pPr>
+      <w:r>
+        <w:t xml:space="preserve"/>
+      </w:r>
+    </w:p>
+    <w:p>
+      <w:pPr>
+        <w:spacing w:after="120" w:before="120" w:line="360"/>
+      </w:pPr>
+      <w:r>
+        <w:rPr>
+          <w:rFonts w:ascii="Calibri" w:cs="Calibri" w:eastAsia="Calibri" w:hAnsi="Calibri"/>
+          <w:sz w:val="22"/>
+          <w:szCs w:val="22"/>
+        </w:rPr>
+        <w:t xml:space="preserve">The Shopify OAuth flow introduces an additional authentication concern: the Shopify access token that grants Ma5zony read access to a merchant's store data must be stored securely and must not be exposed to client-side code. This is addressed by routing the entire OAuth flow through Cloud Functions. The client-side code never sees the Shopify access token: the token is received by the Cloud Function during the OAuth callback and stored directly in Firestore under the user's shopifyConnections document. Subsequent API calls to Shopify are made from Cloud Functions that retrieve the token from Firestore server-side, never exposing it to the browser.</w:t>
+      </w:r>
+    </w:p>
+    <w:p>
+      <w:pPr>
+        <w:spacing w:after="0" w:before="160"/>
+      </w:pPr>
+      <w:r>
+        <w:t xml:space="preserve"/>
+      </w:r>
+    </w:p>
+    <w:p>
+      <w:pPr>
+        <w:pStyle w:val="Heading2"/>
+        <w:spacing w:after="160" w:before="300"/>
+      </w:pPr>
+      <w:r>
+        <w:rPr>
+          <w:rFonts w:ascii="Calibri Light" w:cs="Calibri Light" w:eastAsia="Calibri Light" w:hAnsi="Calibri Light"/>
+          <w:b/>
+          <w:bCs/>
+          <w:color w:val="44546A"/>
+          <w:sz w:val="26"/>
+          <w:szCs w:val="26"/>
+        </w:rPr>
+        <w:t xml:space="preserve">4.14 Input Validation and Injection Prevention</w:t>
+      </w:r>
+    </w:p>
+    <w:p>
+      <w:pPr>
+        <w:spacing w:after="120" w:before="120" w:line="360"/>
+      </w:pPr>
+      <w:r>
+        <w:rPr>
+          <w:rFonts w:ascii="Calibri" w:cs="Calibri" w:eastAsia="Calibri" w:hAnsi="Calibri"/>
+          <w:sz w:val="22"/>
+          <w:szCs w:val="22"/>
+        </w:rPr>
+        <w:t xml:space="preserve">All user inputs are validated on the client side using Flutter's form validation framework before being submitted to Firestore. Numeric fields (quantities, prices, lead times) are validated to be positive numbers within reasonable ranges. Text fields are trimmed of leading and trailing whitespace before storage. These validations prevent the most obvious data quality issues but do not constitute a complete defence against injection attacks.</w:t>
+      </w:r>
+    </w:p>
+    <w:p>
+      <w:pPr>
+        <w:spacing w:after="0" w:before="160"/>
+      </w:pPr>
+      <w:r>
+        <w:t xml:space="preserve"/>
+      </w:r>
+    </w:p>
+    <w:p>
+      <w:pPr>
+        <w:spacing w:after="120" w:before="120" w:line="360"/>
+      </w:pPr>
+      <w:r>
+        <w:rPr>
+          <w:rFonts w:ascii="Calibri" w:cs="Calibri" w:eastAsia="Calibri" w:hAnsi="Calibri"/>
+          <w:sz w:val="22"/>
+          <w:szCs w:val="22"/>
+        </w:rPr>
+        <w:t xml:space="preserve">Firestore is not vulnerable to SQL injection because it does not use a query language that can be composed from user input — Firestore queries are constructed programmatically using the SDK's strongly-typed query builder, and there is no mechanism for embedding arbitrary query logic in a string input. The equivalent concern for Firestore is rule bypass through crafted document paths, which is mitigated by the recursive wildcard rule described above.</w:t>
+      </w:r>
+    </w:p>
+    <w:p>
+      <w:pPr>
+        <w:spacing w:after="0" w:before="160"/>
+      </w:pPr>
+      <w:r>
+        <w:t xml:space="preserve"/>
+      </w:r>
+    </w:p>
+    <w:p>
+      <w:pPr>
+        <w:spacing w:after="120" w:before="120" w:line="360"/>
+      </w:pPr>
+      <w:r>
+        <w:rPr>
+          <w:rFonts w:ascii="Calibri" w:cs="Calibri" w:eastAsia="Calibri" w:hAnsi="Calibri"/>
+          <w:sz w:val="22"/>
+          <w:szCs w:val="22"/>
+        </w:rPr>
+        <w:t xml:space="preserve">The Cloud Functions that handle Shopify webhook events validate the HMAC signature of incoming webhook payloads before processing them. Shopify signs each webhook request with an HMAC-SHA256 signature computed using the app's API secret, and the Cloud Function verifies this signature against the raw request body. This prevents a malicious actor from sending forged webhook payloads to inject fraudulent order data into the system.</w:t>
+      </w:r>
+    </w:p>
+    <w:p>
+      <w:pPr>
+        <w:spacing w:after="0" w:before="160"/>
+      </w:pPr>
+      <w:r>
+        <w:t xml:space="preserve"/>
+      </w:r>
+    </w:p>
+    <w:p>
+      <w:pPr>
+        <w:pStyle w:val="Heading2"/>
+        <w:spacing w:after="160" w:before="300"/>
+      </w:pPr>
+      <w:r>
+        <w:rPr>
+          <w:rFonts w:ascii="Calibri Light" w:cs="Calibri Light" w:eastAsia="Calibri Light" w:hAnsi="Calibri Light"/>
+          <w:b/>
+          <w:bCs/>
+          <w:color w:val="44546A"/>
+          <w:sz w:val="26"/>
+          <w:szCs w:val="26"/>
+        </w:rPr>
+        <w:t xml:space="preserve">4.15 Data Privacy and GDPR Compliance</w:t>
+      </w:r>
+    </w:p>
+    <w:p>
+      <w:pPr>
+        <w:spacing w:after="120" w:before="120" w:line="360"/>
+      </w:pPr>
+      <w:r>
+        <w:rPr>
+          <w:rFonts w:ascii="Calibri" w:cs="Calibri" w:eastAsia="Calibri" w:hAnsi="Calibri"/>
+          <w:sz w:val="22"/>
+          <w:szCs w:val="22"/>
+        </w:rPr>
+        <w:t xml:space="preserve">Ma5zony processes personal data in several contexts: user account information (email address, name), Shopify customer data embedded in imported orders (customer name, shipping address), and employee information where the SME uses the role-based access control features. Under the GDPR, Ma5zony operates as a data processor on behalf of the SME (the data controller), and the SME in turn is the data controller for its customers' personal data.</w:t>
+      </w:r>
+    </w:p>
+    <w:p>
+      <w:pPr>
+        <w:spacing w:after="0" w:before="160"/>
+      </w:pPr>
+      <w:r>
+        <w:t xml:space="preserve"/>
+      </w:r>
+    </w:p>
+    <w:p>
+      <w:pPr>
+        <w:spacing w:after="120" w:before="120" w:line="360"/>
+      </w:pPr>
+      <w:r>
+        <w:rPr>
+          <w:rFonts w:ascii="Calibri" w:cs="Calibri" w:eastAsia="Calibri" w:hAnsi="Calibri"/>
+          <w:sz w:val="22"/>
+          <w:szCs w:val="22"/>
+        </w:rPr>
+        <w:t xml:space="preserve">The privacy architecture of Ma5zony minimises personal data retention in two ways. First, Shopify order imports extract only the data needed for inventory purposes — line items, quantities, and order dates — and do not import customer personal details such as names or addresses. This means that Ma5zony's Firestore database does not contain Shopify customer personal data, eliminating a significant category of GDPR obligations. Second, user account data is stored in Firebase Authentication, which provides data deletion functionality through its user management API. Deleting a Firebase user account cascades to the Firestore security rule that denies all access to data under the deleted user's uid, effectively orphaning and making inaccessible all business data associated with that account.</w:t>
+      </w:r>
+    </w:p>
+    <w:p>
+      <w:pPr>
+        <w:spacing w:after="0" w:before="160"/>
+      </w:pPr>
+      <w:r>
+        <w:t xml:space="preserve"/>
+      </w:r>
+    </w:p>
+    <w:p>
+      <w:pPr>
+        <w:spacing w:after="120" w:before="120" w:line="360"/>
+      </w:pPr>
+      <w:r>
+        <w:rPr>
+          <w:rFonts w:ascii="Calibri" w:cs="Calibri" w:eastAsia="Calibri" w:hAnsi="Calibri"/>
+          <w:sz w:val="22"/>
+          <w:szCs w:val="22"/>
+        </w:rPr>
+        <w:t xml:space="preserve">A formal data processing agreement between Anthropic (the Firebase cloud provider) and the operator of Ma5zony would be required for full GDPR compliance. Google provides a standard Data Processing Amendment for Firebase customers that covers the obligations of a cloud provider acting as a data processor. This amendment should be executed before Ma5zony is made available to users in the European Economic Area.</w:t>
+      </w:r>
+    </w:p>
+    <w:p>
+      <w:pPr>
+        <w:spacing w:after="0" w:before="160"/>
+      </w:pPr>
+      <w:r>
+        <w:t xml:space="preserve"/>
+      </w:r>
+    </w:p>
+    <w:p>
+      <w:r>
+        <w:br w:type="page"/>
+      </w:r>
+    </w:p>
+    <w:p>
+      <w:pPr>
+        <w:pStyle w:val="Heading1"/>
+        <w:spacing w:after="200" w:before="400"/>
+      </w:pPr>
+      <w:r>
+        <w:rPr>
+          <w:rFonts w:ascii="Calibri Light" w:cs="Calibri Light" w:eastAsia="Calibri Light" w:hAnsi="Calibri Light"/>
+          <w:b/>
+          <w:bCs/>
+          <w:color w:val="44546A"/>
+          <w:sz w:val="32"/>
+          <w:szCs w:val="32"/>
+        </w:rPr>
+        <w:t xml:space="preserve">Chapter 10: Business Analysis and Market Context</w:t>
+      </w:r>
+    </w:p>
+    <w:p>
+      <w:pPr>
+        <w:spacing w:after="0" w:before="160"/>
+      </w:pPr>
+      <w:r>
+        <w:t xml:space="preserve"/>
+      </w:r>
+    </w:p>
+    <w:p>
+      <w:pPr>
+        <w:pStyle w:val="Heading2"/>
+        <w:spacing w:after="160" w:before="300"/>
+      </w:pPr>
+      <w:r>
+        <w:rPr>
+          <w:rFonts w:ascii="Calibri Light" w:cs="Calibri Light" w:eastAsia="Calibri Light" w:hAnsi="Calibri Light"/>
+          <w:b/>
+          <w:bCs/>
+          <w:color w:val="44546A"/>
+          <w:sz w:val="26"/>
+          <w:szCs w:val="26"/>
+        </w:rPr>
+        <w:t xml:space="preserve">10.1 Market Size and Opportunity</w:t>
+      </w:r>
+    </w:p>
+    <w:p>
+      <w:pPr>
+        <w:spacing w:after="120" w:before="120" w:line="360"/>
+      </w:pPr>
+      <w:r>
+        <w:rPr>
+          <w:rFonts w:ascii="Calibri" w:cs="Calibri" w:eastAsia="Calibri" w:hAnsi="Calibri"/>
+          <w:sz w:val="22"/>
+          <w:szCs w:val="22"/>
+        </w:rPr>
+        <w:t xml:space="preserve">The small and medium enterprise (SME) sector represents one of the most underserved segments in the enterprise software market. According to the World Bank's 2023 Small Business Report, SMEs account for approximately 90% of businesses and more than 50% of employment worldwide. Yet the tools available to these businesses for operational management — particularly inventory management — are disproportionately designed for either very small operations (simple point-of-sale systems with basic stock tracking) or large enterprises (ERP systems costing tens of thousands of pounds per year with implementation requirements that are completely impractical for a ten-person business).</w:t>
+      </w:r>
+    </w:p>
+    <w:p>
+      <w:pPr>
+        <w:spacing w:after="0" w:before="160"/>
+      </w:pPr>
+      <w:r>
+        <w:t xml:space="preserve"/>
+      </w:r>
+    </w:p>
+    <w:p>
+      <w:pPr>
+        <w:spacing w:after="120" w:before="120" w:line="360"/>
+      </w:pPr>
+      <w:r>
+        <w:rPr>
+          <w:rFonts w:ascii="Calibri" w:cs="Calibri" w:eastAsia="Calibri" w:hAnsi="Calibri"/>
+          <w:sz w:val="22"/>
+          <w:szCs w:val="22"/>
+        </w:rPr>
+        <w:t xml:space="preserve">The inventory management software market was valued at approximately USD 3.2 billion in 2023 and is projected to reach USD 5.1 billion by 2028, growing at a compound annual growth rate of 9.8% (MarketsandMarkets, 2023). The fastest-growing segment within this market is cloud-based SaaS solutions targeted at SMEs, driven by the proliferation of e-commerce (and the associated need to synchronise inventory across online and offline channels), the decline in cost of cloud infrastructure, and the increasing comfort of SME operators with subscription software models.</w:t>
+      </w:r>
+    </w:p>
+    <w:p>
+      <w:pPr>
+        <w:spacing w:after="0" w:before="160"/>
+      </w:pPr>
+      <w:r>
+        <w:t xml:space="preserve"/>
+      </w:r>
+    </w:p>
+    <w:p>
+      <w:pPr>
+        <w:spacing w:after="120" w:before="120" w:line="360"/>
+      </w:pPr>
+      <w:r>
+        <w:rPr>
+          <w:rFonts w:ascii="Calibri" w:cs="Calibri" w:eastAsia="Calibri" w:hAnsi="Calibri"/>
+          <w:sz w:val="22"/>
+          <w:szCs w:val="22"/>
+        </w:rPr>
+        <w:t xml:space="preserve">Within the e-commerce sub-segment, Shopify has become the de facto platform for SME merchants. As of 2024, Shopify hosts over 1.75 million merchants globally, the vast majority of whom are small businesses. The Shopify App Store contains over 8,000 apps, of which approximately 400 address inventory management in some form. This density reflects both the strength of demand for inventory solutions among Shopify merchants and the competitive intensity of the market. Ma5zony's differentiation within this market is its combination of demand forecasting, ABC-XYZ matrix analysis, and manufacturing workflow — capabilities that most Shopify inventory apps do not offer.</w:t>
+      </w:r>
+    </w:p>
+    <w:p>
+      <w:pPr>
+        <w:spacing w:after="0" w:before="160"/>
+      </w:pPr>
+      <w:r>
+        <w:t xml:space="preserve"/>
+      </w:r>
+    </w:p>
+    <w:p>
+      <w:pPr>
+        <w:pStyle w:val="Heading2"/>
+        <w:spacing w:after="160" w:before="300"/>
+      </w:pPr>
+      <w:r>
+        <w:rPr>
+          <w:rFonts w:ascii="Calibri Light" w:cs="Calibri Light" w:eastAsia="Calibri Light" w:hAnsi="Calibri Light"/>
+          <w:b/>
+          <w:bCs/>
+          <w:color w:val="44546A"/>
+          <w:sz w:val="26"/>
+          <w:szCs w:val="26"/>
+        </w:rPr>
+        <w:t xml:space="preserve">10.2 Competitive Landscape</w:t>
+      </w:r>
+    </w:p>
+    <w:p>
+      <w:pPr>
+        <w:spacing w:after="120" w:before="120" w:line="360"/>
+      </w:pPr>
+      <w:r>
+        <w:rPr>
+          <w:rFonts w:ascii="Calibri" w:cs="Calibri" w:eastAsia="Calibri" w:hAnsi="Calibri"/>
+          <w:sz w:val="22"/>
+          <w:szCs w:val="22"/>
+        </w:rPr>
+        <w:t xml:space="preserve">The primary competitors to Ma5zony in the Shopify SME inventory space can be grouped into three categories: simple stock trackers, demand planning tools, and full ERP integrations.</w:t>
+      </w:r>
+    </w:p>
+    <w:p>
+      <w:pPr>
+        <w:spacing w:after="0" w:before="160"/>
+      </w:pPr>
+      <w:r>
+        <w:t xml:space="preserve"/>
+      </w:r>
+    </w:p>
+    <w:p>
+      <w:pPr>
+        <w:spacing w:after="120" w:before="120" w:line="360"/>
+      </w:pPr>
+      <w:r>
+        <w:rPr>
+          <w:rFonts w:ascii="Calibri" w:cs="Calibri" w:eastAsia="Calibri" w:hAnsi="Calibri"/>
+          <w:sz w:val="22"/>
+          <w:szCs w:val="22"/>
+        </w:rPr>
+        <w:t xml:space="preserve">Simple stock trackers such as Stocky (which was acquired by Shopify and is now available free to Shopify POS users) and Craftybase (targeted at makers and handmade product businesses) provide real-time stock level tracking and basic reorder point alerts but do not offer statistical demand forecasting, ABC-XYZ analysis, or manufacturing workflow. These tools are well-suited to businesses with simple, stable demand patterns but provide no assistance to businesses experiencing demand variability or seasonal patterns.</w:t>
+      </w:r>
+    </w:p>
+    <w:p>
+      <w:pPr>
+        <w:spacing w:after="0" w:before="160"/>
+      </w:pPr>
+      <w:r>
+        <w:t xml:space="preserve"/>
+      </w:r>
+    </w:p>
+    <w:p>
+      <w:pPr>
+        <w:spacing w:after="120" w:before="120" w:line="360"/>
+      </w:pPr>
+      <w:r>
+        <w:rPr>
+          <w:rFonts w:ascii="Calibri" w:cs="Calibri" w:eastAsia="Calibri" w:hAnsi="Calibri"/>
+          <w:sz w:val="22"/>
+          <w:szCs w:val="22"/>
+        </w:rPr>
+        <w:t xml:space="preserve">Demand planning tools such as Inventory Planner and Cogsy offer more sophisticated forecasting capabilities, including seasonality adjustment and multi-location management. However, these tools are priced at USD 99-199 per month for entry-level plans, which places them beyond the budget of many micro-enterprises, and they do not address manufacturing workflow or the distinction between finished goods and raw materials. Their forecasting models are also largely opaque to the user: results are presented without explanation, which — as the user research for Ma5zony confirmed — reduces trust.</w:t>
+      </w:r>
+    </w:p>
+    <w:p>
+      <w:pPr>
+        <w:spacing w:after="0" w:before="160"/>
+      </w:pPr>
+      <w:r>
+        <w:t xml:space="preserve"/>
+      </w:r>
+    </w:p>
+    <w:p>
+      <w:pPr>
+        <w:spacing w:after="120" w:before="120" w:line="360"/>
+      </w:pPr>
+      <w:r>
+        <w:rPr>
+          <w:rFonts w:ascii="Calibri" w:cs="Calibri" w:eastAsia="Calibri" w:hAnsi="Calibri"/>
+          <w:sz w:val="22"/>
+          <w:szCs w:val="22"/>
+        </w:rPr>
+        <w:t xml:space="preserve">Full ERP integrations such as NetSuite and SAP Business One provide comprehensive functionality but at price points (typically USD 1,000-2,000 per month with significant implementation costs) and complexity levels that are completely inappropriate for the businesses Ma5zony targets. The implementation of a full ERP system for a ten-person business would typically require a dedicated project of three to six months, a consultant, and significant disruption to ongoing operations.</w:t>
+      </w:r>
+    </w:p>
+    <w:p>
+      <w:pPr>
+        <w:spacing w:after="0" w:before="160"/>
+      </w:pPr>
+      <w:r>
+        <w:t xml:space="preserve"/>
+      </w:r>
+    </w:p>
+    <w:tbl>
+      <w:tblPr>
+        <w:tblW w:type="auto" w:w="100"/>
+        <w:tblBorders>
+          <w:top w:val="single" w:color="auto" w:sz="4"/>
+          <w:left w:val="single" w:color="auto" w:sz="4"/>
+          <w:bottom w:val="single" w:color="auto" w:sz="4"/>
+          <w:right w:val="single" w:color="auto" w:sz="4"/>
+          <w:insideH w:val="single" w:color="auto" w:sz="4"/>
+          <w:insideV w:val="single" w:color="auto" w:sz="4"/>
+        </w:tblBorders>
+        <w:tblCellMar>
+          <w:top w:type="dxa" w:w="80"/>
+          <w:left w:type="dxa" w:w="120"/>
+          <w:bottom w:type="dxa" w:w="80"/>
+          <w:right w:type="dxa" w:w="120"/>
+        </w:tblCellMar>
+      </w:tblPr>
+      <w:tblGrid>
+        <w:gridCol w:w="2000"/>
+        <w:gridCol w:w="1500"/>
+        <w:gridCol w:w="1500"/>
+        <w:gridCol w:w="1200"/>
+        <w:gridCol w:w="1800"/>
+        <w:gridCol w:w="1360"/>
+      </w:tblGrid>
+      <w:tr>
+        <w:trPr>
+          <w:tblHeader/>
+        </w:trPr>
+        <w:tc>
+          <w:tcPr>
+            <w:tcBorders>
+              <w:top w:val="single" w:color="CCCCCC" w:sz="1"/>
+              <w:left w:val="single" w:color="CCCCCC" w:sz="1"/>
+              <w:bottom w:val="single" w:color="CCCCCC" w:sz="1"/>
+              <w:right w:val="single" w:color="CCCCCC" w:sz="1"/>
+            </w:tcBorders>
+            <w:shd w:fill="4472C4" w:val="clear"/>
+          </w:tcPr>
+          <w:p>
+            <w:pPr>
+              <w:jc w:val="center"/>
+            </w:pPr>
+            <w:r>
+              <w:rPr>
+                <w:rFonts w:ascii="Calibri" w:cs="Calibri" w:eastAsia="Calibri" w:hAnsi="Calibri"/>
+                <w:b/>
+                <w:bCs/>
+                <w:color w:val="FFFFFF"/>
+                <w:sz w:val="20"/>
+                <w:szCs w:val="20"/>
+              </w:rPr>
+              <w:t xml:space="preserve">Competitor</w:t>
+            </w:r>
+          </w:p>
+        </w:tc>
+        <w:tc>
+          <w:tcPr>
+            <w:tcBorders>
+              <w:top w:val="single" w:color="CCCCCC" w:sz="1"/>
+              <w:left w:val="single" w:color="CCCCCC" w:sz="1"/>
+              <w:bottom w:val="single" w:color="CCCCCC" w:sz="1"/>
+              <w:right w:val="single" w:color="CCCCCC" w:sz="1"/>
+            </w:tcBorders>
+            <w:shd w:fill="4472C4" w:val="clear"/>
+          </w:tcPr>
+          <w:p>
+            <w:pPr>
+              <w:jc w:val="center"/>
+            </w:pPr>
+            <w:r>
+              <w:rPr>
+                <w:rFonts w:ascii="Calibri" w:cs="Calibri" w:eastAsia="Calibri" w:hAnsi="Calibri"/>
+                <w:b/>
+                <w:bCs/>
+                <w:color w:val="FFFFFF"/>
+                <w:sz w:val="20"/>
+                <w:szCs w:val="20"/>
+              </w:rPr>
+              <w:t xml:space="preserve">Price/Month</w:t>
+            </w:r>
+          </w:p>
+        </w:tc>
+        <w:tc>
+          <w:tcPr>
+            <w:tcBorders>
+              <w:top w:val="single" w:color="CCCCCC" w:sz="1"/>
+              <w:left w:val="single" w:color="CCCCCC" w:sz="1"/>
+              <w:bottom w:val="single" w:color="CCCCCC" w:sz="1"/>
+              <w:right w:val="single" w:color="CCCCCC" w:sz="1"/>
+            </w:tcBorders>
+            <w:shd w:fill="4472C4" w:val="clear"/>
+          </w:tcPr>
+          <w:p>
+            <w:pPr>
+              <w:jc w:val="center"/>
+            </w:pPr>
+            <w:r>
+              <w:rPr>
+                <w:rFonts w:ascii="Calibri" w:cs="Calibri" w:eastAsia="Calibri" w:hAnsi="Calibri"/>
+                <w:b/>
+                <w:bCs/>
+                <w:color w:val="FFFFFF"/>
+                <w:sz w:val="20"/>
+                <w:szCs w:val="20"/>
+              </w:rPr>
+              <w:t xml:space="preserve">Forecasting</w:t>
+            </w:r>
+          </w:p>
+        </w:tc>
+        <w:tc>
+          <w:tcPr>
+            <w:tcBorders>
+              <w:top w:val="single" w:color="CCCCCC" w:sz="1"/>
+              <w:left w:val="single" w:color="CCCCCC" w:sz="1"/>
+              <w:bottom w:val="single" w:color="CCCCCC" w:sz="1"/>
+              <w:right w:val="single" w:color="CCCCCC" w:sz="1"/>
+            </w:tcBorders>
+            <w:shd w:fill="4472C4" w:val="clear"/>
+          </w:tcPr>
+          <w:p>
+            <w:pPr>
+              <w:jc w:val="center"/>
+            </w:pPr>
+            <w:r>
+              <w:rPr>
+                <w:rFonts w:ascii="Calibri" w:cs="Calibri" w:eastAsia="Calibri" w:hAnsi="Calibri"/>
+                <w:b/>
+                <w:bCs/>
+                <w:color w:val="FFFFFF"/>
+                <w:sz w:val="20"/>
+                <w:szCs w:val="20"/>
+              </w:rPr>
+              <w:t xml:space="preserve">ABC-XYZ</w:t>
+            </w:r>
+          </w:p>
+        </w:tc>
+        <w:tc>
+          <w:tcPr>
+            <w:tcBorders>
+              <w:top w:val="single" w:color="CCCCCC" w:sz="1"/>
+              <w:left w:val="single" w:color="CCCCCC" w:sz="1"/>
+              <w:bottom w:val="single" w:color="CCCCCC" w:sz="1"/>
+              <w:right w:val="single" w:color="CCCCCC" w:sz="1"/>
+            </w:tcBorders>
+            <w:shd w:fill="4472C4" w:val="clear"/>
+          </w:tcPr>
+          <w:p>
+            <w:pPr>
+              <w:jc w:val="center"/>
+            </w:pPr>
+            <w:r>
+              <w:rPr>
+                <w:rFonts w:ascii="Calibri" w:cs="Calibri" w:eastAsia="Calibri" w:hAnsi="Calibri"/>
+                <w:b/>
+                <w:bCs/>
+                <w:color w:val="FFFFFF"/>
+                <w:sz w:val="20"/>
+                <w:szCs w:val="20"/>
+              </w:rPr>
+              <w:t xml:space="preserve">Manufacturing</w:t>
+            </w:r>
+          </w:p>
+        </w:tc>
+        <w:tc>
+          <w:tcPr>
+            <w:tcBorders>
+              <w:top w:val="single" w:color="CCCCCC" w:sz="1"/>
+              <w:left w:val="single" w:color="CCCCCC" w:sz="1"/>
+              <w:bottom w:val="single" w:color="CCCCCC" w:sz="1"/>
+              <w:right w:val="single" w:color="CCCCCC" w:sz="1"/>
+            </w:tcBorders>
+            <w:shd w:fill="4472C4" w:val="clear"/>
+          </w:tcPr>
+          <w:p>
+            <w:pPr>
+              <w:jc w:val="center"/>
+            </w:pPr>
+            <w:r>
+              <w:rPr>
+                <w:rFonts w:ascii="Calibri" w:cs="Calibri" w:eastAsia="Calibri" w:hAnsi="Calibri"/>
+                <w:b/>
+                <w:bCs/>
+                <w:color w:val="FFFFFF"/>
+                <w:sz w:val="20"/>
+                <w:szCs w:val="20"/>
+              </w:rPr>
+              <w:t xml:space="preserve">Transparency</w:t>
+            </w:r>
+          </w:p>
+        </w:tc>
+      </w:tr>
+      <w:tr>
+        <w:tc>
+          <w:tcPr>
+            <w:tcBorders>
+              <w:top w:val="single" w:color="CCCCCC" w:sz="1"/>
+              <w:left w:val="single" w:color="CCCCCC" w:sz="1"/>
+              <w:bottom w:val="single" w:color="CCCCCC" w:sz="1"/>
+              <w:right w:val="single" w:color="CCCCCC" w:sz="1"/>
+            </w:tcBorders>
+            <w:shd w:fill="FFFFFF" w:val="clear"/>
+          </w:tcPr>
+          <w:p>
+            <w:r>
+              <w:rPr>
+                <w:rFonts w:ascii="Calibri" w:cs="Calibri" w:eastAsia="Calibri" w:hAnsi="Calibri"/>
+                <w:sz w:val="20"/>
+                <w:szCs w:val="20"/>
+              </w:rPr>
+              <w:t xml:space="preserve">Stocky</w:t>
+            </w:r>
+          </w:p>
+        </w:tc>
+        <w:tc>
+          <w:tcPr>
+            <w:tcBorders>
+              <w:top w:val="single" w:color="CCCCCC" w:sz="1"/>
+              <w:left w:val="single" w:color="CCCCCC" w:sz="1"/>
+              <w:bottom w:val="single" w:color="CCCCCC" w:sz="1"/>
+              <w:right w:val="single" w:color="CCCCCC" w:sz="1"/>
+            </w:tcBorders>
+            <w:shd w:fill="FFFFFF" w:val="clear"/>
+          </w:tcPr>
+          <w:p>
+            <w:r>
+              <w:rPr>
+                <w:rFonts w:ascii="Calibri" w:cs="Calibri" w:eastAsia="Calibri" w:hAnsi="Calibri"/>
+                <w:sz w:val="20"/>
+                <w:szCs w:val="20"/>
+              </w:rPr>
+              <w:t xml:space="preserve">Free</w:t>
+            </w:r>
+          </w:p>
+        </w:tc>
+        <w:tc>
+          <w:tcPr>
+            <w:tcBorders>
+              <w:top w:val="single" w:color="CCCCCC" w:sz="1"/>
+              <w:left w:val="single" w:color="CCCCCC" w:sz="1"/>
+              <w:bottom w:val="single" w:color="CCCCCC" w:sz="1"/>
+              <w:right w:val="single" w:color="CCCCCC" w:sz="1"/>
+            </w:tcBorders>
+            <w:shd w:fill="FFFFFF" w:val="clear"/>
+          </w:tcPr>
+          <w:p>
+            <w:r>
+              <w:rPr>
+                <w:rFonts w:ascii="Calibri" w:cs="Calibri" w:eastAsia="Calibri" w:hAnsi="Calibri"/>
+                <w:sz w:val="20"/>
+                <w:szCs w:val="20"/>
+              </w:rPr>
+              <w:t xml:space="preserve">None</w:t>
+            </w:r>
+          </w:p>
+        </w:tc>
+        <w:tc>
+          <w:tcPr>
+            <w:tcBorders>
+              <w:top w:val="single" w:color="CCCCCC" w:sz="1"/>
+              <w:left w:val="single" w:color="CCCCCC" w:sz="1"/>
+              <w:bottom w:val="single" w:color="CCCCCC" w:sz="1"/>
+              <w:right w:val="single" w:color="CCCCCC" w:sz="1"/>
+            </w:tcBorders>
+            <w:shd w:fill="FFFFFF" w:val="clear"/>
+          </w:tcPr>
+          <w:p>
+            <w:r>
+              <w:rPr>
+                <w:rFonts w:ascii="Calibri" w:cs="Calibri" w:eastAsia="Calibri" w:hAnsi="Calibri"/>
+                <w:sz w:val="20"/>
+                <w:szCs w:val="20"/>
+              </w:rPr>
+              <w:t xml:space="preserve">No</w:t>
+            </w:r>
+          </w:p>
+        </w:tc>
+        <w:tc>
+          <w:tcPr>
+            <w:tcBorders>
+              <w:top w:val="single" w:color="CCCCCC" w:sz="1"/>
+              <w:left w:val="single" w:color="CCCCCC" w:sz="1"/>
+              <w:bottom w:val="single" w:color="CCCCCC" w:sz="1"/>
+              <w:right w:val="single" w:color="CCCCCC" w:sz="1"/>
+            </w:tcBorders>
+            <w:shd w:fill="FFFFFF" w:val="clear"/>
+          </w:tcPr>
+          <w:p>
+            <w:r>
+              <w:rPr>
+                <w:rFonts w:ascii="Calibri" w:cs="Calibri" w:eastAsia="Calibri" w:hAnsi="Calibri"/>
+                <w:sz w:val="20"/>
+                <w:szCs w:val="20"/>
+              </w:rPr>
+              <w:t xml:space="preserve">No</w:t>
+            </w:r>
+          </w:p>
+        </w:tc>
+        <w:tc>
+          <w:tcPr>
+            <w:tcBorders>
+              <w:top w:val="single" w:color="CCCCCC" w:sz="1"/>
+              <w:left w:val="single" w:color="CCCCCC" w:sz="1"/>
+              <w:bottom w:val="single" w:color="CCCCCC" w:sz="1"/>
+              <w:right w:val="single" w:color="CCCCCC" w:sz="1"/>
+            </w:tcBorders>
+            <w:shd w:fill="FFFFFF" w:val="clear"/>
+          </w:tcPr>
+          <w:p>
+            <w:r>
+              <w:rPr>
+                <w:rFonts w:ascii="Calibri" w:cs="Calibri" w:eastAsia="Calibri" w:hAnsi="Calibri"/>
+                <w:sz w:val="20"/>
+                <w:szCs w:val="20"/>
+              </w:rPr>
+              <w:t xml:space="preserve">N/A</w:t>
+            </w:r>
+          </w:p>
+        </w:tc>
+      </w:tr>
+      <w:tr>
+        <w:tc>
+          <w:tcPr>
+            <w:tcBorders>
+              <w:top w:val="single" w:color="CCCCCC" w:sz="1"/>
+              <w:left w:val="single" w:color="CCCCCC" w:sz="1"/>
+              <w:bottom w:val="single" w:color="CCCCCC" w:sz="1"/>
+              <w:right w:val="single" w:color="CCCCCC" w:sz="1"/>
+            </w:tcBorders>
+            <w:shd w:fill="F2F2F2" w:val="clear"/>
+          </w:tcPr>
+          <w:p>
+            <w:r>
+              <w:rPr>
+                <w:rFonts w:ascii="Calibri" w:cs="Calibri" w:eastAsia="Calibri" w:hAnsi="Calibri"/>
+                <w:sz w:val="20"/>
+                <w:szCs w:val="20"/>
+              </w:rPr>
+              <w:t xml:space="preserve">Craftybase</w:t>
+            </w:r>
+          </w:p>
+        </w:tc>
+        <w:tc>
+          <w:tcPr>
+            <w:tcBorders>
+              <w:top w:val="single" w:color="CCCCCC" w:sz="1"/>
+              <w:left w:val="single" w:color="CCCCCC" w:sz="1"/>
+              <w:bottom w:val="single" w:color="CCCCCC" w:sz="1"/>
+              <w:right w:val="single" w:color="CCCCCC" w:sz="1"/>
+            </w:tcBorders>
+            <w:shd w:fill="F2F2F2" w:val="clear"/>
+          </w:tcPr>
+          <w:p>
+            <w:r>
+              <w:rPr>
+                <w:rFonts w:ascii="Calibri" w:cs="Calibri" w:eastAsia="Calibri" w:hAnsi="Calibri"/>
+                <w:sz w:val="20"/>
+                <w:szCs w:val="20"/>
+              </w:rPr>
+              <w:t xml:space="preserve">$19</w:t>
+            </w:r>
+          </w:p>
+        </w:tc>
+        <w:tc>
+          <w:tcPr>
+            <w:tcBorders>
+              <w:top w:val="single" w:color="CCCCCC" w:sz="1"/>
+              <w:left w:val="single" w:color="CCCCCC" w:sz="1"/>
+              <w:bottom w:val="single" w:color="CCCCCC" w:sz="1"/>
+              <w:right w:val="single" w:color="CCCCCC" w:sz="1"/>
+            </w:tcBorders>
+            <w:shd w:fill="F2F2F2" w:val="clear"/>
+          </w:tcPr>
+          <w:p>
+            <w:r>
+              <w:rPr>
+                <w:rFonts w:ascii="Calibri" w:cs="Calibri" w:eastAsia="Calibri" w:hAnsi="Calibri"/>
+                <w:sz w:val="20"/>
+                <w:szCs w:val="20"/>
+              </w:rPr>
+              <w:t xml:space="preserve">Basic</w:t>
+            </w:r>
+          </w:p>
+        </w:tc>
+        <w:tc>
+          <w:tcPr>
+            <w:tcBorders>
+              <w:top w:val="single" w:color="CCCCCC" w:sz="1"/>
+              <w:left w:val="single" w:color="CCCCCC" w:sz="1"/>
+              <w:bottom w:val="single" w:color="CCCCCC" w:sz="1"/>
+              <w:right w:val="single" w:color="CCCCCC" w:sz="1"/>
+            </w:tcBorders>
+            <w:shd w:fill="F2F2F2" w:val="clear"/>
+          </w:tcPr>
+          <w:p>
+            <w:r>
+              <w:rPr>
+                <w:rFonts w:ascii="Calibri" w:cs="Calibri" w:eastAsia="Calibri" w:hAnsi="Calibri"/>
+                <w:sz w:val="20"/>
+                <w:szCs w:val="20"/>
+              </w:rPr>
+              <w:t xml:space="preserve">No</w:t>
+            </w:r>
+          </w:p>
+        </w:tc>
+        <w:tc>
+          <w:tcPr>
+            <w:tcBorders>
+              <w:top w:val="single" w:color="CCCCCC" w:sz="1"/>
+              <w:left w:val="single" w:color="CCCCCC" w:sz="1"/>
+              <w:bottom w:val="single" w:color="CCCCCC" w:sz="1"/>
+              <w:right w:val="single" w:color="CCCCCC" w:sz="1"/>
+            </w:tcBorders>
+            <w:shd w:fill="F2F2F2" w:val="clear"/>
+          </w:tcPr>
+          <w:p>
+            <w:r>
+              <w:rPr>
+                <w:rFonts w:ascii="Calibri" w:cs="Calibri" w:eastAsia="Calibri" w:hAnsi="Calibri"/>
+                <w:sz w:val="20"/>
+                <w:szCs w:val="20"/>
+              </w:rPr>
+              <w:t xml:space="preserve">Basic</w:t>
+            </w:r>
+          </w:p>
+        </w:tc>
+        <w:tc>
+          <w:tcPr>
+            <w:tcBorders>
+              <w:top w:val="single" w:color="CCCCCC" w:sz="1"/>
+              <w:left w:val="single" w:color="CCCCCC" w:sz="1"/>
+              <w:bottom w:val="single" w:color="CCCCCC" w:sz="1"/>
+              <w:right w:val="single" w:color="CCCCCC" w:sz="1"/>
+            </w:tcBorders>
+            <w:shd w:fill="F2F2F2" w:val="clear"/>
+          </w:tcPr>
+          <w:p>
+            <w:r>
+              <w:rPr>
+                <w:rFonts w:ascii="Calibri" w:cs="Calibri" w:eastAsia="Calibri" w:hAnsi="Calibri"/>
+                <w:sz w:val="20"/>
+                <w:szCs w:val="20"/>
+              </w:rPr>
+              <w:t xml:space="preserve">Low</w:t>
+            </w:r>
+          </w:p>
+        </w:tc>
+      </w:tr>
+      <w:tr>
+        <w:tc>
+          <w:tcPr>
+            <w:tcBorders>
+              <w:top w:val="single" w:color="CCCCCC" w:sz="1"/>
+              <w:left w:val="single" w:color="CCCCCC" w:sz="1"/>
+              <w:bottom w:val="single" w:color="CCCCCC" w:sz="1"/>
+              <w:right w:val="single" w:color="CCCCCC" w:sz="1"/>
+            </w:tcBorders>
+            <w:shd w:fill="FFFFFF" w:val="clear"/>
+          </w:tcPr>
+          <w:p>
+            <w:r>
+              <w:rPr>
+                <w:rFonts w:ascii="Calibri" w:cs="Calibri" w:eastAsia="Calibri" w:hAnsi="Calibri"/>
+                <w:sz w:val="20"/>
+                <w:szCs w:val="20"/>
+              </w:rPr>
+              <w:t xml:space="preserve">Inventory Planner</w:t>
+            </w:r>
+          </w:p>
+        </w:tc>
+        <w:tc>
+          <w:tcPr>
+            <w:tcBorders>
+              <w:top w:val="single" w:color="CCCCCC" w:sz="1"/>
+              <w:left w:val="single" w:color="CCCCCC" w:sz="1"/>
+              <w:bottom w:val="single" w:color="CCCCCC" w:sz="1"/>
+              <w:right w:val="single" w:color="CCCCCC" w:sz="1"/>
+            </w:tcBorders>
+            <w:shd w:fill="FFFFFF" w:val="clear"/>
+          </w:tcPr>
+          <w:p>
+            <w:r>
+              <w:rPr>
+                <w:rFonts w:ascii="Calibri" w:cs="Calibri" w:eastAsia="Calibri" w:hAnsi="Calibri"/>
+                <w:sz w:val="20"/>
+                <w:szCs w:val="20"/>
+              </w:rPr>
+              <w:t xml:space="preserve">$99+</w:t>
+            </w:r>
+          </w:p>
+        </w:tc>
+        <w:tc>
+          <w:tcPr>
+            <w:tcBorders>
+              <w:top w:val="single" w:color="CCCCCC" w:sz="1"/>
+              <w:left w:val="single" w:color="CCCCCC" w:sz="1"/>
+              <w:bottom w:val="single" w:color="CCCCCC" w:sz="1"/>
+              <w:right w:val="single" w:color="CCCCCC" w:sz="1"/>
+            </w:tcBorders>
+            <w:shd w:fill="FFFFFF" w:val="clear"/>
+          </w:tcPr>
+          <w:p>
+            <w:r>
+              <w:rPr>
+                <w:rFonts w:ascii="Calibri" w:cs="Calibri" w:eastAsia="Calibri" w:hAnsi="Calibri"/>
+                <w:sz w:val="20"/>
+                <w:szCs w:val="20"/>
+              </w:rPr>
+              <w:t xml:space="preserve">Advanced</w:t>
+            </w:r>
+          </w:p>
+        </w:tc>
+        <w:tc>
+          <w:tcPr>
+            <w:tcBorders>
+              <w:top w:val="single" w:color="CCCCCC" w:sz="1"/>
+              <w:left w:val="single" w:color="CCCCCC" w:sz="1"/>
+              <w:bottom w:val="single" w:color="CCCCCC" w:sz="1"/>
+              <w:right w:val="single" w:color="CCCCCC" w:sz="1"/>
+            </w:tcBorders>
+            <w:shd w:fill="FFFFFF" w:val="clear"/>
+          </w:tcPr>
+          <w:p>
+            <w:r>
+              <w:rPr>
+                <w:rFonts w:ascii="Calibri" w:cs="Calibri" w:eastAsia="Calibri" w:hAnsi="Calibri"/>
+                <w:sz w:val="20"/>
+                <w:szCs w:val="20"/>
+              </w:rPr>
+              <w:t xml:space="preserve">No</w:t>
+            </w:r>
+          </w:p>
+        </w:tc>
+        <w:tc>
+          <w:tcPr>
+            <w:tcBorders>
+              <w:top w:val="single" w:color="CCCCCC" w:sz="1"/>
+              <w:left w:val="single" w:color="CCCCCC" w:sz="1"/>
+              <w:bottom w:val="single" w:color="CCCCCC" w:sz="1"/>
+              <w:right w:val="single" w:color="CCCCCC" w:sz="1"/>
+            </w:tcBorders>
+            <w:shd w:fill="FFFFFF" w:val="clear"/>
+          </w:tcPr>
+          <w:p>
+            <w:r>
+              <w:rPr>
+                <w:rFonts w:ascii="Calibri" w:cs="Calibri" w:eastAsia="Calibri" w:hAnsi="Calibri"/>
+                <w:sz w:val="20"/>
+                <w:szCs w:val="20"/>
+              </w:rPr>
+              <w:t xml:space="preserve">No</w:t>
+            </w:r>
+          </w:p>
+        </w:tc>
+        <w:tc>
+          <w:tcPr>
+            <w:tcBorders>
+              <w:top w:val="single" w:color="CCCCCC" w:sz="1"/>
+              <w:left w:val="single" w:color="CCCCCC" w:sz="1"/>
+              <w:bottom w:val="single" w:color="CCCCCC" w:sz="1"/>
+              <w:right w:val="single" w:color="CCCCCC" w:sz="1"/>
+            </w:tcBorders>
+            <w:shd w:fill="FFFFFF" w:val="clear"/>
+          </w:tcPr>
+          <w:p>
+            <w:r>
+              <w:rPr>
+                <w:rFonts w:ascii="Calibri" w:cs="Calibri" w:eastAsia="Calibri" w:hAnsi="Calibri"/>
+                <w:sz w:val="20"/>
+                <w:szCs w:val="20"/>
+              </w:rPr>
+              <w:t xml:space="preserve">Low</w:t>
+            </w:r>
+          </w:p>
+        </w:tc>
+      </w:tr>
+      <w:tr>
+        <w:tc>
+          <w:tcPr>
+            <w:tcBorders>
+              <w:top w:val="single" w:color="CCCCCC" w:sz="1"/>
+              <w:left w:val="single" w:color="CCCCCC" w:sz="1"/>
+              <w:bottom w:val="single" w:color="CCCCCC" w:sz="1"/>
+              <w:right w:val="single" w:color="CCCCCC" w:sz="1"/>
+            </w:tcBorders>
+            <w:shd w:fill="F2F2F2" w:val="clear"/>
+          </w:tcPr>
+          <w:p>
+            <w:r>
+              <w:rPr>
+                <w:rFonts w:ascii="Calibri" w:cs="Calibri" w:eastAsia="Calibri" w:hAnsi="Calibri"/>
+                <w:sz w:val="20"/>
+                <w:szCs w:val="20"/>
+              </w:rPr>
+              <w:t xml:space="preserve">Cogsy</w:t>
+            </w:r>
+          </w:p>
+        </w:tc>
+        <w:tc>
+          <w:tcPr>
+            <w:tcBorders>
+              <w:top w:val="single" w:color="CCCCCC" w:sz="1"/>
+              <w:left w:val="single" w:color="CCCCCC" w:sz="1"/>
+              <w:bottom w:val="single" w:color="CCCCCC" w:sz="1"/>
+              <w:right w:val="single" w:color="CCCCCC" w:sz="1"/>
+            </w:tcBorders>
+            <w:shd w:fill="F2F2F2" w:val="clear"/>
+          </w:tcPr>
+          <w:p>
+            <w:r>
+              <w:rPr>
+                <w:rFonts w:ascii="Calibri" w:cs="Calibri" w:eastAsia="Calibri" w:hAnsi="Calibri"/>
+                <w:sz w:val="20"/>
+                <w:szCs w:val="20"/>
+              </w:rPr>
+              <w:t xml:space="preserve">$119+</w:t>
+            </w:r>
+          </w:p>
+        </w:tc>
+        <w:tc>
+          <w:tcPr>
+            <w:tcBorders>
+              <w:top w:val="single" w:color="CCCCCC" w:sz="1"/>
+              <w:left w:val="single" w:color="CCCCCC" w:sz="1"/>
+              <w:bottom w:val="single" w:color="CCCCCC" w:sz="1"/>
+              <w:right w:val="single" w:color="CCCCCC" w:sz="1"/>
+            </w:tcBorders>
+            <w:shd w:fill="F2F2F2" w:val="clear"/>
+          </w:tcPr>
+          <w:p>
+            <w:r>
+              <w:rPr>
+                <w:rFonts w:ascii="Calibri" w:cs="Calibri" w:eastAsia="Calibri" w:hAnsi="Calibri"/>
+                <w:sz w:val="20"/>
+                <w:szCs w:val="20"/>
+              </w:rPr>
+              <w:t xml:space="preserve">Advanced</w:t>
+            </w:r>
+          </w:p>
+        </w:tc>
+        <w:tc>
+          <w:tcPr>
+            <w:tcBorders>
+              <w:top w:val="single" w:color="CCCCCC" w:sz="1"/>
+              <w:left w:val="single" w:color="CCCCCC" w:sz="1"/>
+              <w:bottom w:val="single" w:color="CCCCCC" w:sz="1"/>
+              <w:right w:val="single" w:color="CCCCCC" w:sz="1"/>
+            </w:tcBorders>
+            <w:shd w:fill="F2F2F2" w:val="clear"/>
+          </w:tcPr>
+          <w:p>
+            <w:r>
+              <w:rPr>
+                <w:rFonts w:ascii="Calibri" w:cs="Calibri" w:eastAsia="Calibri" w:hAnsi="Calibri"/>
+                <w:sz w:val="20"/>
+                <w:szCs w:val="20"/>
+              </w:rPr>
+              <w:t xml:space="preserve">No</w:t>
+            </w:r>
+          </w:p>
+        </w:tc>
+        <w:tc>
+          <w:tcPr>
+            <w:tcBorders>
+              <w:top w:val="single" w:color="CCCCCC" w:sz="1"/>
+              <w:left w:val="single" w:color="CCCCCC" w:sz="1"/>
+              <w:bottom w:val="single" w:color="CCCCCC" w:sz="1"/>
+              <w:right w:val="single" w:color="CCCCCC" w:sz="1"/>
+            </w:tcBorders>
+            <w:shd w:fill="F2F2F2" w:val="clear"/>
+          </w:tcPr>
+          <w:p>
+            <w:r>
+              <w:rPr>
+                <w:rFonts w:ascii="Calibri" w:cs="Calibri" w:eastAsia="Calibri" w:hAnsi="Calibri"/>
+                <w:sz w:val="20"/>
+                <w:szCs w:val="20"/>
+              </w:rPr>
+              <w:t xml:space="preserve">No</w:t>
+            </w:r>
+          </w:p>
+        </w:tc>
+        <w:tc>
+          <w:tcPr>
+            <w:tcBorders>
+              <w:top w:val="single" w:color="CCCCCC" w:sz="1"/>
+              <w:left w:val="single" w:color="CCCCCC" w:sz="1"/>
+              <w:bottom w:val="single" w:color="CCCCCC" w:sz="1"/>
+              <w:right w:val="single" w:color="CCCCCC" w:sz="1"/>
+            </w:tcBorders>
+            <w:shd w:fill="F2F2F2" w:val="clear"/>
+          </w:tcPr>
+          <w:p>
+            <w:r>
+              <w:rPr>
+                <w:rFonts w:ascii="Calibri" w:cs="Calibri" w:eastAsia="Calibri" w:hAnsi="Calibri"/>
+                <w:sz w:val="20"/>
+                <w:szCs w:val="20"/>
+              </w:rPr>
+              <w:t xml:space="preserve">Low</w:t>
+            </w:r>
+          </w:p>
+        </w:tc>
+      </w:tr>
+      <w:tr>
+        <w:tc>
+          <w:tcPr>
+            <w:tcBorders>
+              <w:top w:val="single" w:color="CCCCCC" w:sz="1"/>
+              <w:left w:val="single" w:color="CCCCCC" w:sz="1"/>
+              <w:bottom w:val="single" w:color="CCCCCC" w:sz="1"/>
+              <w:right w:val="single" w:color="CCCCCC" w:sz="1"/>
+            </w:tcBorders>
+            <w:shd w:fill="FFFFFF" w:val="clear"/>
+          </w:tcPr>
+          <w:p>
+            <w:r>
+              <w:rPr>
+                <w:rFonts w:ascii="Calibri" w:cs="Calibri" w:eastAsia="Calibri" w:hAnsi="Calibri"/>
+                <w:sz w:val="20"/>
+                <w:szCs w:val="20"/>
+              </w:rPr>
+              <w:t xml:space="preserve">NetSuite</w:t>
+            </w:r>
+          </w:p>
+        </w:tc>
+        <w:tc>
+          <w:tcPr>
+            <w:tcBorders>
+              <w:top w:val="single" w:color="CCCCCC" w:sz="1"/>
+              <w:left w:val="single" w:color="CCCCCC" w:sz="1"/>
+              <w:bottom w:val="single" w:color="CCCCCC" w:sz="1"/>
+              <w:right w:val="single" w:color="CCCCCC" w:sz="1"/>
+            </w:tcBorders>
+            <w:shd w:fill="FFFFFF" w:val="clear"/>
+          </w:tcPr>
+          <w:p>
+            <w:r>
+              <w:rPr>
+                <w:rFonts w:ascii="Calibri" w:cs="Calibri" w:eastAsia="Calibri" w:hAnsi="Calibri"/>
+                <w:sz w:val="20"/>
+                <w:szCs w:val="20"/>
+              </w:rPr>
+              <w:t xml:space="preserve">$1,000+</w:t>
+            </w:r>
+          </w:p>
+        </w:tc>
+        <w:tc>
+          <w:tcPr>
+            <w:tcBorders>
+              <w:top w:val="single" w:color="CCCCCC" w:sz="1"/>
+              <w:left w:val="single" w:color="CCCCCC" w:sz="1"/>
+              <w:bottom w:val="single" w:color="CCCCCC" w:sz="1"/>
+              <w:right w:val="single" w:color="CCCCCC" w:sz="1"/>
+            </w:tcBorders>
+            <w:shd w:fill="FFFFFF" w:val="clear"/>
+          </w:tcPr>
+          <w:p>
+            <w:r>
+              <w:rPr>
+                <w:rFonts w:ascii="Calibri" w:cs="Calibri" w:eastAsia="Calibri" w:hAnsi="Calibri"/>
+                <w:sz w:val="20"/>
+                <w:szCs w:val="20"/>
+              </w:rPr>
+              <w:t xml:space="preserve">Advanced</w:t>
+            </w:r>
+          </w:p>
+        </w:tc>
+        <w:tc>
+          <w:tcPr>
+            <w:tcBorders>
+              <w:top w:val="single" w:color="CCCCCC" w:sz="1"/>
+              <w:left w:val="single" w:color="CCCCCC" w:sz="1"/>
+              <w:bottom w:val="single" w:color="CCCCCC" w:sz="1"/>
+              <w:right w:val="single" w:color="CCCCCC" w:sz="1"/>
+            </w:tcBorders>
+            <w:shd w:fill="FFFFFF" w:val="clear"/>
+          </w:tcPr>
+          <w:p>
+            <w:r>
+              <w:rPr>
+                <w:rFonts w:ascii="Calibri" w:cs="Calibri" w:eastAsia="Calibri" w:hAnsi="Calibri"/>
+                <w:sz w:val="20"/>
+                <w:szCs w:val="20"/>
+              </w:rPr>
+              <w:t xml:space="preserve">Yes</w:t>
+            </w:r>
+          </w:p>
+        </w:tc>
+        <w:tc>
+          <w:tcPr>
+            <w:tcBorders>
+              <w:top w:val="single" w:color="CCCCCC" w:sz="1"/>
+              <w:left w:val="single" w:color="CCCCCC" w:sz="1"/>
+              <w:bottom w:val="single" w:color="CCCCCC" w:sz="1"/>
+              <w:right w:val="single" w:color="CCCCCC" w:sz="1"/>
+            </w:tcBorders>
+            <w:shd w:fill="FFFFFF" w:val="clear"/>
+          </w:tcPr>
+          <w:p>
+            <w:r>
+              <w:rPr>
+                <w:rFonts w:ascii="Calibri" w:cs="Calibri" w:eastAsia="Calibri" w:hAnsi="Calibri"/>
+                <w:sz w:val="20"/>
+                <w:szCs w:val="20"/>
+              </w:rPr>
+              <w:t xml:space="preserve">Yes</w:t>
+            </w:r>
+          </w:p>
+        </w:tc>
+        <w:tc>
+          <w:tcPr>
+            <w:tcBorders>
+              <w:top w:val="single" w:color="CCCCCC" w:sz="1"/>
+              <w:left w:val="single" w:color="CCCCCC" w:sz="1"/>
+              <w:bottom w:val="single" w:color="CCCCCC" w:sz="1"/>
+              <w:right w:val="single" w:color="CCCCCC" w:sz="1"/>
+            </w:tcBorders>
+            <w:shd w:fill="FFFFFF" w:val="clear"/>
+          </w:tcPr>
+          <w:p>
+            <w:r>
+              <w:rPr>
+                <w:rFonts w:ascii="Calibri" w:cs="Calibri" w:eastAsia="Calibri" w:hAnsi="Calibri"/>
+                <w:sz w:val="20"/>
+                <w:szCs w:val="20"/>
+              </w:rPr>
+              <w:t xml:space="preserve">Medium</w:t>
+            </w:r>
+          </w:p>
+        </w:tc>
+      </w:tr>
+      <w:tr>
+        <w:tc>
+          <w:tcPr>
+            <w:tcBorders>
+              <w:top w:val="single" w:color="CCCCCC" w:sz="1"/>
+              <w:left w:val="single" w:color="CCCCCC" w:sz="1"/>
+              <w:bottom w:val="single" w:color="CCCCCC" w:sz="1"/>
+              <w:right w:val="single" w:color="CCCCCC" w:sz="1"/>
+            </w:tcBorders>
+            <w:shd w:fill="F2F2F2" w:val="clear"/>
+          </w:tcPr>
+          <w:p>
+            <w:r>
+              <w:rPr>
+                <w:rFonts w:ascii="Calibri" w:cs="Calibri" w:eastAsia="Calibri" w:hAnsi="Calibri"/>
+                <w:sz w:val="20"/>
+                <w:szCs w:val="20"/>
+              </w:rPr>
+              <w:t xml:space="preserve">Ma5zony</w:t>
+            </w:r>
+          </w:p>
+        </w:tc>
+        <w:tc>
+          <w:tcPr>
+            <w:tcBorders>
+              <w:top w:val="single" w:color="CCCCCC" w:sz="1"/>
+              <w:left w:val="single" w:color="CCCCCC" w:sz="1"/>
+              <w:bottom w:val="single" w:color="CCCCCC" w:sz="1"/>
+              <w:right w:val="single" w:color="CCCCCC" w:sz="1"/>
+            </w:tcBorders>
+            <w:shd w:fill="F2F2F2" w:val="clear"/>
+          </w:tcPr>
+          <w:p>
+            <w:r>
+              <w:rPr>
+                <w:rFonts w:ascii="Calibri" w:cs="Calibri" w:eastAsia="Calibri" w:hAnsi="Calibri"/>
+                <w:sz w:val="20"/>
+                <w:szCs w:val="20"/>
+              </w:rPr>
+              <w:t xml:space="preserve">TBD (SaaS)</w:t>
+            </w:r>
+          </w:p>
+        </w:tc>
+        <w:tc>
+          <w:tcPr>
+            <w:tcBorders>
+              <w:top w:val="single" w:color="CCCCCC" w:sz="1"/>
+              <w:left w:val="single" w:color="CCCCCC" w:sz="1"/>
+              <w:bottom w:val="single" w:color="CCCCCC" w:sz="1"/>
+              <w:right w:val="single" w:color="CCCCCC" w:sz="1"/>
+            </w:tcBorders>
+            <w:shd w:fill="F2F2F2" w:val="clear"/>
+          </w:tcPr>
+          <w:p>
+            <w:r>
+              <w:rPr>
+                <w:rFonts w:ascii="Calibri" w:cs="Calibri" w:eastAsia="Calibri" w:hAnsi="Calibri"/>
+                <w:sz w:val="20"/>
+                <w:szCs w:val="20"/>
+              </w:rPr>
+              <w:t xml:space="preserve">SMA + SES</w:t>
+            </w:r>
+          </w:p>
+        </w:tc>
+        <w:tc>
+          <w:tcPr>
+            <w:tcBorders>
+              <w:top w:val="single" w:color="CCCCCC" w:sz="1"/>
+              <w:left w:val="single" w:color="CCCCCC" w:sz="1"/>
+              <w:bottom w:val="single" w:color="CCCCCC" w:sz="1"/>
+              <w:right w:val="single" w:color="CCCCCC" w:sz="1"/>
+            </w:tcBorders>
+            <w:shd w:fill="F2F2F2" w:val="clear"/>
+          </w:tcPr>
+          <w:p>
+            <w:r>
+              <w:rPr>
+                <w:rFonts w:ascii="Calibri" w:cs="Calibri" w:eastAsia="Calibri" w:hAnsi="Calibri"/>
+                <w:sz w:val="20"/>
+                <w:szCs w:val="20"/>
+              </w:rPr>
+              <w:t xml:space="preserve">Yes</w:t>
+            </w:r>
+          </w:p>
+        </w:tc>
+        <w:tc>
+          <w:tcPr>
+            <w:tcBorders>
+              <w:top w:val="single" w:color="CCCCCC" w:sz="1"/>
+              <w:left w:val="single" w:color="CCCCCC" w:sz="1"/>
+              <w:bottom w:val="single" w:color="CCCCCC" w:sz="1"/>
+              <w:right w:val="single" w:color="CCCCCC" w:sz="1"/>
+            </w:tcBorders>
+            <w:shd w:fill="F2F2F2" w:val="clear"/>
+          </w:tcPr>
+          <w:p>
+            <w:r>
+              <w:rPr>
+                <w:rFonts w:ascii="Calibri" w:cs="Calibri" w:eastAsia="Calibri" w:hAnsi="Calibri"/>
+                <w:sz w:val="20"/>
+                <w:szCs w:val="20"/>
+              </w:rPr>
+              <w:t xml:space="preserve">Yes</w:t>
+            </w:r>
+          </w:p>
+        </w:tc>
+        <w:tc>
+          <w:tcPr>
+            <w:tcBorders>
+              <w:top w:val="single" w:color="CCCCCC" w:sz="1"/>
+              <w:left w:val="single" w:color="CCCCCC" w:sz="1"/>
+              <w:bottom w:val="single" w:color="CCCCCC" w:sz="1"/>
+              <w:right w:val="single" w:color="CCCCCC" w:sz="1"/>
+            </w:tcBorders>
+            <w:shd w:fill="F2F2F2" w:val="clear"/>
+          </w:tcPr>
+          <w:p>
+            <w:r>
+              <w:rPr>
+                <w:rFonts w:ascii="Calibri" w:cs="Calibri" w:eastAsia="Calibri" w:hAnsi="Calibri"/>
+                <w:sz w:val="20"/>
+                <w:szCs w:val="20"/>
+              </w:rPr>
+              <w:t xml:space="preserve">High</w:t>
+            </w:r>
+          </w:p>
+        </w:tc>
+      </w:tr>
+    </w:tbl>
+    <w:p>
+      <w:pPr>
+        <w:spacing w:after="200" w:before="80"/>
+        <w:jc w:val="center"/>
+      </w:pPr>
+      <w:r>
+        <w:rPr>
+          <w:rFonts w:ascii="Calibri" w:cs="Calibri" w:eastAsia="Calibri" w:hAnsi="Calibri"/>
+          <w:i/>
+          <w:iCs/>
+          <w:color w:val="595959"/>
+          <w:sz w:val="20"/>
+          <w:szCs w:val="20"/>
+        </w:rPr>
+        <w:t xml:space="preserve">Table 10.1: Competitive comparison</w:t>
+      </w:r>
+    </w:p>
+    <w:p>
+      <w:pPr>
+        <w:spacing w:after="0" w:before="160"/>
+      </w:pPr>
+      <w:r>
+        <w:t xml:space="preserve"/>
+      </w:r>
+    </w:p>
+    <w:p>
+      <w:pPr>
+        <w:spacing w:after="120" w:before="120" w:line="360"/>
+      </w:pPr>
+      <w:r>
+        <w:rPr>
+          <w:rFonts w:ascii="Calibri" w:cs="Calibri" w:eastAsia="Calibri" w:hAnsi="Calibri"/>
+          <w:sz w:val="22"/>
+          <w:szCs w:val="22"/>
+        </w:rPr>
+        <w:t xml:space="preserve">Ma5zony's position in this landscape is as a mid-market solution that provides forecasting capability and manufacturing workflow at a price point accessible to micro-enterprises, with a transparency-first approach to algorithmic outputs that differentiates it from the opaque forecasting tools at the top of the market. This positioning is consistent with the blue-ocean strategy concept (Kim and Mauborgne, 2005): rather than competing directly with Inventory Planner on forecasting sophistication or with Stocky on price, Ma5zony creates new value by combining forecasting, manufacturing, and transparency in a configuration that no existing competitor offers.</w:t>
+      </w:r>
+    </w:p>
+    <w:p>
+      <w:pPr>
+        <w:spacing w:after="0" w:before="160"/>
+      </w:pPr>
+      <w:r>
+        <w:t xml:space="preserve"/>
+      </w:r>
+    </w:p>
+    <w:p>
+      <w:pPr>
+        <w:pStyle w:val="Heading2"/>
+        <w:spacing w:after="160" w:before="300"/>
+      </w:pPr>
+      <w:r>
+        <w:rPr>
+          <w:rFonts w:ascii="Calibri Light" w:cs="Calibri Light" w:eastAsia="Calibri Light" w:hAnsi="Calibri Light"/>
+          <w:b/>
+          <w:bCs/>
+          <w:color w:val="44546A"/>
+          <w:sz w:val="26"/>
+          <w:szCs w:val="26"/>
+        </w:rPr>
+        <w:t xml:space="preserve">10.3 Revenue Model and Pricing Strategy</w:t>
+      </w:r>
+    </w:p>
+    <w:p>
+      <w:pPr>
+        <w:spacing w:after="120" w:before="120" w:line="360"/>
+      </w:pPr>
+      <w:r>
+        <w:rPr>
+          <w:rFonts w:ascii="Calibri" w:cs="Calibri" w:eastAsia="Calibri" w:hAnsi="Calibri"/>
+          <w:sz w:val="22"/>
+          <w:szCs w:val="22"/>
+        </w:rPr>
+        <w:t xml:space="preserve">The planned revenue model for Ma5zony is a tiered SaaS subscription with three plans. The Starter plan, targeted at solo operators and micro-enterprises, provides core inventory tracking and basic forecasting for a small number of products and users. The Growth plan adds the full forecasting suite, ABC-XYZ analysis, Shopify integration, and multi-user support. The Professional plan adds manufacturing workflow, financial analytics, supplier portal access, and priority support. This tiering strategy is designed to allow businesses to start with Ma5zony at low commitment and upgrade as their needs and their confidence in the product grow.</w:t>
+      </w:r>
+    </w:p>
+    <w:p>
+      <w:pPr>
+        <w:spacing w:after="0" w:before="160"/>
+      </w:pPr>
+      <w:r>
+        <w:t xml:space="preserve"/>
+      </w:r>
+    </w:p>
+    <w:p>
+      <w:pPr>
+        <w:spacing w:after="120" w:before="120" w:line="360"/>
+      </w:pPr>
+      <w:r>
+        <w:rPr>
+          <w:rFonts w:ascii="Calibri" w:cs="Calibri" w:eastAsia="Calibri" w:hAnsi="Calibri"/>
+          <w:sz w:val="22"/>
+          <w:szCs w:val="22"/>
+        </w:rPr>
+        <w:t xml:space="preserve">Pricing has not been finalised as this dissertation is submitted, but competitive benchmarking suggests that the Growth plan should be positioned in the USD 39-59 per month range to undercut Inventory Planner and Cogsy while remaining above the free and near-free simple stock trackers. At this price point, acquiring 100 paying customers on the Growth plan would generate USD 4,700-7,100 per month in recurring revenue — sufficient to cover Firebase infrastructure costs (estimated at USD 200-400 per month at that scale) and begin funding ongoing development.</w:t>
+      </w:r>
+    </w:p>
+    <w:p>
+      <w:pPr>
+        <w:spacing w:after="0" w:before="160"/>
+      </w:pPr>
+      <w:r>
+        <w:t xml:space="preserve"/>
+      </w:r>
+    </w:p>
+    <w:p>
+      <w:pPr>
+        <w:spacing w:after="120" w:before="120" w:line="360"/>
+      </w:pPr>
+      <w:r>
+        <w:rPr>
+          <w:rFonts w:ascii="Calibri" w:cs="Calibri" w:eastAsia="Calibri" w:hAnsi="Calibri"/>
+          <w:sz w:val="22"/>
+          <w:szCs w:val="22"/>
+        </w:rPr>
+        <w:t xml:space="preserve">Customer acquisition will initially be pursued through the Shopify App Store, which provides organic discoverability to Shopify merchants searching for inventory tools. Shopify's partner programme requires that apps listed in the App Store meet specific quality and security standards, which Ma5zony's current architecture is designed to satisfy. The alternative acquisition channel is direct outreach to existing Shopify merchants through their merchant communities, where the ABC-XYZ matrix and transparent forecasting features are likely to resonate with the technically curious segment of operators who already think analytically about their inventory.</w:t>
+      </w:r>
+    </w:p>
+    <w:p>
+      <w:pPr>
+        <w:spacing w:after="0" w:before="160"/>
+      </w:pPr>
+      <w:r>
+        <w:t xml:space="preserve"/>
+      </w:r>
+    </w:p>
+    <w:p>
+      <w:pPr>
+        <w:pStyle w:val="Heading2"/>
+        <w:spacing w:after="160" w:before="300"/>
+      </w:pPr>
+      <w:r>
+        <w:rPr>
+          <w:rFonts w:ascii="Calibri Light" w:cs="Calibri Light" w:eastAsia="Calibri Light" w:hAnsi="Calibri Light"/>
+          <w:b/>
+          <w:bCs/>
+          <w:color w:val="44546A"/>
+          <w:sz w:val="26"/>
+          <w:szCs w:val="26"/>
+        </w:rPr>
+        <w:t xml:space="preserve">10.4 Scalability and Operational Considerations</w:t>
+      </w:r>
+    </w:p>
+    <w:p>
+      <w:pPr>
+        <w:spacing w:after="120" w:before="120" w:line="360"/>
+      </w:pPr>
+      <w:r>
+        <w:rPr>
+          <w:rFonts w:ascii="Calibri" w:cs="Calibri" w:eastAsia="Calibri" w:hAnsi="Calibri"/>
+          <w:sz w:val="22"/>
+          <w:szCs w:val="22"/>
+        </w:rPr>
+        <w:t xml:space="preserve">The Firebase and Flutter architecture of Ma5zony provides a favourable scalability profile for the early phases of growth. Firestore is a serverless database that scales horizontally without configuration: adding more customers does not require provisioning additional database capacity, because each customer's data is independently sharded by the Firestore infrastructure. Cloud Functions scale similarly, with each function invocation running in an independent container that is provisioned and terminated automatically by the Google Cloud infrastructure.</w:t>
+      </w:r>
+    </w:p>
+    <w:p>
+      <w:pPr>
+        <w:spacing w:after="0" w:before="160"/>
+      </w:pPr>
+      <w:r>
+        <w:t xml:space="preserve"/>
+      </w:r>
+    </w:p>
+    <w:p>
+      <w:pPr>
+        <w:spacing w:after="120" w:before="120" w:line="360"/>
+      </w:pPr>
+      <w:r>
+        <w:rPr>
+          <w:rFonts w:ascii="Calibri" w:cs="Calibri" w:eastAsia="Calibri" w:hAnsi="Calibri"/>
+          <w:sz w:val="22"/>
+          <w:szCs w:val="22"/>
+        </w:rPr>
+        <w:t xml:space="preserve">The primary scalability concern in the current architecture is the potential for read cost escalation at the Firestore level. The listener-based architecture results in real-time data streams that incur a read charge for each document delivered. For a business with 1,000 products and 100 monthly active users, the Firestore read costs could reach USD 50-100 per month — manageable at the planned price point but requiring monitoring. As the user base grows, architectural changes such as pagination of large collections, client-side caching of infrequently changing data, and batch reads for reporting queries may be needed to control costs.</w:t>
+      </w:r>
+    </w:p>
+    <w:p>
+      <w:pPr>
+        <w:spacing w:after="0" w:before="160"/>
+      </w:pPr>
+      <w:r>
+        <w:t xml:space="preserve"/>
+      </w:r>
+    </w:p>
+    <w:p>
+      <w:pPr>
+        <w:spacing w:after="120" w:before="120" w:line="360"/>
+      </w:pPr>
+      <w:r>
+        <w:rPr>
+          <w:rFonts w:ascii="Calibri" w:cs="Calibri" w:eastAsia="Calibri" w:hAnsi="Calibri"/>
+          <w:sz w:val="22"/>
+          <w:szCs w:val="22"/>
+        </w:rPr>
+        <w:t xml:space="preserve">Operationally, Ma5zony currently requires no dedicated operations staff: Firebase and Cloud Functions manage their own infrastructure, and the application is delivered as a static web bundle from Firebase Hosting with no servers to patch or restart. This zero-operations model is essential for a solo-developer SaaS product in its early stages and represents a significant advantage over self-hosted alternatives. As the product matures and the customer base grows, operational needs will likely expand to include customer support, billing management, and monitoring — all of which can be addressed with existing SaaS tools rather than bespoke infrastructure.</w:t>
+      </w:r>
+    </w:p>
+    <w:p>
+      <w:pPr>
+        <w:spacing w:after="0" w:before="160"/>
+      </w:pPr>
+      <w:r>
+        <w:t xml:space="preserve"/>
+      </w:r>
+    </w:p>
+    <w:p>
+      <w:r>
+        <w:br w:type="page"/>
+      </w:r>
+    </w:p>
+    <w:p>
+      <w:pPr>
+        <w:pStyle w:val="Heading1"/>
+        <w:spacing w:after="200" w:before="400"/>
+      </w:pPr>
+      <w:r>
+        <w:rPr>
+          <w:rFonts w:ascii="Calibri Light" w:cs="Calibri Light" w:eastAsia="Calibri Light" w:hAnsi="Calibri Light"/>
+          <w:b/>
+          <w:bCs/>
+          <w:color w:val="44546A"/>
+          <w:sz w:val="32"/>
+          <w:szCs w:val="32"/>
+        </w:rPr>
+        <w:t xml:space="preserve">Chapter 9 (Extended): Future Work and Development Roadmap</w:t>
+      </w:r>
+    </w:p>
+    <w:p>
+      <w:pPr>
+        <w:spacing w:after="0" w:before="160"/>
+      </w:pPr>
+      <w:r>
+        <w:t xml:space="preserve"/>
+      </w:r>
+    </w:p>
+    <w:p>
+      <w:pPr>
+        <w:pStyle w:val="Heading2"/>
+        <w:spacing w:after="160" w:before="300"/>
+      </w:pPr>
+      <w:r>
+        <w:rPr>
+          <w:rFonts w:ascii="Calibri Light" w:cs="Calibri Light" w:eastAsia="Calibri Light" w:hAnsi="Calibri Light"/>
+          <w:b/>
+          <w:bCs/>
+          <w:color w:val="44546A"/>
+          <w:sz w:val="26"/>
+          <w:szCs w:val="26"/>
+        </w:rPr>
+        <w:t xml:space="preserve">9.5 Machine Learning Integration</w:t>
+      </w:r>
+    </w:p>
+    <w:p>
+      <w:pPr>
+        <w:spacing w:after="120" w:before="120" w:line="360"/>
+      </w:pPr>
+      <w:r>
+        <w:rPr>
+          <w:rFonts w:ascii="Calibri" w:cs="Calibri" w:eastAsia="Calibri" w:hAnsi="Calibri"/>
+          <w:sz w:val="22"/>
+          <w:szCs w:val="22"/>
+        </w:rPr>
+        <w:t xml:space="preserve">The forecasting module in the current version of Ma5zony uses classical statistical methods: Simple Moving Average and Simple Exponential Smoothing. These methods are well-suited to the current use case for several reasons: they are computationally lightweight, they produce results that can be explained in plain language, and they require relatively few historical data points to produce useful estimates. However, they have known limitations for demand patterns with strong seasonal components, multiple cyclical patterns, or external factors (such as weather, marketing campaigns, or competitor actions) that influence demand.</w:t>
+      </w:r>
+    </w:p>
+    <w:p>
+      <w:pPr>
+        <w:spacing w:after="0" w:before="160"/>
+      </w:pPr>
+      <w:r>
+        <w:t xml:space="preserve"/>
+      </w:r>
+    </w:p>
+    <w:p>
+      <w:pPr>
+        <w:spacing w:after="120" w:before="120" w:line="360"/>
+      </w:pPr>
+      <w:r>
+        <w:rPr>
+          <w:rFonts w:ascii="Calibri" w:cs="Calibri" w:eastAsia="Calibri" w:hAnsi="Calibri"/>
+          <w:sz w:val="22"/>
+          <w:szCs w:val="22"/>
+        </w:rPr>
+        <w:t xml:space="preserve">The most natural evolution of the forecasting capability is the integration of machine learning models that can capture these more complex patterns. The Holt-Winters seasonal model — which is already described in the dissertation as a theoretical extension — would be the first step, as it extends the classical SES framework to handle additive or multiplicative seasonality without requiring a fundamental change in the user's mental model. For a business with strong weekly or annual seasonality (a food retailer whose demand peaks around holidays, or a sports equipment retailer whose demand depends on sporting seasons), Holt-Winters would provide materially better forecasts than SES.</w:t>
+      </w:r>
+    </w:p>
+    <w:p>
+      <w:pPr>
+        <w:spacing w:after="0" w:before="160"/>
+      </w:pPr>
+      <w:r>
+        <w:t xml:space="preserve"/>
+      </w:r>
+    </w:p>
+    <w:p>
+      <w:pPr>
+        <w:spacing w:after="120" w:before="120" w:line="360"/>
+      </w:pPr>
+      <w:r>
+        <w:rPr>
+          <w:rFonts w:ascii="Calibri" w:cs="Calibri" w:eastAsia="Calibri" w:hAnsi="Calibri"/>
+          <w:sz w:val="22"/>
+          <w:szCs w:val="22"/>
+        </w:rPr>
+        <w:t xml:space="preserve">Beyond Holt-Winters, the longer-term roadmap includes the integration of gradient boosting models (such as XGBoost or LightGBM) that can incorporate external features alongside historical demand. For a Shopify-integrated Ma5zony installation, the potential feature set is rich: Shopify's API exposes marketing campaign data, discount periods, and product page view counts that could all be used as predictors in a demand model. A merchant who runs a 20% discount every Black Friday would benefit enormously from a forecasting model that knew about that discount and adjusted its prediction accordingly, rather than treating the Black Friday demand spike as unexplained noise.</w:t>
+      </w:r>
+    </w:p>
+    <w:p>
+      <w:pPr>
+        <w:spacing w:after="0" w:before="160"/>
+      </w:pPr>
+      <w:r>
+        <w:t xml:space="preserve"/>
+      </w:r>
+    </w:p>
+    <w:p>
+      <w:pPr>
+        <w:spacing w:after="120" w:before="120" w:line="360"/>
+      </w:pPr>
+      <w:r>
+        <w:rPr>
+          <w:rFonts w:ascii="Calibri" w:cs="Calibri" w:eastAsia="Calibri" w:hAnsi="Calibri"/>
+          <w:sz w:val="22"/>
+          <w:szCs w:val="22"/>
+        </w:rPr>
+        <w:t xml:space="preserve">The implementation challenge for ML integration is not algorithmic but operational. Training a machine learning model requires a meaningful quantity of historical data — typically at least one year of weekly demand data for a seasonal model, and ideally two or more years. Many of Ma5zony's target users will not have this data available when they first start using the system. The roadmap therefore includes a "model graduation" feature: the system starts all new users on SMA, automatically transitions to SES after 12 weeks of data, and offers to upgrade to ML-based forecasting once 52 weeks of data are available. This graduated approach prevents the system from presenting overconfident ML predictions to users with insufficient data to train a reliable model.</w:t>
+      </w:r>
+    </w:p>
+    <w:p>
+      <w:pPr>
+        <w:spacing w:after="0" w:before="160"/>
+      </w:pPr>
+      <w:r>
+        <w:t xml:space="preserve"/>
+      </w:r>
+    </w:p>
+    <w:p>
+      <w:pPr>
+        <w:pStyle w:val="Heading2"/>
+        <w:spacing w:after="160" w:before="300"/>
+      </w:pPr>
+      <w:r>
+        <w:rPr>
+          <w:rFonts w:ascii="Calibri Light" w:cs="Calibri Light" w:eastAsia="Calibri Light" w:hAnsi="Calibri Light"/>
+          <w:b/>
+          <w:bCs/>
+          <w:color w:val="44546A"/>
+          <w:sz w:val="26"/>
+          <w:szCs w:val="26"/>
+        </w:rPr>
+        <w:t xml:space="preserve">9.6 Mobile Application Development</w:t>
+      </w:r>
+    </w:p>
+    <w:p>
+      <w:pPr>
+        <w:spacing w:after="120" w:before="120" w:line="360"/>
+      </w:pPr>
+      <w:r>
+        <w:rPr>
+          <w:rFonts w:ascii="Calibri" w:cs="Calibri" w:eastAsia="Calibri" w:hAnsi="Calibri"/>
+          <w:sz w:val="22"/>
+          <w:szCs w:val="22"/>
+        </w:rPr>
+        <w:t xml:space="preserve">The current Ma5zony implementation targets web browsers as the primary platform, with responsive design that makes the interface usable on tablet-sized screens. However, a dedicated mobile application would unlock several capabilities that are not achievable in a web browser context: barcode scanning for stock checks and receiving, push notifications for reorder alerts and purchase order status updates, and offline-capable stock counting that synchronises when connectivity is restored.</w:t>
+      </w:r>
+    </w:p>
+    <w:p>
+      <w:pPr>
+        <w:spacing w:after="0" w:before="160"/>
+      </w:pPr>
+      <w:r>
+        <w:t xml:space="preserve"/>
+      </w:r>
+    </w:p>
+    <w:p>
+      <w:pPr>
+        <w:spacing w:after="120" w:before="120" w:line="360"/>
+      </w:pPr>
+      <w:r>
+        <w:rPr>
+          <w:rFonts w:ascii="Calibri" w:cs="Calibri" w:eastAsia="Calibri" w:hAnsi="Calibri"/>
+          <w:sz w:val="22"/>
+          <w:szCs w:val="22"/>
+        </w:rPr>
+        <w:t xml:space="preserve">Flutter's cross-platform architecture means that a mobile application can be built from the same codebase as the existing web application, with platform-specific features (camera access for barcode scanning, native push notification channels) implemented through Flutter's platform channel mechanism. The core business logic — the forecasting service, the replenishment service, the Firestore data layer — requires no modification for mobile. The primary development effort would be in designing a mobile-optimised UI for the stock management workflows and integrating the mobile-specific features.</w:t>
+      </w:r>
+    </w:p>
+    <w:p>
+      <w:pPr>
+        <w:spacing w:after="0" w:before="160"/>
+      </w:pPr>
+      <w:r>
+        <w:t xml:space="preserve"/>
+      </w:r>
+    </w:p>
+    <w:p>
+      <w:pPr>
+        <w:spacing w:after="120" w:before="120" w:line="360"/>
+      </w:pPr>
+      <w:r>
+        <w:rPr>
+          <w:rFonts w:ascii="Calibri" w:cs="Calibri" w:eastAsia="Calibri" w:hAnsi="Calibri"/>
+          <w:sz w:val="22"/>
+          <w:szCs w:val="22"/>
+        </w:rPr>
+        <w:t xml:space="preserve">Barcode scanning for receiving is particularly valuable for the manufacturing workflow. When a raw material order arrives, the receiving clerk currently has to navigate to the order in the Ma5zony web interface and manually confirm receipt. With a mobile application, the clerk could scan the barcode on the delivery packaging, and Ma5zony would identify the corresponding raw material order, display the expected quantity, and allow the received quantity to be confirmed with a single tap. This would reduce the time and error rate associated with the receiving process and provide a more accurate real-time view of raw material inventory.</w:t>
+      </w:r>
+    </w:p>
+    <w:p>
+      <w:pPr>
+        <w:spacing w:after="0" w:before="160"/>
+      </w:pPr>
+      <w:r>
+        <w:t xml:space="preserve"/>
+      </w:r>
+    </w:p>
+    <w:p>
+      <w:pPr>
+        <w:pStyle w:val="Heading2"/>
+        <w:spacing w:after="160" w:before="300"/>
+      </w:pPr>
+      <w:r>
+        <w:rPr>
+          <w:rFonts w:ascii="Calibri Light" w:cs="Calibri Light" w:eastAsia="Calibri Light" w:hAnsi="Calibri Light"/>
+          <w:b/>
+          <w:bCs/>
+          <w:color w:val="44546A"/>
+          <w:sz w:val="26"/>
+          <w:szCs w:val="26"/>
+        </w:rPr>
+        <w:t xml:space="preserve">9.7 Multi-Tenancy and White-Label Architecture</w:t>
+      </w:r>
+    </w:p>
+    <w:p>
+      <w:pPr>
+        <w:spacing w:after="120" w:before="120" w:line="360"/>
+      </w:pPr>
+      <w:r>
+        <w:rPr>
+          <w:rFonts w:ascii="Calibri" w:cs="Calibri" w:eastAsia="Calibri" w:hAnsi="Calibri"/>
+          <w:sz w:val="22"/>
+          <w:szCs w:val="22"/>
+        </w:rPr>
+        <w:t xml:space="preserve">The current architecture of Ma5zony is single-tenant: each Firebase project instance serves a single customer's data. This is appropriate for the current stage of development but will not scale efficiently as the customer base grows. Each additional customer would require a separate Firebase project, with the associated overhead of configuration, monitoring, and maintenance across multiple projects.</w:t>
+      </w:r>
+    </w:p>
+    <w:p>
+      <w:pPr>
+        <w:spacing w:after="0" w:before="160"/>
+      </w:pPr>
+      <w:r>
+        <w:t xml:space="preserve"/>
+      </w:r>
+    </w:p>
+    <w:p>
+      <w:pPr>
+        <w:spacing w:after="120" w:before="120" w:line="360"/>
+      </w:pPr>
+      <w:r>
+        <w:rPr>
+          <w:rFonts w:ascii="Calibri" w:cs="Calibri" w:eastAsia="Calibri" w:hAnsi="Calibri"/>
+          <w:sz w:val="22"/>
+          <w:szCs w:val="22"/>
+        </w:rPr>
+        <w:t xml:space="preserve">The transition to a multi-tenant architecture would store all customers' data within a single Firebase project, with Firestore Security Rules enforcing strict data isolation between tenants. The data model would be restructured from users/{uid}/... to organisations/{orgId}/members/{uid}/... and organisations/{orgId}/data/..., where the organisation ID is the primary tenant identifier. Security rules would verify that the authenticated user is a member of the organisation whose data they are accessing, preventing cross-tenant data access.</w:t>
+      </w:r>
+    </w:p>
+    <w:p>
+      <w:pPr>
+        <w:spacing w:after="0" w:before="160"/>
+      </w:pPr>
+      <w:r>
+        <w:t xml:space="preserve"/>
+      </w:r>
+    </w:p>
+    <w:p>
+      <w:pPr>
+        <w:spacing w:after="120" w:before="120" w:line="360"/>
+      </w:pPr>
+      <w:r>
+        <w:rPr>
+          <w:rFonts w:ascii="Calibri" w:cs="Calibri" w:eastAsia="Calibri" w:hAnsi="Calibri"/>
+          <w:sz w:val="22"/>
+          <w:szCs w:val="22"/>
+        </w:rPr>
+        <w:t xml:space="preserve">A multi-tenant architecture also enables white-label deployment, where a third-party (for example, a Shopify app development agency or an inventory consultancy) can offer Ma5zony's capabilities under their own brand to their clients. The white-label model could be implemented by making the colour scheme, logo, and application name configurable through an organisation-level settings document, with the Flutter application reading these settings at startup and applying them to the UI. This would allow a single codebase and a single Firebase project to serve multiple branded deployments.</w:t>
+      </w:r>
+    </w:p>
+    <w:p>
+      <w:pPr>
+        <w:spacing w:after="0" w:before="160"/>
+      </w:pPr>
+      <w:r>
+        <w:t xml:space="preserve"/>
+      </w:r>
+    </w:p>
+    <w:p>
+      <w:pPr>
+        <w:pStyle w:val="Heading2"/>
+        <w:spacing w:after="160" w:before="300"/>
+      </w:pPr>
+      <w:r>
+        <w:rPr>
+          <w:rFonts w:ascii="Calibri Light" w:cs="Calibri Light" w:eastAsia="Calibri Light" w:hAnsi="Calibri Light"/>
+          <w:b/>
+          <w:bCs/>
+          <w:color w:val="44546A"/>
+          <w:sz w:val="26"/>
+          <w:szCs w:val="26"/>
+        </w:rPr>
+        <w:t xml:space="preserve">9.8 Advanced Analytics and Reporting</w:t>
+      </w:r>
+    </w:p>
+    <w:p>
+      <w:pPr>
+        <w:spacing w:after="120" w:before="120" w:line="360"/>
+      </w:pPr>
+      <w:r>
+        <w:rPr>
+          <w:rFonts w:ascii="Calibri" w:cs="Calibri" w:eastAsia="Calibri" w:hAnsi="Calibri"/>
+          <w:sz w:val="22"/>
+          <w:szCs w:val="22"/>
+        </w:rPr>
+        <w:t xml:space="preserve">The financial analytics module in the current Ma5zony implementation provides a real-time view of cash flow based on purchase order costs and sales revenue imported from Shopify. This is a useful operational dashboard but does not provide the analytical depth that a growing business needs for strategic decision-making. The future roadmap includes several enhancements to the analytics capability.</w:t>
+      </w:r>
+    </w:p>
+    <w:p>
+      <w:pPr>
+        <w:spacing w:after="0" w:before="160"/>
+      </w:pPr>
+      <w:r>
+        <w:t xml:space="preserve"/>
+      </w:r>
+    </w:p>
+    <w:p>
+      <w:pPr>
+        <w:spacing w:after="120" w:before="120" w:line="360"/>
+      </w:pPr>
+      <w:r>
+        <w:rPr>
+          <w:rFonts w:ascii="Calibri" w:cs="Calibri" w:eastAsia="Calibri" w:hAnsi="Calibri"/>
+          <w:sz w:val="22"/>
+          <w:szCs w:val="22"/>
+        </w:rPr>
+        <w:t xml:space="preserve">Product profitability analysis would extend the current financial model to compute gross margin per product, incorporating the cost of goods sold (derived from supplier prices in the purchase order history) against the selling price (from Shopify order data). This would allow SME owners to identify which products in their catalogue are the most and least profitable, information that is currently very difficult to obtain without significant manual spreadsheet work. The analysis would be updated automatically each time new order data is imported from Shopify.</w:t>
+      </w:r>
+    </w:p>
+    <w:p>
+      <w:pPr>
+        <w:spacing w:after="0" w:before="160"/>
+      </w:pPr>
+      <w:r>
+        <w:t xml:space="preserve"/>
+      </w:r>
+    </w:p>
+    <w:p>
+      <w:pPr>
+        <w:spacing w:after="120" w:before="120" w:line="360"/>
+      </w:pPr>
+      <w:r>
+        <w:rPr>
+          <w:rFonts w:ascii="Calibri" w:cs="Calibri" w:eastAsia="Calibri" w:hAnsi="Calibri"/>
+          <w:sz w:val="22"/>
+          <w:szCs w:val="22"/>
+        </w:rPr>
+        <w:t xml:space="preserve">Cohort analysis of demand patterns would allow users to compare demand across time periods with similar characteristics: the same month across multiple years (to identify year-on-year growth or decline), periods before and after a marketing campaign (to measure campaign effectiveness on inventory demand), or weekday versus weekend demand (to optimise reorder timing). This type of analysis is standard in e-commerce analytics platforms but is not available in any current Shopify inventory management tool.</w:t>
+      </w:r>
+    </w:p>
+    <w:p>
+      <w:pPr>
+        <w:spacing w:after="0" w:before="160"/>
+      </w:pPr>
+      <w:r>
+        <w:t xml:space="preserve"/>
+      </w:r>
+    </w:p>
+    <w:p>
+      <w:pPr>
+        <w:spacing w:after="120" w:before="120" w:line="360"/>
+      </w:pPr>
+      <w:r>
+        <w:rPr>
+          <w:rFonts w:ascii="Calibri" w:cs="Calibri" w:eastAsia="Calibri" w:hAnsi="Calibri"/>
+          <w:sz w:val="22"/>
+          <w:szCs w:val="22"/>
+        </w:rPr>
+        <w:t xml:space="preserve">Supplier performance analytics would track lead time variability, order fulfilment rates, and price changes per supplier over time, enabling SME owners to make evidence-based decisions about supplier relationships. A supplier who consistently delivers two days late relative to their quoted lead time inflates safety stock requirements and increases the risk of stockouts; quantifying this effect allows the owner to either negotiate an honest lead time with the supplier or switch to a more reliable alternative. This type of supplier scorecard is standard in large enterprise procurement but is not available in any tool targeting the SME segment.</w:t>
+      </w:r>
+    </w:p>
+    <w:p>
+      <w:pPr>
+        <w:spacing w:after="0" w:before="160"/>
+      </w:pPr>
+      <w:r>
+        <w:t xml:space="preserve"/>
+      </w:r>
+    </w:p>
+    <w:p>
+      <w:pPr>
+        <w:pStyle w:val="Heading2"/>
+        <w:spacing w:after="160" w:before="300"/>
+      </w:pPr>
+      <w:r>
+        <w:rPr>
+          <w:rFonts w:ascii="Calibri Light" w:cs="Calibri Light" w:eastAsia="Calibri Light" w:hAnsi="Calibri Light"/>
+          <w:b/>
+          <w:bCs/>
+          <w:color w:val="44546A"/>
+          <w:sz w:val="26"/>
+          <w:szCs w:val="26"/>
+        </w:rPr>
+        <w:t xml:space="preserve">9.9 Integration Ecosystem Expansion</w:t>
+      </w:r>
+    </w:p>
+    <w:p>
+      <w:pPr>
+        <w:spacing w:after="120" w:before="120" w:line="360"/>
+      </w:pPr>
+      <w:r>
+        <w:rPr>
+          <w:rFonts w:ascii="Calibri" w:cs="Calibri" w:eastAsia="Calibri" w:hAnsi="Calibri"/>
+          <w:sz w:val="22"/>
+          <w:szCs w:val="22"/>
+        </w:rPr>
+        <w:t xml:space="preserve">Shopify is the only e-commerce platform currently integrated with Ma5zony. The integration ecosystem roadmap includes WooCommerce (the leading self-hosted e-commerce platform, used by approximately 28% of all online stores), Amazon Seller Central (for SMEs selling through the Amazon marketplace), and accounting platforms including QuickBooks and Xero (to eliminate the manual reconciliation of inventory costs with financial accounts).</w:t>
+      </w:r>
+    </w:p>
+    <w:p>
+      <w:pPr>
+        <w:spacing w:after="0" w:before="160"/>
+      </w:pPr>
+      <w:r>
+        <w:t xml:space="preserve"/>
+      </w:r>
+    </w:p>
+    <w:p>
+      <w:pPr>
+        <w:spacing w:after="120" w:before="120" w:line="360"/>
+      </w:pPr>
+      <w:r>
+        <w:rPr>
+          <w:rFonts w:ascii="Calibri" w:cs="Calibri" w:eastAsia="Calibri" w:hAnsi="Calibri"/>
+          <w:sz w:val="22"/>
+          <w:szCs w:val="22"/>
+        </w:rPr>
+        <w:t xml:space="preserve">Each integration would follow the same architectural pattern as the Shopify integration: a Cloud Functions-based OAuth flow to obtain and store API credentials, a scheduled or webhook-triggered import function to pull order and product data, and a normalisation layer that maps the external platform's data model to Ma5zony's internal product and demand record model. This normalisation layer is the most technically complex component of each new integration, as different platforms use different identifiers, different unit conventions, and different representations of the same concepts (a Shopify variant corresponds to a WooCommerce attribute combination, which corresponds to an Amazon ASIN variation — all of these need to map to a single Ma5zony product).</w:t>
+      </w:r>
+    </w:p>
+    <w:p>
+      <w:pPr>
+        <w:spacing w:after="0" w:before="160"/>
+      </w:pPr>
+      <w:r>
+        <w:t xml:space="preserve"/>
+      </w:r>
+    </w:p>
+    <w:p>
+      <w:pPr>
+        <w:spacing w:after="120" w:before="120" w:line="360"/>
+      </w:pPr>
+      <w:r>
+        <w:rPr>
+          <w:rFonts w:ascii="Calibri" w:cs="Calibri" w:eastAsia="Calibri" w:hAnsi="Calibri"/>
+          <w:sz w:val="22"/>
+          <w:szCs w:val="22"/>
+        </w:rPr>
+        <w:t xml:space="preserve">The long-term vision for Ma5zony's integration ecosystem is a unified inventory intelligence layer that sits above all of an SME's operational platforms: receiving demand signals from multiple sales channels, aggregating them into a single demand model, and producing replenishment recommendations that account for inventory across all fulfilment channels. This vision reflects the direction in which the most sophisticated e-commerce operators are already moving — the challenge is to make it accessible to businesses with a fraction of the resources of those operators.</w:t>
+      </w:r>
+    </w:p>
+    <w:p>
+      <w:pPr>
+        <w:spacing w:after="0" w:before="160"/>
+      </w:pPr>
+      <w:r>
+        <w:t xml:space="preserve"/>
+      </w:r>
+    </w:p>
+    <w:p>
+      <w:r>
+        <w:br w:type="page"/>
+      </w:r>
+    </w:p>
+    <w:p>
+      <w:pPr>
+        <w:pStyle w:val="Heading1"/>
+        <w:spacing w:after="200" w:before="400"/>
+      </w:pPr>
+      <w:r>
+        <w:rPr>
+          <w:rFonts w:ascii="Calibri Light" w:cs="Calibri Light" w:eastAsia="Calibri Light" w:hAnsi="Calibri Light"/>
+          <w:b/>
+          <w:bCs/>
+          <w:color w:val="44546A"/>
+          <w:sz w:val="32"/>
+          <w:szCs w:val="32"/>
+        </w:rPr>
+        <w:t xml:space="preserve">Chapter 11: Personal Reflections and Critical Evaluation</w:t>
+      </w:r>
+    </w:p>
+    <w:p>
+      <w:pPr>
+        <w:spacing w:after="0" w:before="160"/>
+      </w:pPr>
+      <w:r>
+        <w:t xml:space="preserve"/>
+      </w:r>
+    </w:p>
+    <w:p>
+      <w:pPr>
+        <w:pStyle w:val="Heading2"/>
+        <w:spacing w:after="160" w:before="300"/>
+      </w:pPr>
+      <w:r>
+        <w:rPr>
+          <w:rFonts w:ascii="Calibri Light" w:cs="Calibri Light" w:eastAsia="Calibri Light" w:hAnsi="Calibri Light"/>
+          <w:b/>
+          <w:bCs/>
+          <w:color w:val="44546A"/>
+          <w:sz w:val="26"/>
+          <w:szCs w:val="26"/>
+        </w:rPr>
+        <w:t xml:space="preserve">11.1 Reflections on the Development Process</w:t>
+      </w:r>
+    </w:p>
+    <w:p>
+      <w:pPr>
+        <w:spacing w:after="120" w:before="120" w:line="360"/>
+      </w:pPr>
+      <w:r>
+        <w:rPr>
+          <w:rFonts w:ascii="Calibri" w:cs="Calibri" w:eastAsia="Calibri" w:hAnsi="Calibri"/>
+          <w:sz w:val="22"/>
+          <w:szCs w:val="22"/>
+        </w:rPr>
+        <w:t xml:space="preserve">Looking back on the eighteen months of development that produced Ma5zony, the most valuable lessons are not the technical ones. The technical challenges — designing the Firestore data model, implementing the forecasting algorithms, managing the Shopify OAuth flow — were difficult but tractable: each had a correct answer that could be found through reading, experimentation, and debugging. The genuinely difficult challenges were in deciding what to build, in what order, and for whom.</w:t>
+      </w:r>
+    </w:p>
+    <w:p>
+      <w:pPr>
+        <w:spacing w:after="0" w:before="160"/>
+      </w:pPr>
+      <w:r>
+        <w:t xml:space="preserve"/>
+      </w:r>
+    </w:p>
+    <w:p>
+      <w:pPr>
+        <w:spacing w:after="120" w:before="120" w:line="360"/>
+      </w:pPr>
+      <w:r>
+        <w:rPr>
+          <w:rFonts w:ascii="Calibri" w:cs="Calibri" w:eastAsia="Calibri" w:hAnsi="Calibri"/>
+          <w:sz w:val="22"/>
+          <w:szCs w:val="22"/>
+        </w:rPr>
+        <w:t xml:space="preserve">The most significant decision point in the project was the choice to prioritise the manufacturing workflow module over the mobile application in the development roadmap. The manufacturing workflow addresses a more specialised use case — businesses that produce rather than purely trade in goods — but it creates a meaningful differentiation from all existing Shopify inventory tools. A mobile application would have been more universally applicable but would have left Ma5zony as a capable but undifferentiated inventory tracker. The decision to go deep on manufacturing rather than broad on platform coverage reflects a conscious choice about the kind of product Ma5zony should be.</w:t>
+      </w:r>
+    </w:p>
+    <w:p>
+      <w:pPr>
+        <w:spacing w:after="0" w:before="160"/>
+      </w:pPr>
+      <w:r>
+        <w:t xml:space="preserve"/>
+      </w:r>
+    </w:p>
+    <w:p>
+      <w:pPr>
+        <w:spacing w:after="120" w:before="120" w:line="360"/>
+      </w:pPr>
+      <w:r>
+        <w:rPr>
+          <w:rFonts w:ascii="Calibri" w:cs="Calibri" w:eastAsia="Calibri" w:hAnsi="Calibri"/>
+          <w:sz w:val="22"/>
+          <w:szCs w:val="22"/>
+        </w:rPr>
+        <w:t xml:space="preserve">The decision was reinforced by early user conversations. When the developer described the planned manufacturing workflow to a potential user who runs a cosmetics business that formulates its own products, the response was immediate and unequivocal: this user had been managing raw material inventory in a completely separate Excel file, manually calculating how many units of each finished product could be made from the available raw materials, and there was no tool in the market that could do this for her. This conversation crystallised the value proposition: Ma5zony is for businesses that make things, not just sell them.</w:t>
+      </w:r>
+    </w:p>
+    <w:p>
+      <w:pPr>
+        <w:spacing w:after="0" w:before="160"/>
+      </w:pPr>
+      <w:r>
+        <w:t xml:space="preserve"/>
+      </w:r>
+    </w:p>
+    <w:p>
+      <w:pPr>
+        <w:spacing w:after="120" w:before="120" w:line="360"/>
+      </w:pPr>
+      <w:r>
+        <w:rPr>
+          <w:rFonts w:ascii="Calibri" w:cs="Calibri" w:eastAsia="Calibri" w:hAnsi="Calibri"/>
+          <w:sz w:val="22"/>
+          <w:szCs w:val="22"/>
+        </w:rPr>
+        <w:t xml:space="preserve">The technical decision that caused the most difficulty and that I would make differently in hindsight is the choice to use a single Firestore listener per collection across the entire application lifetime. This approach produces excellent real-time responsiveness when the user's dataset is small, but as the product list grows above a few hundred items, the listener begins to consume a meaningful amount of Firestore read quota and browser memory. A pagination-based approach — loading the most relevant products first and fetching additional batches on demand — would have been more scalable from the outset, even if it introduced complexity in the state management layer.</w:t>
+      </w:r>
+    </w:p>
+    <w:p>
+      <w:pPr>
+        <w:spacing w:after="0" w:before="160"/>
+      </w:pPr>
+      <w:r>
+        <w:t xml:space="preserve"/>
+      </w:r>
+    </w:p>
+    <w:p>
+      <w:pPr>
+        <w:pStyle w:val="Heading2"/>
+        <w:spacing w:after="160" w:before="300"/>
+      </w:pPr>
+      <w:r>
+        <w:rPr>
+          <w:rFonts w:ascii="Calibri Light" w:cs="Calibri Light" w:eastAsia="Calibri Light" w:hAnsi="Calibri Light"/>
+          <w:b/>
+          <w:bCs/>
+          <w:color w:val="44546A"/>
+          <w:sz w:val="26"/>
+          <w:szCs w:val="26"/>
+        </w:rPr>
+        <w:t xml:space="preserve">11.2 Limitations of the Current Implementation</w:t>
+      </w:r>
+    </w:p>
+    <w:p>
+      <w:pPr>
+        <w:spacing w:after="120" w:before="120" w:line="360"/>
+      </w:pPr>
+      <w:r>
+        <w:rPr>
+          <w:rFonts w:ascii="Calibri" w:cs="Calibri" w:eastAsia="Calibri" w:hAnsi="Calibri"/>
+          <w:sz w:val="22"/>
+          <w:szCs w:val="22"/>
+        </w:rPr>
+        <w:t xml:space="preserve">The evaluation of Ma5zony conducted for this dissertation has several limitations that should be acknowledged. First, the think-aloud study involved only five participants, all of whom were recruited through the developer's personal network. This convenience sample introduces selection bias: participants who agreed to participate may be more sympathetic to the product than representative SME operators would be, and the small sample size limits the generalisability of the findings. A more rigorous evaluation would involve a larger and more diverse sample recruited through a neutral channel such as a professional association or an online panel.</w:t>
+      </w:r>
+    </w:p>
+    <w:p>
+      <w:pPr>
+        <w:spacing w:after="0" w:before="160"/>
+      </w:pPr>
+      <w:r>
+        <w:t xml:space="preserve"/>
+      </w:r>
+    </w:p>
+    <w:p>
+      <w:pPr>
+        <w:spacing w:after="120" w:before="120" w:line="360"/>
+      </w:pPr>
+      <w:r>
+        <w:rPr>
+          <w:rFonts w:ascii="Calibri" w:cs="Calibri" w:eastAsia="Calibri" w:hAnsi="Calibri"/>
+          <w:sz w:val="22"/>
+          <w:szCs w:val="22"/>
+        </w:rPr>
+        <w:t xml:space="preserve">Second, the usability evaluation assessed the system as it exists at a single point in time, after all major features were implemented. This cross-sectional design cannot capture the learnability of the system over time — how quickly users become proficient with the tool after initial exposure. A longitudinal evaluation in which participants use the system over several weeks would provide much richer data about adoption patterns and the emergence of expert use behaviour.</w:t>
+      </w:r>
+    </w:p>
+    <w:p>
+      <w:pPr>
+        <w:spacing w:after="0" w:before="160"/>
+      </w:pPr>
+      <w:r>
+        <w:t xml:space="preserve"/>
+      </w:r>
+    </w:p>
+    <w:p>
+      <w:pPr>
+        <w:spacing w:after="120" w:before="120" w:line="360"/>
+      </w:pPr>
+      <w:r>
+        <w:rPr>
+          <w:rFonts w:ascii="Calibri" w:cs="Calibri" w:eastAsia="Calibri" w:hAnsi="Calibri"/>
+          <w:sz w:val="22"/>
+          <w:szCs w:val="22"/>
+        </w:rPr>
+        <w:t xml:space="preserve">Third, the performance benchmarks reported in this dissertation were conducted in a controlled environment using simulated load conditions. Real-world performance may differ significantly depending on the user's device capabilities, network conditions, and the size and structure of their dataset. In particular, the Firestore read latency measurements were conducted with a small dataset; performance with a large and complex dataset (thousands of products, years of demand history) has not been systematically evaluated.</w:t>
+      </w:r>
+    </w:p>
+    <w:p>
+      <w:pPr>
+        <w:spacing w:after="0" w:before="160"/>
+      </w:pPr>
+      <w:r>
+        <w:t xml:space="preserve"/>
+      </w:r>
+    </w:p>
+    <w:p>
+      <w:pPr>
+        <w:pStyle w:val="Heading2"/>
+        <w:spacing w:after="160" w:before="300"/>
+      </w:pPr>
+      <w:r>
+        <w:rPr>
+          <w:rFonts w:ascii="Calibri Light" w:cs="Calibri Light" w:eastAsia="Calibri Light" w:hAnsi="Calibri Light"/>
+          <w:b/>
+          <w:bCs/>
+          <w:color w:val="44546A"/>
+          <w:sz w:val="26"/>
+          <w:szCs w:val="26"/>
+        </w:rPr>
+        <w:t xml:space="preserve">11.3 Contribution to Knowledge</w:t>
+      </w:r>
+    </w:p>
+    <w:p>
+      <w:pPr>
+        <w:spacing w:after="120" w:before="120" w:line="360"/>
+      </w:pPr>
+      <w:r>
+        <w:rPr>
+          <w:rFonts w:ascii="Calibri" w:cs="Calibri" w:eastAsia="Calibri" w:hAnsi="Calibri"/>
+          <w:sz w:val="22"/>
+          <w:szCs w:val="22"/>
+        </w:rPr>
+        <w:t xml:space="preserve">This dissertation makes three principal contributions to knowledge. First, it presents a detailed case study of the application of the Design Science Research methodology to the development of an inventory management system for SMEs, demonstrating how the three DSR cycles (relevance, design, rigour) can be operationalised in a solo software development project with limited resources.</w:t>
+      </w:r>
+    </w:p>
+    <w:p>
+      <w:pPr>
+        <w:spacing w:after="0" w:before="160"/>
+      </w:pPr>
+      <w:r>
+        <w:t xml:space="preserve"/>
+      </w:r>
+    </w:p>
+    <w:p>
+      <w:pPr>
+        <w:spacing w:after="120" w:before="120" w:line="360"/>
+      </w:pPr>
+      <w:r>
+        <w:rPr>
+          <w:rFonts w:ascii="Calibri" w:cs="Calibri" w:eastAsia="Calibri" w:hAnsi="Calibri"/>
+          <w:sz w:val="22"/>
+          <w:szCs w:val="22"/>
+        </w:rPr>
+        <w:t xml:space="preserve">Second, it provides a concrete implementation of a transparent forecasting interface that addresses the trust barrier identified in the user research — the finding that SME users are reluctant to act on algorithmic recommendations they cannot understand. The interface design pattern developed for Ma5zony, which shows the historical data points and the formula underlying each forecast alongside the forecast result, is a transferable design solution that could be applied in any context where algorithmic outputs need to be communicated to non-expert users.</w:t>
+      </w:r>
+    </w:p>
+    <w:p>
+      <w:pPr>
+        <w:spacing w:after="0" w:before="160"/>
+      </w:pPr>
+      <w:r>
+        <w:t xml:space="preserve"/>
+      </w:r>
+    </w:p>
+    <w:p>
+      <w:pPr>
+        <w:spacing w:after="120" w:before="120" w:line="360"/>
+      </w:pPr>
+      <w:r>
+        <w:rPr>
+          <w:rFonts w:ascii="Calibri" w:cs="Calibri" w:eastAsia="Calibri" w:hAnsi="Calibri"/>
+          <w:sz w:val="22"/>
+          <w:szCs w:val="22"/>
+        </w:rPr>
+        <w:t xml:space="preserve">Third, it demonstrates the feasibility of implementing a manufacturing-aware inventory system — one that distinguishes between raw materials and finished goods, tracks bill-of-materials relationships, and generates replenishment recommendations at both levels — using only Firebase's serverless infrastructure without a dedicated application server. This architectural approach has significant implications for the cost structure and operational complexity of similar systems.</w:t>
+      </w:r>
+    </w:p>
+    <w:p>
+      <w:pPr>
+        <w:spacing w:after="0" w:before="160"/>
+      </w:pPr>
+      <w:r>
+        <w:t xml:space="preserve"/>
+      </w:r>
+    </w:p>
+    <w:p>
+      <w:pPr>
+        <w:pStyle w:val="Heading2"/>
+        <w:spacing w:after="160" w:before="300"/>
+      </w:pPr>
+      <w:r>
+        <w:rPr>
+          <w:rFonts w:ascii="Calibri Light" w:cs="Calibri Light" w:eastAsia="Calibri Light" w:hAnsi="Calibri Light"/>
+          <w:b/>
+          <w:bCs/>
+          <w:color w:val="44546A"/>
+          <w:sz w:val="26"/>
+          <w:szCs w:val="26"/>
+        </w:rPr>
+        <w:t xml:space="preserve">11.4 Academic and Professional Context</w:t>
+      </w:r>
+    </w:p>
+    <w:p>
+      <w:pPr>
+        <w:spacing w:after="120" w:before="120" w:line="360"/>
+      </w:pPr>
+      <w:r>
+        <w:rPr>
+          <w:rFonts w:ascii="Calibri" w:cs="Calibri" w:eastAsia="Calibri" w:hAnsi="Calibri"/>
+          <w:sz w:val="22"/>
+          <w:szCs w:val="22"/>
+        </w:rPr>
+        <w:t xml:space="preserve">This project was undertaken as the final year graduation project for the Bachelor of Science in Computer Science programme at the British University in Egypt. The project represents approximately 600 hours of development, research, and documentation work spread across two academic semesters. The scope and ambition of the project were deliberately set at a level that would require the integration of skills from multiple modules: software engineering (requirements, architecture, testing), database systems (Firestore data modelling, security rules), human-computer interaction (usability evaluation, interface design), and business computing (market analysis, revenue modelling).</w:t>
+      </w:r>
+    </w:p>
+    <w:p>
+      <w:pPr>
+        <w:spacing w:after="0" w:before="160"/>
+      </w:pPr>
+      <w:r>
+        <w:t xml:space="preserve"/>
+      </w:r>
+    </w:p>
+    <w:p>
+      <w:pPr>
+        <w:spacing w:after="120" w:before="120" w:line="360"/>
+      </w:pPr>
+      <w:r>
+        <w:rPr>
+          <w:rFonts w:ascii="Calibri" w:cs="Calibri" w:eastAsia="Calibri" w:hAnsi="Calibri"/>
+          <w:sz w:val="22"/>
+          <w:szCs w:val="22"/>
+        </w:rPr>
+        <w:t xml:space="preserve">The professional context of the project is equally important. Ma5zony is not a demonstration system built for academic purposes: it is a production system deployed on Firebase, with a real domain name, real users, and real data. This distinguishes it from the typical graduation project and introduces obligations — to the users whose data the system holds, to the Shopify ecosystem whose merchants might use it, and to the broader community of SME operators who could benefit from tools like it — that a purely academic exercise would not entail. Meeting these obligations has shaped every design decision described in this dissertation.</w:t>
+      </w:r>
+    </w:p>
+    <w:p>
+      <w:pPr>
+        <w:spacing w:after="0" w:before="160"/>
+      </w:pPr>
+      <w:r>
+        <w:t xml:space="preserve"/>
+      </w:r>
+    </w:p>
+    <w:p>
+      <w:pPr>
+        <w:spacing w:after="120" w:before="120" w:line="360"/>
+      </w:pPr>
+      <w:r>
+        <w:rPr>
+          <w:rFonts w:ascii="Calibri" w:cs="Calibri" w:eastAsia="Calibri" w:hAnsi="Calibri"/>
+          <w:sz w:val="22"/>
+          <w:szCs w:val="22"/>
+        </w:rPr>
+        <w:t xml:space="preserve">The experience of building Ma5zony has confirmed a conviction that was forming throughout the undergraduate programme: the most valuable software is not the most technically sophisticated, but the software that solves a real problem for a real person in a way that fits naturally into how they already work. The SME inventory management problem is not glamorous — it does not involve neural networks, distributed systems, or billion-user scale. But it is real, it affects millions of businesses worldwide, and the existing solutions are genuinely inadequate for the majority of those businesses. Building something that might actually help is, ultimately, the most rewarding outcome any software project can aim for.</w:t>
       </w:r>
     </w:p>
     <w:p>

</xml_diff>